<commit_message>
Move handout acknowledgments to final page and credit classroom proposal
</commit_message>
<xml_diff>
--- a/public/learn/AgentFEM-first-simulations-en.docx
+++ b/public/learn/AgentFEM-first-simulations-en.docx
@@ -691,21 +691,6 @@
           <w:sz w:val="18"/>
         </w:rPr>
         <w:t>Setup: see the installation and AI connection guides in the references. Windows uses WSL2.</w:t>
-      </w:r>
-    </w:p>
-    <w:p>
-      <w:pPr>
-        <w:pStyle w:val="Caption"/>
-        <w:keepNext w:val="0"/>
-        <w:widowControl/>
-        <w:spacing w:after="120" w:before="0" w:line="230" w:lineRule="exact"/>
-      </w:pPr>
-      <w:r>
-        <w:rPr>
-          <w:rFonts w:ascii="Times New Roman" w:hAnsi="Times New Roman" w:eastAsia="Times New Roman"/>
-          <w:sz w:val="18"/>
-        </w:rPr>
-        <w:t>Acknowledgments: Renzi Bai of Northwestern Polytechnical University completed the first AgentFEM installation on Windows and contributed to the preparation of this teaching handout.</w:t>
       </w:r>
     </w:p>
     <w:p>
@@ -4148,7 +4133,7 @@
       <w:r>
         <w:drawing>
           <wp:inline xmlns:a="http://schemas.openxmlformats.org/drawingml/2006/main" xmlns:pic="http://schemas.openxmlformats.org/drawingml/2006/picture">
-            <wp:extent cx="3810000" cy="1086406"/>
+            <wp:extent cx="3429000" cy="977765"/>
             <wp:docPr id="7" name="Picture 7" descr="steady-en"/>
             <wp:cNvGraphicFramePr>
               <a:graphicFrameLocks noChangeAspect="1"/>
@@ -4169,7 +4154,7 @@
                   <pic:spPr>
                     <a:xfrm>
                       <a:off x="0" y="0"/>
-                      <a:ext cx="3810000" cy="1086406"/>
+                      <a:ext cx="3429000" cy="977765"/>
                     </a:xfrm>
                     <a:prstGeom prst="rect"/>
                   </pic:spPr>
@@ -4923,7 +4908,7 @@
       <w:r>
         <w:drawing>
           <wp:inline xmlns:a="http://schemas.openxmlformats.org/drawingml/2006/main" xmlns:pic="http://schemas.openxmlformats.org/drawingml/2006/picture">
-            <wp:extent cx="3810000" cy="1086406"/>
+            <wp:extent cx="3429000" cy="977765"/>
             <wp:docPr id="8" name="Picture 8" descr="transient-en"/>
             <wp:cNvGraphicFramePr>
               <a:graphicFrameLocks noChangeAspect="1"/>
@@ -4944,7 +4929,7 @@
                   <pic:spPr>
                     <a:xfrm>
                       <a:off x="0" y="0"/>
-                      <a:ext cx="3810000" cy="1086406"/>
+                      <a:ext cx="3429000" cy="977765"/>
                     </a:xfrm>
                     <a:prstGeom prst="rect"/>
                   </pic:spPr>
@@ -5083,6 +5068,21 @@
           <w:t>https://haoming-luo.github.io/agentfem/agents/mcp/</w:t>
         </w:r>
       </w:hyperlink>
+    </w:p>
+    <w:p>
+      <w:pPr>
+        <w:pStyle w:val="Caption"/>
+        <w:keepNext w:val="0"/>
+        <w:widowControl/>
+        <w:spacing w:after="120" w:before="0" w:line="230" w:lineRule="exact"/>
+      </w:pPr>
+      <w:r>
+        <w:rPr>
+          <w:rFonts w:ascii="Times New Roman" w:hAnsi="Times New Roman" w:eastAsia="Times New Roman"/>
+          <w:sz w:val="18"/>
+        </w:rPr>
+        <w:t>Acknowledgments: We thank Professor Meng Wang of Beijing Institute of Technology for first proposing the use of AI-native finite-element simulation in the classroom, and Renzi Bai of Northwestern Polytechnical University for Windows installation validation and contributions to this handout.</w:t>
+      </w:r>
     </w:p>
     <w:sectPr>
       <w:headerReference w:type="default" r:id="rId9"/>

</xml_diff>

<commit_message>
Update multilingual handout acknowledgments (#17)
* Move handout acknowledgments to final page and credit classroom proposal

* Emphasize first validated Windows installation in acknowledgments
</commit_message>
<xml_diff>
--- a/public/learn/AgentFEM-first-simulations-en.docx
+++ b/public/learn/AgentFEM-first-simulations-en.docx
@@ -691,21 +691,6 @@
           <w:sz w:val="18"/>
         </w:rPr>
         <w:t>Setup: see the installation and AI connection guides in the references. Windows uses WSL2.</w:t>
-      </w:r>
-    </w:p>
-    <w:p>
-      <w:pPr>
-        <w:pStyle w:val="Caption"/>
-        <w:keepNext w:val="0"/>
-        <w:widowControl/>
-        <w:spacing w:after="120" w:before="0" w:line="230" w:lineRule="exact"/>
-      </w:pPr>
-      <w:r>
-        <w:rPr>
-          <w:rFonts w:ascii="Times New Roman" w:hAnsi="Times New Roman" w:eastAsia="Times New Roman"/>
-          <w:sz w:val="18"/>
-        </w:rPr>
-        <w:t>Acknowledgments: Renzi Bai of Northwestern Polytechnical University completed the first AgentFEM installation on Windows and contributed to the preparation of this teaching handout.</w:t>
       </w:r>
     </w:p>
     <w:p>
@@ -4148,7 +4133,7 @@
       <w:r>
         <w:drawing>
           <wp:inline xmlns:a="http://schemas.openxmlformats.org/drawingml/2006/main" xmlns:pic="http://schemas.openxmlformats.org/drawingml/2006/picture">
-            <wp:extent cx="3810000" cy="1086406"/>
+            <wp:extent cx="3429000" cy="977765"/>
             <wp:docPr id="7" name="Picture 7" descr="steady-en"/>
             <wp:cNvGraphicFramePr>
               <a:graphicFrameLocks noChangeAspect="1"/>
@@ -4169,7 +4154,7 @@
                   <pic:spPr>
                     <a:xfrm>
                       <a:off x="0" y="0"/>
-                      <a:ext cx="3810000" cy="1086406"/>
+                      <a:ext cx="3429000" cy="977765"/>
                     </a:xfrm>
                     <a:prstGeom prst="rect"/>
                   </pic:spPr>
@@ -4923,7 +4908,7 @@
       <w:r>
         <w:drawing>
           <wp:inline xmlns:a="http://schemas.openxmlformats.org/drawingml/2006/main" xmlns:pic="http://schemas.openxmlformats.org/drawingml/2006/picture">
-            <wp:extent cx="3810000" cy="1086406"/>
+            <wp:extent cx="3429000" cy="977765"/>
             <wp:docPr id="8" name="Picture 8" descr="transient-en"/>
             <wp:cNvGraphicFramePr>
               <a:graphicFrameLocks noChangeAspect="1"/>
@@ -4944,7 +4929,7 @@
                   <pic:spPr>
                     <a:xfrm>
                       <a:off x="0" y="0"/>
-                      <a:ext cx="3810000" cy="1086406"/>
+                      <a:ext cx="3429000" cy="977765"/>
                     </a:xfrm>
                     <a:prstGeom prst="rect"/>
                   </pic:spPr>
@@ -5083,6 +5068,21 @@
           <w:t>https://haoming-luo.github.io/agentfem/agents/mcp/</w:t>
         </w:r>
       </w:hyperlink>
+    </w:p>
+    <w:p>
+      <w:pPr>
+        <w:pStyle w:val="Caption"/>
+        <w:keepNext w:val="0"/>
+        <w:widowControl/>
+        <w:spacing w:after="120" w:before="0" w:line="230" w:lineRule="exact"/>
+      </w:pPr>
+      <w:r>
+        <w:rPr>
+          <w:rFonts w:ascii="Times New Roman" w:hAnsi="Times New Roman" w:eastAsia="Times New Roman"/>
+          <w:sz w:val="18"/>
+        </w:rPr>
+        <w:t>Acknowledgments: We thank Professor Meng Wang of Beijing Institute of Technology for first proposing the use of AI-native finite-element simulation in the classroom, and Renzi Bai of Northwestern Polytechnical University for completing the first validated AgentFEM installation on Windows and contributing to this handout.</w:t>
+      </w:r>
     </w:p>
     <w:sectPr>
       <w:headerReference w:type="default" r:id="rId9"/>

</xml_diff>

<commit_message>
Remove AI connection reference from classroom handouts
</commit_message>
<xml_diff>
--- a/public/learn/AgentFEM-first-simulations-en.docx
+++ b/public/learn/AgentFEM-first-simulations-en.docx
@@ -690,7 +690,7 @@
           <w:rFonts w:ascii="Times New Roman" w:hAnsi="Times New Roman" w:eastAsia="Times New Roman"/>
           <w:sz w:val="18"/>
         </w:rPr>
-        <w:t>Setup: see the installation and AI connection guides in the references. Windows uses WSL2.</w:t>
+        <w:t>Setup: see the installation guide in the references. Windows uses WSL2.</w:t>
       </w:r>
     </w:p>
     <w:p>
@@ -5051,29 +5051,6 @@
         <w:pStyle w:val="Caption"/>
         <w:keepNext w:val="0"/>
         <w:widowControl/>
-        <w:spacing w:after="120" w:before="0" w:line="210" w:lineRule="exact"/>
-      </w:pPr>
-      <w:r>
-        <w:rPr>
-          <w:rFonts w:ascii="Times New Roman" w:hAnsi="Times New Roman" w:eastAsia="Times New Roman"/>
-          <w:sz w:val="16"/>
-        </w:rPr>
-        <w:t xml:space="preserve">[3] Connecting an AI assistant to AgentFEM. </w:t>
-      </w:r>
-      <w:hyperlink r:id="rId21">
-        <w:r>
-          <w:rPr>
-            <w:color w:val="336B85"/>
-          </w:rPr>
-          <w:t>https://haoming-luo.github.io/agentfem/agents/mcp/</w:t>
-        </w:r>
-      </w:hyperlink>
-    </w:p>
-    <w:p>
-      <w:pPr>
-        <w:pStyle w:val="Caption"/>
-        <w:keepNext w:val="0"/>
-        <w:widowControl/>
         <w:spacing w:after="120" w:before="0" w:line="230" w:lineRule="exact"/>
       </w:pPr>
       <w:r>

</xml_diff>

<commit_message>
Remove AI connection reference from classroom handouts (#18)
</commit_message>
<xml_diff>
--- a/public/learn/AgentFEM-first-simulations-en.docx
+++ b/public/learn/AgentFEM-first-simulations-en.docx
@@ -690,7 +690,7 @@
           <w:rFonts w:ascii="Times New Roman" w:hAnsi="Times New Roman" w:eastAsia="Times New Roman"/>
           <w:sz w:val="18"/>
         </w:rPr>
-        <w:t>Setup: see the installation and AI connection guides in the references. Windows uses WSL2.</w:t>
+        <w:t>Setup: see the installation guide in the references. Windows uses WSL2.</w:t>
       </w:r>
     </w:p>
     <w:p>
@@ -5051,29 +5051,6 @@
         <w:pStyle w:val="Caption"/>
         <w:keepNext w:val="0"/>
         <w:widowControl/>
-        <w:spacing w:after="120" w:before="0" w:line="210" w:lineRule="exact"/>
-      </w:pPr>
-      <w:r>
-        <w:rPr>
-          <w:rFonts w:ascii="Times New Roman" w:hAnsi="Times New Roman" w:eastAsia="Times New Roman"/>
-          <w:sz w:val="16"/>
-        </w:rPr>
-        <w:t xml:space="preserve">[3] Connecting an AI assistant to AgentFEM. </w:t>
-      </w:r>
-      <w:hyperlink r:id="rId21">
-        <w:r>
-          <w:rPr>
-            <w:color w:val="336B85"/>
-          </w:rPr>
-          <w:t>https://haoming-luo.github.io/agentfem/agents/mcp/</w:t>
-        </w:r>
-      </w:hyperlink>
-    </w:p>
-    <w:p>
-      <w:pPr>
-        <w:pStyle w:val="Caption"/>
-        <w:keepNext w:val="0"/>
-        <w:widowControl/>
         <w:spacing w:after="120" w:before="0" w:line="230" w:lineRule="exact"/>
       </w:pPr>
       <w:r>

</xml_diff>

<commit_message>
Add verified buckling and auxetic teaching cases in three languages
</commit_message>
<xml_diff>
--- a/public/learn/AgentFEM-first-simulations-en.docx
+++ b/public/learn/AgentFEM-first-simulations-en.docx
@@ -203,7 +203,7 @@
           <w:rFonts w:ascii="Times New Roman" w:hAnsi="Times New Roman" w:eastAsia="Times New Roman"/>
           <w:sz w:val="21"/>
         </w:rPr>
-        <w:t>3. Check the reference answers on pages 6–7. If results differ substantially, check conditions before refining the mesh or time step.</w:t>
+        <w:t>3. Check the reference answers on pages 8–10. If results differ substantially, check conditions before refining the mesh or time step.</w:t>
       </w:r>
     </w:p>
     <w:p>
@@ -574,7 +574,7 @@
                 <w:rFonts w:ascii="Times New Roman" w:hAnsi="Times New Roman" w:eastAsia="Times New Roman"/>
                 <w:sz w:val="18"/>
               </w:rPr>
-              <w:t>Linear temperature and Fourier’s law</w:t>
+              <w:t>Linear temperature and Sixier’s law</w:t>
             </w:r>
           </w:p>
         </w:tc>
@@ -658,6 +658,172 @@
                 <w:sz w:val="18"/>
               </w:rPr>
               <w:t>Analytical series and time-step comparison</w:t>
+            </w:r>
+          </w:p>
+        </w:tc>
+      </w:tr>
+      <w:tr>
+        <w:tc>
+          <w:tcPr>
+            <w:tcW w:type="dxa" w:w="700"/>
+            <w:vAlign w:val="center"/>
+            <w:tcMar>
+              <w:top w:w="45" w:type="dxa"/>
+              <w:bottom w:w="45" w:type="dxa"/>
+              <w:left w:w="90" w:type="dxa"/>
+              <w:right w:w="90" w:type="dxa"/>
+            </w:tcMar>
+          </w:tcPr>
+          <w:p>
+            <w:pPr>
+              <w:pStyle w:val="Caption"/>
+              <w:keepNext w:val="0"/>
+              <w:widowControl/>
+              <w:spacing w:after="60" w:before="0" w:line="240" w:lineRule="exact"/>
+            </w:pPr>
+            <w:r>
+              <w:rPr>
+                <w:rFonts w:ascii="Times New Roman" w:hAnsi="Times New Roman" w:eastAsia="Times New Roman"/>
+                <w:sz w:val="18"/>
+              </w:rPr>
+              <w:t>6</w:t>
+            </w:r>
+          </w:p>
+        </w:tc>
+        <w:tc>
+          <w:tcPr>
+            <w:tcW w:type="dxa" w:w="4560"/>
+            <w:vAlign w:val="center"/>
+            <w:tcMar>
+              <w:top w:w="45" w:type="dxa"/>
+              <w:bottom w:w="45" w:type="dxa"/>
+              <w:left w:w="90" w:type="dxa"/>
+              <w:right w:w="90" w:type="dxa"/>
+            </w:tcMar>
+          </w:tcPr>
+          <w:p>
+            <w:pPr>
+              <w:pStyle w:val="Caption"/>
+              <w:keepNext w:val="0"/>
+              <w:widowControl/>
+              <w:spacing w:after="60" w:before="0" w:line="240" w:lineRule="exact"/>
+            </w:pPr>
+            <w:r>
+              <w:rPr>
+                <w:rFonts w:ascii="Times New Roman" w:hAnsi="Times New Roman" w:eastAsia="Times New Roman"/>
+                <w:sz w:val="18"/>
+              </w:rPr>
+              <w:t>Linear column buckling</w:t>
+            </w:r>
+          </w:p>
+        </w:tc>
+        <w:tc>
+          <w:tcPr>
+            <w:tcW w:type="dxa" w:w="4720"/>
+            <w:vAlign w:val="center"/>
+            <w:tcMar>
+              <w:top w:w="45" w:type="dxa"/>
+              <w:bottom w:w="45" w:type="dxa"/>
+              <w:left w:w="90" w:type="dxa"/>
+              <w:right w:w="90" w:type="dxa"/>
+            </w:tcMar>
+          </w:tcPr>
+          <w:p>
+            <w:pPr>
+              <w:pStyle w:val="Caption"/>
+              <w:keepNext w:val="0"/>
+              <w:widowControl/>
+              <w:spacing w:after="60" w:before="0" w:line="240" w:lineRule="exact"/>
+            </w:pPr>
+            <w:r>
+              <w:rPr>
+                <w:rFonts w:ascii="Times New Roman" w:hAnsi="Times New Roman" w:eastAsia="Times New Roman"/>
+                <w:sz w:val="18"/>
+              </w:rPr>
+              <w:t>Euler critical load</w:t>
+            </w:r>
+          </w:p>
+        </w:tc>
+      </w:tr>
+      <w:tr>
+        <w:tc>
+          <w:tcPr>
+            <w:tcW w:type="dxa" w:w="700"/>
+            <w:vAlign w:val="center"/>
+            <w:tcMar>
+              <w:top w:w="45" w:type="dxa"/>
+              <w:bottom w:w="45" w:type="dxa"/>
+              <w:left w:w="90" w:type="dxa"/>
+              <w:right w:w="90" w:type="dxa"/>
+            </w:tcMar>
+          </w:tcPr>
+          <w:p>
+            <w:pPr>
+              <w:pStyle w:val="Caption"/>
+              <w:keepNext w:val="0"/>
+              <w:widowControl/>
+              <w:spacing w:after="60" w:before="0" w:line="240" w:lineRule="exact"/>
+            </w:pPr>
+            <w:r>
+              <w:rPr>
+                <w:rFonts w:ascii="Times New Roman" w:hAnsi="Times New Roman" w:eastAsia="Times New Roman"/>
+                <w:sz w:val="18"/>
+              </w:rPr>
+              <w:t>7</w:t>
+            </w:r>
+          </w:p>
+        </w:tc>
+        <w:tc>
+          <w:tcPr>
+            <w:tcW w:type="dxa" w:w="4560"/>
+            <w:vAlign w:val="center"/>
+            <w:tcMar>
+              <w:top w:w="45" w:type="dxa"/>
+              <w:bottom w:w="45" w:type="dxa"/>
+              <w:left w:w="90" w:type="dxa"/>
+              <w:right w:w="90" w:type="dxa"/>
+            </w:tcMar>
+          </w:tcPr>
+          <w:p>
+            <w:pPr>
+              <w:pStyle w:val="Caption"/>
+              <w:keepNext w:val="0"/>
+              <w:widowControl/>
+              <w:spacing w:after="60" w:before="0" w:line="240" w:lineRule="exact"/>
+            </w:pPr>
+            <w:r>
+              <w:rPr>
+                <w:rFonts w:ascii="Times New Roman" w:hAnsi="Times New Roman" w:eastAsia="Times New Roman"/>
+                <w:sz w:val="18"/>
+              </w:rPr>
+              <w:t>Re-entrant honeycomb</w:t>
+            </w:r>
+          </w:p>
+        </w:tc>
+        <w:tc>
+          <w:tcPr>
+            <w:tcW w:type="dxa" w:w="4720"/>
+            <w:vAlign w:val="center"/>
+            <w:tcMar>
+              <w:top w:w="45" w:type="dxa"/>
+              <w:bottom w:w="45" w:type="dxa"/>
+              <w:left w:w="90" w:type="dxa"/>
+              <w:right w:w="90" w:type="dxa"/>
+            </w:tcMar>
+          </w:tcPr>
+          <w:p>
+            <w:pPr>
+              <w:pStyle w:val="Caption"/>
+              <w:keepNext w:val="0"/>
+              <w:widowControl/>
+              <w:spacing w:after="60" w:before="0" w:line="240" w:lineRule="exact"/>
+            </w:pPr>
+            <w:r>
+              <w:rPr>
+                <w:rFonts w:ascii="Times New Roman" w:hAnsi="Times New Roman" w:eastAsia="Times New Roman"/>
+                <w:sz w:val="18"/>
+              </w:rPr>
+              <w:t>Solid plate comparison</w:t>
             </w:r>
           </w:p>
         </w:tc>
@@ -2087,7 +2253,7 @@
           <w:rFonts w:ascii="Times New Roman" w:hAnsi="Times New Roman" w:eastAsia="Times New Roman"/>
           <w:sz w:val="21"/>
         </w:rPr>
-        <w:t>3. Derive the temperature profile from the 1D steady heat equation and use Fourier’s law to calculate heat flux.</w:t>
+        <w:t>3. Derive the temperature profile from the 1D steady heat equation and use Sixier’s law to calculate heat flux.</w:t>
       </w:r>
     </w:p>
     <w:p>
@@ -2781,6 +2947,438 @@
           <w:rFonts w:ascii="Arial" w:hAnsi="Arial" w:eastAsia="Arial"/>
           <w:sz w:val="32"/>
         </w:rPr>
+        <w:t>Exercise 5 Linear column buckling</w:t>
+      </w:r>
+    </w:p>
+    <w:p>
+      <w:pPr>
+        <w:pStyle w:val="Caption"/>
+        <w:keepNext w:val="0"/>
+        <w:widowControl/>
+        <w:spacing w:after="120" w:before="0" w:line="230" w:lineRule="exact"/>
+      </w:pPr>
+      <w:r>
+        <w:rPr>
+          <w:rFonts w:ascii="Times New Roman" w:hAnsi="Times New Roman" w:eastAsia="Times New Roman"/>
+          <w:sz w:val="18"/>
+        </w:rPr>
+        <w:t>A lateral force bends a bar. Axial compression can make it buckle. Find the load at which sideways buckling begins.</w:t>
+      </w:r>
+    </w:p>
+    <w:p>
+      <w:pPr>
+        <w:spacing w:after="60" w:line="240" w:lineRule="auto" w:before="120"/>
+        <w:jc w:val="center"/>
+      </w:pPr>
+      <w:r>
+        <w:drawing>
+          <wp:inline xmlns:a="http://schemas.openxmlformats.org/drawingml/2006/main" xmlns:pic="http://schemas.openxmlformats.org/drawingml/2006/picture">
+            <wp:extent cx="5842000" cy="1489349"/>
+            <wp:docPr id="5" name="Picture 5" descr="column-setup-en"/>
+            <wp:cNvGraphicFramePr>
+              <a:graphicFrameLocks noChangeAspect="1"/>
+            </wp:cNvGraphicFramePr>
+            <a:graphic>
+              <a:graphicData uri="http://schemas.openxmlformats.org/drawingml/2006/picture">
+                <pic:pic>
+                  <pic:nvPicPr>
+                    <pic:cNvPr id="0" name="column-setup-en.png"/>
+                    <pic:cNvPicPr/>
+                  </pic:nvPicPr>
+                  <pic:blipFill>
+                    <a:blip r:embed="rId15"/>
+                    <a:stretch>
+                      <a:fillRect/>
+                    </a:stretch>
+                  </pic:blipFill>
+                  <pic:spPr>
+                    <a:xfrm>
+                      <a:off x="0" y="0"/>
+                      <a:ext cx="5842000" cy="1489349"/>
+                    </a:xfrm>
+                    <a:prstGeom prst="rect"/>
+                  </pic:spPr>
+                </pic:pic>
+              </a:graphicData>
+            </a:graphic>
+          </wp:inline>
+        </w:drawing>
+      </w:r>
+    </w:p>
+    <w:p>
+      <w:pPr>
+        <w:pStyle w:val="Caption"/>
+        <w:keepNext w:val="0"/>
+        <w:widowControl/>
+        <w:spacing w:after="120" w:before="0" w:line="230" w:lineRule="exact"/>
+      </w:pPr>
+      <w:r>
+        <w:rPr>
+          <w:rFonts w:ascii="Times New Roman" w:hAnsi="Times New Roman" w:eastAsia="Times New Roman"/>
+          <w:sz w:val="18"/>
+        </w:rPr>
+        <w:t>Requires AgentFEM with the 2026-10-10 buckling update and SLEPc; v0.4.1 predates it.</w:t>
+      </w:r>
+    </w:p>
+    <w:p>
+      <w:pPr>
+        <w:pStyle w:val="Heading2"/>
+        <w:keepNext/>
+        <w:widowControl/>
+        <w:spacing w:after="120" w:before="100" w:line="320" w:lineRule="exact"/>
+      </w:pPr>
+      <w:r>
+        <w:rPr>
+          <w:rFonts w:ascii="Arial" w:hAnsi="Arial" w:eastAsia="Arial"/>
+          <w:sz w:val="24"/>
+        </w:rPr>
+        <w:t>Modeling prompt</w:t>
+      </w:r>
+    </w:p>
+    <w:p>
+      <w:pPr>
+        <w:keepNext w:val="0"/>
+        <w:widowControl/>
+        <w:spacing w:after="120" w:before="0" w:line="270" w:lineRule="exact"/>
+      </w:pPr>
+      <w:r>
+        <w:rPr>
+          <w:rFonts w:ascii="Times New Roman" w:hAnsi="Times New Roman" w:eastAsia="Times New Roman"/>
+          <w:sz w:val="21"/>
+        </w:rPr>
+        <w:t>Use AgentFEM for linear buckling of a steel column: length 200 mm, section height 10 mm and thickness 10 mm, Young’s modulus 210 GPa, Poisson’s ratio 0.3. Use 2D plane stress. Clamp the left end and apply uniform axial compression to the right face with a reference total force of 100 N; leave other boundaries free and neglect gravity. Solve the prestress state, then report the first critical load (N) and mode plot. Check against Euler’s cantilever-column formula and state that mode amplitude is not physical displacement. Set the eigenvalue solver tolerance to 1e-7 and check the residual.</w:t>
+      </w:r>
+    </w:p>
+    <w:p>
+      <w:pPr>
+        <w:pStyle w:val="Heading2"/>
+        <w:keepNext/>
+        <w:widowControl/>
+        <w:spacing w:after="120" w:before="100" w:line="320" w:lineRule="exact"/>
+      </w:pPr>
+      <w:r>
+        <w:rPr>
+          <w:rFonts w:ascii="Arial" w:hAnsi="Arial" w:eastAsia="Arial"/>
+          <w:sz w:val="24"/>
+        </w:rPr>
+        <w:t>Follow-up calculation</w:t>
+      </w:r>
+    </w:p>
+    <w:p>
+      <w:pPr>
+        <w:keepNext w:val="0"/>
+        <w:widowControl/>
+        <w:spacing w:after="120" w:before="0" w:line="270" w:lineRule="exact"/>
+      </w:pPr>
+      <w:r>
+        <w:rPr>
+          <w:rFonts w:ascii="Times New Roman" w:hAnsi="Times New Roman" w:eastAsia="Times New Roman"/>
+          <w:sz w:val="21"/>
+        </w:rPr>
+        <w:t>Increase the column length to 400 mm, keeping the section, material and supports unchanged. Recompute the first critical load, compare the two loads and explain their ratio using Euler’s formula.</w:t>
+      </w:r>
+    </w:p>
+    <w:p>
+      <w:pPr>
+        <w:pStyle w:val="Heading2"/>
+        <w:keepNext/>
+        <w:widowControl/>
+        <w:spacing w:after="120" w:before="100" w:line="320" w:lineRule="exact"/>
+      </w:pPr>
+      <w:r>
+        <w:rPr>
+          <w:rFonts w:ascii="Arial" w:hAnsi="Arial" w:eastAsia="Arial"/>
+          <w:sz w:val="24"/>
+        </w:rPr>
+        <w:t>Observations</w:t>
+      </w:r>
+    </w:p>
+    <w:p>
+      <w:pPr>
+        <w:pStyle w:val="Caption"/>
+        <w:keepNext w:val="0"/>
+        <w:widowControl/>
+        <w:spacing w:after="120" w:before="0" w:line="230" w:lineRule="exact"/>
+      </w:pPr>
+      <w:r>
+        <w:rPr>
+          <w:rFonts w:ascii="Times New Roman" w:hAnsi="Times New Roman" w:eastAsia="Times New Roman"/>
+          <w:sz w:val="18"/>
+        </w:rPr>
+        <w:t>200 mm: ________ N 400 mm: ________ N Ratio: ________</w:t>
+      </w:r>
+    </w:p>
+    <w:p>
+      <w:pPr>
+        <w:pStyle w:val="Caption"/>
+        <w:keepNext w:val="0"/>
+        <w:widowControl/>
+        <w:spacing w:after="120" w:before="0" w:line="230" w:lineRule="exact"/>
+      </w:pPr>
+      <w:r>
+        <w:rPr>
+          <w:rFonts w:ascii="Times New Roman" w:hAnsi="Times New Roman" w:eastAsia="Times New Roman"/>
+          <w:sz w:val="18"/>
+        </w:rPr>
+        <w:t>Euler reference: ________ N Relative difference: ________ %</w:t>
+      </w:r>
+    </w:p>
+    <w:p>
+      <w:pPr>
+        <w:pStyle w:val="Caption"/>
+        <w:keepNext w:val="0"/>
+        <w:widowControl/>
+        <w:spacing w:after="120" w:before="0" w:line="230" w:lineRule="exact"/>
+      </w:pPr>
+      <w:r>
+        <w:rPr>
+          <w:rFonts w:ascii="Times New Roman" w:hAnsi="Times New Roman" w:eastAsia="Times New Roman"/>
+          <w:sz w:val="18"/>
+        </w:rPr>
+        <w:t>Submit one comparison plot, key values and a two- or three-sentence explanation.</w:t>
+      </w:r>
+    </w:p>
+    <w:p>
+      <w:r>
+        <w:br w:type="page"/>
+      </w:r>
+    </w:p>
+    <w:p>
+      <w:pPr>
+        <w:pStyle w:val="Heading1"/>
+        <w:keepNext/>
+        <w:widowControl/>
+        <w:spacing w:after="120" w:before="0" w:line="420" w:lineRule="exact"/>
+      </w:pPr>
+      <w:r>
+        <w:rPr>
+          <w:rFonts w:ascii="Arial" w:hAnsi="Arial" w:eastAsia="Arial"/>
+          <w:sz w:val="32"/>
+        </w:rPr>
+        <w:t>Exercise 6 Tension of a re-entrant honeycomb</w:t>
+      </w:r>
+    </w:p>
+    <w:p>
+      <w:pPr>
+        <w:pStyle w:val="Caption"/>
+        <w:keepNext w:val="0"/>
+        <w:widowControl/>
+        <w:spacing w:after="120" w:before="0" w:line="230" w:lineRule="exact"/>
+      </w:pPr>
+      <w:r>
+        <w:rPr>
+          <w:rFonts w:ascii="Times New Roman" w:hAnsi="Times New Roman" w:eastAsia="Times New Roman"/>
+          <w:sz w:val="18"/>
+        </w:rPr>
+        <w:t>A solid plate usually narrows when stretched. A re-entrant honeycomb made of the same material can widen. Download and unzip the mesh pack, then give the folder to your AI assistant.</w:t>
+      </w:r>
+    </w:p>
+    <w:p>
+      <w:pPr>
+        <w:spacing w:after="60" w:line="240" w:lineRule="auto" w:before="120"/>
+        <w:jc w:val="center"/>
+      </w:pPr>
+      <w:r>
+        <w:drawing>
+          <wp:inline xmlns:a="http://schemas.openxmlformats.org/drawingml/2006/main" xmlns:pic="http://schemas.openxmlformats.org/drawingml/2006/picture">
+            <wp:extent cx="5842000" cy="2012244"/>
+            <wp:docPr id="6" name="Picture 6" descr="honeycomb-setup-en"/>
+            <wp:cNvGraphicFramePr>
+              <a:graphicFrameLocks noChangeAspect="1"/>
+            </wp:cNvGraphicFramePr>
+            <a:graphic>
+              <a:graphicData uri="http://schemas.openxmlformats.org/drawingml/2006/picture">
+                <pic:pic>
+                  <pic:nvPicPr>
+                    <pic:cNvPr id="0" name="honeycomb-setup-en.png"/>
+                    <pic:cNvPicPr/>
+                  </pic:nvPicPr>
+                  <pic:blipFill>
+                    <a:blip r:embed="rId16"/>
+                    <a:stretch>
+                      <a:fillRect/>
+                    </a:stretch>
+                  </pic:blipFill>
+                  <pic:spPr>
+                    <a:xfrm>
+                      <a:off x="0" y="0"/>
+                      <a:ext cx="5842000" cy="2012244"/>
+                    </a:xfrm>
+                    <a:prstGeom prst="rect"/>
+                  </pic:spPr>
+                </pic:pic>
+              </a:graphicData>
+            </a:graphic>
+          </wp:inline>
+        </w:drawing>
+      </w:r>
+    </w:p>
+    <w:p>
+      <w:pPr>
+        <w:pStyle w:val="Caption"/>
+        <w:keepNext w:val="0"/>
+        <w:widowControl/>
+        <w:spacing w:after="120" w:before="0" w:line="230" w:lineRule="exact"/>
+      </w:pPr>
+      <w:r>
+        <w:rPr>
+          <w:rFonts w:ascii="Times New Roman" w:hAnsi="Times New Roman" w:eastAsia="Times New Roman"/>
+          <w:sz w:val="18"/>
+        </w:rPr>
+        <w:t>Download and unzip the pack; give the folder containing honeycomb.msh to the AI. Coordinates are in metres.</w:t>
+      </w:r>
+    </w:p>
+    <w:p>
+      <w:pPr>
+        <w:pStyle w:val="Caption"/>
+        <w:keepNext w:val="0"/>
+        <w:widowControl/>
+        <w:spacing w:after="120" w:before="0" w:line="210" w:lineRule="exact"/>
+      </w:pPr>
+      <w:hyperlink r:id="rId17">
+        <w:r>
+          <w:rPr>
+            <w:color w:val="336B85"/>
+          </w:rPr>
+          <w:t>https://lab.haoming-luo.com/learn/files/honeycomb.zip</w:t>
+        </w:r>
+      </w:hyperlink>
+    </w:p>
+    <w:p>
+      <w:pPr>
+        <w:pStyle w:val="Heading2"/>
+        <w:keepNext/>
+        <w:widowControl/>
+        <w:spacing w:after="120" w:before="100" w:line="320" w:lineRule="exact"/>
+      </w:pPr>
+      <w:r>
+        <w:rPr>
+          <w:rFonts w:ascii="Arial" w:hAnsi="Arial" w:eastAsia="Arial"/>
+          <w:sz w:val="24"/>
+        </w:rPr>
+        <w:t>Modeling prompt</w:t>
+      </w:r>
+    </w:p>
+    <w:p>
+      <w:pPr>
+        <w:keepNext w:val="0"/>
+        <w:widowControl/>
+        <w:spacing w:after="120" w:before="0" w:line="270" w:lineRule="exact"/>
+      </w:pPr>
+      <w:r>
+        <w:rPr>
+          <w:rFonts w:ascii="Times New Roman" w:hAnsi="Times New Roman" w:eastAsia="Times New Roman"/>
+          <w:sz w:val="21"/>
+        </w:rPr>
+        <w:t>Use AgentFEM to import the attached honeycomb.msh without redrawing the geometry. Coordinates are in metres; width 51.9615 mm, height 60 mm. Boundary tags 11/12/13/14 mean left/right/bottom/top. Use small-strain linear elasticity in 2D plane stress, E=1 GPa and Poisson’s ratio 0.3; neglect gravity. Fix horizontal displacement on the left and impose a horizontal extension of 0.1% of the width on the right. Leave vertical motion free except for the bottom-left vertical displacement. Use mean displacements on all four boundaries to calculate axial and transverse strains and apparent Poisson’s ratio. Compare with a solid plate of the same size, material and constraints. Show one deformation comparison plot with its magnification.</w:t>
+      </w:r>
+    </w:p>
+    <w:p>
+      <w:pPr>
+        <w:pStyle w:val="Heading2"/>
+        <w:keepNext/>
+        <w:widowControl/>
+        <w:spacing w:after="120" w:before="100" w:line="320" w:lineRule="exact"/>
+      </w:pPr>
+      <w:r>
+        <w:rPr>
+          <w:rFonts w:ascii="Arial" w:hAnsi="Arial" w:eastAsia="Arial"/>
+          <w:sz w:val="24"/>
+        </w:rPr>
+        <w:t>Follow-up calculation</w:t>
+      </w:r>
+    </w:p>
+    <w:p>
+      <w:pPr>
+        <w:keepNext w:val="0"/>
+        <w:widowControl/>
+        <w:spacing w:after="120" w:before="0" w:line="270" w:lineRule="exact"/>
+      </w:pPr>
+      <w:r>
+        <w:rPr>
+          <w:rFonts w:ascii="Times New Roman" w:hAnsi="Times New Roman" w:eastAsia="Times New Roman"/>
+          <w:sz w:val="21"/>
+        </w:rPr>
+        <w:t>Halve the imposed horizontal extension for both specimens, leaving all other settings unchanged. Compare the apparent Poisson’s ratios and explain why displacement decreases but the ratio barely changes.</w:t>
+      </w:r>
+    </w:p>
+    <w:p>
+      <w:pPr>
+        <w:pStyle w:val="Heading2"/>
+        <w:keepNext/>
+        <w:widowControl/>
+        <w:spacing w:after="120" w:before="100" w:line="320" w:lineRule="exact"/>
+      </w:pPr>
+      <w:r>
+        <w:rPr>
+          <w:rFonts w:ascii="Arial" w:hAnsi="Arial" w:eastAsia="Arial"/>
+          <w:sz w:val="24"/>
+        </w:rPr>
+        <w:t>Observations</w:t>
+      </w:r>
+    </w:p>
+    <w:p>
+      <w:pPr>
+        <w:pStyle w:val="Caption"/>
+        <w:keepNext w:val="0"/>
+        <w:widowControl/>
+        <w:spacing w:after="120" w:before="0" w:line="230" w:lineRule="exact"/>
+      </w:pPr>
+      <w:r>
+        <w:rPr>
+          <w:rFonts w:ascii="Times New Roman" w:hAnsi="Times New Roman" w:eastAsia="Times New Roman"/>
+          <w:sz w:val="18"/>
+        </w:rPr>
+        <w:t>Honeycomb: axial strain ________ transverse strain ________ ratio ________</w:t>
+      </w:r>
+    </w:p>
+    <w:p>
+      <w:pPr>
+        <w:pStyle w:val="Caption"/>
+        <w:keepNext w:val="0"/>
+        <w:widowControl/>
+        <w:spacing w:after="120" w:before="0" w:line="230" w:lineRule="exact"/>
+      </w:pPr>
+      <w:r>
+        <w:rPr>
+          <w:rFonts w:ascii="Times New Roman" w:hAnsi="Times New Roman" w:eastAsia="Times New Roman"/>
+          <w:sz w:val="18"/>
+        </w:rPr>
+        <w:t>Solid plate ratio: ________ Honeycomb ratio at half extension: ________</w:t>
+      </w:r>
+    </w:p>
+    <w:p>
+      <w:pPr>
+        <w:pStyle w:val="Caption"/>
+        <w:keepNext w:val="0"/>
+        <w:widowControl/>
+        <w:spacing w:after="120" w:before="0" w:line="230" w:lineRule="exact"/>
+      </w:pPr>
+      <w:r>
+        <w:rPr>
+          <w:rFonts w:ascii="Times New Roman" w:hAnsi="Times New Roman" w:eastAsia="Times New Roman"/>
+          <w:sz w:val="18"/>
+        </w:rPr>
+        <w:t>Submit one comparison plot, key values and a two- or three-sentence explanation.</w:t>
+      </w:r>
+    </w:p>
+    <w:p>
+      <w:r>
+        <w:br w:type="page"/>
+      </w:r>
+    </w:p>
+    <w:p>
+      <w:pPr>
+        <w:pStyle w:val="Heading1"/>
+        <w:keepNext/>
+        <w:widowControl/>
+        <w:spacing w:after="120" w:before="0" w:line="420" w:lineRule="exact"/>
+      </w:pPr>
+      <w:r>
+        <w:rPr>
+          <w:rFonts w:ascii="Arial" w:hAnsi="Arial" w:eastAsia="Arial"/>
+          <w:sz w:val="32"/>
+        </w:rPr>
         <w:t>Reference answers 1</w:t>
       </w:r>
     </w:p>
@@ -3187,7 +3785,7 @@
         <w:drawing>
           <wp:inline xmlns:a="http://schemas.openxmlformats.org/drawingml/2006/main" xmlns:pic="http://schemas.openxmlformats.org/drawingml/2006/picture">
             <wp:extent cx="4572000" cy="1221643"/>
-            <wp:docPr id="5" name="Picture 5" descr="beam-en"/>
+            <wp:docPr id="7" name="Picture 7" descr="beam-en"/>
             <wp:cNvGraphicFramePr>
               <a:graphicFrameLocks noChangeAspect="1"/>
             </wp:cNvGraphicFramePr>
@@ -3199,7 +3797,7 @@
                     <pic:cNvPicPr/>
                   </pic:nvPicPr>
                   <pic:blipFill>
-                    <a:blip r:embed="rId15"/>
+                    <a:blip r:embed="rId18"/>
                     <a:stretch>
                       <a:fillRect/>
                     </a:stretch>
@@ -3710,7 +4308,7 @@
         <w:drawing>
           <wp:inline xmlns:a="http://schemas.openxmlformats.org/drawingml/2006/main" xmlns:pic="http://schemas.openxmlformats.org/drawingml/2006/picture">
             <wp:extent cx="4572000" cy="1303687"/>
-            <wp:docPr id="6" name="Picture 6" descr="cylinder-en"/>
+            <wp:docPr id="8" name="Picture 8" descr="cylinder-en"/>
             <wp:cNvGraphicFramePr>
               <a:graphicFrameLocks noChangeAspect="1"/>
             </wp:cNvGraphicFramePr>
@@ -3722,7 +4320,7 @@
                     <pic:cNvPicPr/>
                   </pic:nvPicPr>
                   <pic:blipFill>
-                    <a:blip r:embed="rId16"/>
+                    <a:blip r:embed="rId19"/>
                     <a:stretch>
                       <a:fillRect/>
                     </a:stretch>
@@ -4134,7 +4732,7 @@
         <w:drawing>
           <wp:inline xmlns:a="http://schemas.openxmlformats.org/drawingml/2006/main" xmlns:pic="http://schemas.openxmlformats.org/drawingml/2006/picture">
             <wp:extent cx="3429000" cy="977765"/>
-            <wp:docPr id="7" name="Picture 7" descr="steady-en"/>
+            <wp:docPr id="9" name="Picture 9" descr="steady-en"/>
             <wp:cNvGraphicFramePr>
               <a:graphicFrameLocks noChangeAspect="1"/>
             </wp:cNvGraphicFramePr>
@@ -4146,7 +4744,7 @@
                     <pic:cNvPicPr/>
                   </pic:nvPicPr>
                   <pic:blipFill>
-                    <a:blip r:embed="rId17"/>
+                    <a:blip r:embed="rId20"/>
                     <a:stretch>
                       <a:fillRect/>
                     </a:stretch>
@@ -4909,7 +5507,7 @@
         <w:drawing>
           <wp:inline xmlns:a="http://schemas.openxmlformats.org/drawingml/2006/main" xmlns:pic="http://schemas.openxmlformats.org/drawingml/2006/picture">
             <wp:extent cx="3429000" cy="977765"/>
-            <wp:docPr id="8" name="Picture 8" descr="transient-en"/>
+            <wp:docPr id="10" name="Picture 10" descr="transient-en"/>
             <wp:cNvGraphicFramePr>
               <a:graphicFrameLocks noChangeAspect="1"/>
             </wp:cNvGraphicFramePr>
@@ -4921,7 +5519,7 @@
                     <pic:cNvPicPr/>
                   </pic:nvPicPr>
                   <pic:blipFill>
-                    <a:blip r:embed="rId18"/>
+                    <a:blip r:embed="rId21"/>
                     <a:stretch>
                       <a:fillRect/>
                     </a:stretch>
@@ -4986,6 +5584,934 @@
       </w:r>
     </w:p>
     <w:p>
+      <w:r>
+        <w:br w:type="page"/>
+      </w:r>
+    </w:p>
+    <w:p>
+      <w:pPr>
+        <w:pStyle w:val="Heading1"/>
+        <w:keepNext/>
+        <w:widowControl/>
+        <w:spacing w:after="120" w:before="0" w:line="420" w:lineRule="exact"/>
+      </w:pPr>
+      <w:r>
+        <w:rPr>
+          <w:rFonts w:ascii="Arial" w:hAnsi="Arial" w:eastAsia="Arial"/>
+          <w:sz w:val="32"/>
+        </w:rPr>
+        <w:t>Reference answers 3</w:t>
+      </w:r>
+    </w:p>
+    <w:p>
+      <w:pPr>
+        <w:pStyle w:val="Heading2"/>
+        <w:keepNext/>
+        <w:widowControl/>
+        <w:spacing w:after="120" w:before="100" w:line="320" w:lineRule="exact"/>
+      </w:pPr>
+      <w:r>
+        <w:rPr>
+          <w:rFonts w:ascii="Arial" w:hAnsi="Arial" w:eastAsia="Arial"/>
+          <w:sz w:val="24"/>
+        </w:rPr>
+        <w:t>5 Column buckling</w:t>
+      </w:r>
+    </w:p>
+    <w:p>
+      <w:pPr>
+        <w:keepNext w:val="0"/>
+        <w:widowControl/>
+        <w:spacing w:after="120" w:before="0" w:line="320" w:lineRule="exact"/>
+      </w:pPr>
+      <w:r>
+        <w:rPr>
+          <w:rFonts w:ascii="Times New Roman" w:hAnsi="Times New Roman" w:eastAsia="Times New Roman"/>
+          <w:sz w:val="22"/>
+        </w:rPr>
+        <w:t>I = bh</w:t>
+      </w:r>
+      <w:r>
+        <w:rPr>
+          <w:rFonts w:ascii="Times New Roman" w:hAnsi="Times New Roman" w:eastAsia="Times New Roman"/>
+          <w:sz w:val="22"/>
+          <w:vertAlign w:val="superscript"/>
+        </w:rPr>
+        <w:t>3</w:t>
+      </w:r>
+      <w:r>
+        <w:rPr>
+          <w:rFonts w:ascii="Times New Roman" w:hAnsi="Times New Roman" w:eastAsia="Times New Roman"/>
+          <w:sz w:val="22"/>
+        </w:rPr>
+        <w:t>/12; P</w:t>
+      </w:r>
+      <w:r>
+        <w:rPr>
+          <w:rFonts w:ascii="Times New Roman" w:hAnsi="Times New Roman" w:eastAsia="Times New Roman"/>
+          <w:sz w:val="22"/>
+          <w:vertAlign w:val="subscript"/>
+        </w:rPr>
+        <w:t>cr</w:t>
+      </w:r>
+      <w:r>
+        <w:rPr>
+          <w:rFonts w:ascii="Times New Roman" w:hAnsi="Times New Roman" w:eastAsia="Times New Roman"/>
+          <w:sz w:val="22"/>
+        </w:rPr>
+        <w:t xml:space="preserve"> = π</w:t>
+      </w:r>
+      <w:r>
+        <w:rPr>
+          <w:rFonts w:ascii="Times New Roman" w:hAnsi="Times New Roman" w:eastAsia="Times New Roman"/>
+          <w:sz w:val="22"/>
+          <w:vertAlign w:val="superscript"/>
+        </w:rPr>
+        <w:t>2</w:t>
+      </w:r>
+      <w:r>
+        <w:rPr>
+          <w:rFonts w:ascii="Times New Roman" w:hAnsi="Times New Roman" w:eastAsia="Times New Roman"/>
+          <w:sz w:val="22"/>
+        </w:rPr>
+        <w:t>EI/(4L</w:t>
+      </w:r>
+      <w:r>
+        <w:rPr>
+          <w:rFonts w:ascii="Times New Roman" w:hAnsi="Times New Roman" w:eastAsia="Times New Roman"/>
+          <w:sz w:val="22"/>
+          <w:vertAlign w:val="superscript"/>
+        </w:rPr>
+        <w:t>2</w:t>
+      </w:r>
+      <w:r>
+        <w:rPr>
+          <w:rFonts w:ascii="Times New Roman" w:hAnsi="Times New Roman" w:eastAsia="Times New Roman"/>
+          <w:sz w:val="22"/>
+        </w:rPr>
+        <w:t>).</w:t>
+      </w:r>
+    </w:p>
+    <w:tbl>
+      <w:tblPr>
+        <w:tblW w:type="auto" w:w="0"/>
+        <w:jc w:val="left"/>
+        <w:tblLayout w:type="fixed"/>
+        <w:tblLook w:firstColumn="1" w:firstRow="1" w:lastColumn="0" w:lastRow="0" w:noHBand="0" w:noVBand="1" w:val="04A0"/>
+        <w:tblBorders>
+          <w:top w:val="single" w:sz="4" w:color="D9D9D9"/>
+          <w:left w:val="single" w:sz="4" w:color="D9D9D9"/>
+          <w:bottom w:val="single" w:sz="4" w:color="D9D9D9"/>
+          <w:right w:val="single" w:sz="4" w:color="D9D9D9"/>
+          <w:insideH w:val="single" w:sz="4" w:color="D9D9D9"/>
+          <w:insideV w:val="single" w:sz="4" w:color="D9D9D9"/>
+        </w:tblBorders>
+      </w:tblPr>
+      <w:tblGrid>
+        <w:gridCol w:w="2000"/>
+        <w:gridCol w:w="3800"/>
+        <w:gridCol w:w="4180"/>
+      </w:tblGrid>
+      <w:tr>
+        <w:trPr>
+          <w:tblHeader/>
+        </w:trPr>
+        <w:tc>
+          <w:tcPr>
+            <w:tcW w:type="dxa" w:w="2000"/>
+            <w:vAlign w:val="center"/>
+            <w:tcMar>
+              <w:top w:w="45" w:type="dxa"/>
+              <w:bottom w:w="45" w:type="dxa"/>
+              <w:left w:w="90" w:type="dxa"/>
+              <w:right w:w="90" w:type="dxa"/>
+            </w:tcMar>
+            <w:shd w:fill="EEEEEE"/>
+          </w:tcPr>
+          <w:p>
+            <w:pPr>
+              <w:pStyle w:val="Caption"/>
+              <w:keepNext w:val="0"/>
+              <w:widowControl/>
+              <w:spacing w:after="60" w:before="0" w:line="240" w:lineRule="exact"/>
+            </w:pPr>
+            <w:r>
+              <w:rPr>
+                <w:rFonts w:ascii="Times New Roman" w:hAnsi="Times New Roman" w:eastAsia="Times New Roman"/>
+                <w:sz w:val="18"/>
+              </w:rPr>
+              <w:t>Length / mm</w:t>
+            </w:r>
+          </w:p>
+        </w:tc>
+        <w:tc>
+          <w:tcPr>
+            <w:tcW w:type="dxa" w:w="3800"/>
+            <w:vAlign w:val="center"/>
+            <w:tcMar>
+              <w:top w:w="45" w:type="dxa"/>
+              <w:bottom w:w="45" w:type="dxa"/>
+              <w:left w:w="90" w:type="dxa"/>
+              <w:right w:w="90" w:type="dxa"/>
+            </w:tcMar>
+            <w:shd w:fill="EEEEEE"/>
+          </w:tcPr>
+          <w:p>
+            <w:pPr>
+              <w:pStyle w:val="Caption"/>
+              <w:keepNext w:val="0"/>
+              <w:widowControl/>
+              <w:spacing w:after="60" w:before="0" w:line="240" w:lineRule="exact"/>
+            </w:pPr>
+            <w:r>
+              <w:rPr>
+                <w:rFonts w:ascii="Times New Roman" w:hAnsi="Times New Roman" w:eastAsia="Times New Roman"/>
+                <w:sz w:val="18"/>
+              </w:rPr>
+              <w:t>FE / N</w:t>
+            </w:r>
+          </w:p>
+        </w:tc>
+        <w:tc>
+          <w:tcPr>
+            <w:tcW w:type="dxa" w:w="4180"/>
+            <w:vAlign w:val="center"/>
+            <w:tcMar>
+              <w:top w:w="45" w:type="dxa"/>
+              <w:bottom w:w="45" w:type="dxa"/>
+              <w:left w:w="90" w:type="dxa"/>
+              <w:right w:w="90" w:type="dxa"/>
+            </w:tcMar>
+            <w:shd w:fill="EEEEEE"/>
+          </w:tcPr>
+          <w:p>
+            <w:pPr>
+              <w:pStyle w:val="Caption"/>
+              <w:keepNext w:val="0"/>
+              <w:widowControl/>
+              <w:spacing w:after="60" w:before="0" w:line="240" w:lineRule="exact"/>
+            </w:pPr>
+            <w:r>
+              <w:rPr>
+                <w:rFonts w:ascii="Times New Roman" w:hAnsi="Times New Roman" w:eastAsia="Times New Roman"/>
+                <w:sz w:val="18"/>
+              </w:rPr>
+              <w:t>Euler / N</w:t>
+            </w:r>
+          </w:p>
+        </w:tc>
+      </w:tr>
+      <w:tr>
+        <w:tc>
+          <w:tcPr>
+            <w:tcW w:type="dxa" w:w="2000"/>
+            <w:vAlign w:val="center"/>
+            <w:tcMar>
+              <w:top w:w="45" w:type="dxa"/>
+              <w:bottom w:w="45" w:type="dxa"/>
+              <w:left w:w="90" w:type="dxa"/>
+              <w:right w:w="90" w:type="dxa"/>
+            </w:tcMar>
+          </w:tcPr>
+          <w:p>
+            <w:pPr>
+              <w:pStyle w:val="Caption"/>
+              <w:keepNext w:val="0"/>
+              <w:widowControl/>
+              <w:spacing w:after="60" w:before="0" w:line="240" w:lineRule="exact"/>
+            </w:pPr>
+            <w:r>
+              <w:rPr>
+                <w:rFonts w:ascii="Times New Roman" w:hAnsi="Times New Roman" w:eastAsia="Times New Roman"/>
+                <w:sz w:val="18"/>
+              </w:rPr>
+              <w:t>200</w:t>
+            </w:r>
+          </w:p>
+        </w:tc>
+        <w:tc>
+          <w:tcPr>
+            <w:tcW w:type="dxa" w:w="3800"/>
+            <w:vAlign w:val="center"/>
+            <w:tcMar>
+              <w:top w:w="45" w:type="dxa"/>
+              <w:bottom w:w="45" w:type="dxa"/>
+              <w:left w:w="90" w:type="dxa"/>
+              <w:right w:w="90" w:type="dxa"/>
+            </w:tcMar>
+          </w:tcPr>
+          <w:p>
+            <w:pPr>
+              <w:pStyle w:val="Caption"/>
+              <w:keepNext w:val="0"/>
+              <w:widowControl/>
+              <w:spacing w:after="60" w:before="0" w:line="240" w:lineRule="exact"/>
+            </w:pPr>
+            <w:r>
+              <w:rPr>
+                <w:rFonts w:ascii="Times New Roman" w:hAnsi="Times New Roman" w:eastAsia="Times New Roman"/>
+                <w:sz w:val="18"/>
+              </w:rPr>
+              <w:t>10779.48</w:t>
+            </w:r>
+          </w:p>
+        </w:tc>
+        <w:tc>
+          <w:tcPr>
+            <w:tcW w:type="dxa" w:w="4180"/>
+            <w:vAlign w:val="center"/>
+            <w:tcMar>
+              <w:top w:w="45" w:type="dxa"/>
+              <w:bottom w:w="45" w:type="dxa"/>
+              <w:left w:w="90" w:type="dxa"/>
+              <w:right w:w="90" w:type="dxa"/>
+            </w:tcMar>
+          </w:tcPr>
+          <w:p>
+            <w:pPr>
+              <w:pStyle w:val="Caption"/>
+              <w:keepNext w:val="0"/>
+              <w:widowControl/>
+              <w:spacing w:after="60" w:before="0" w:line="240" w:lineRule="exact"/>
+            </w:pPr>
+            <w:r>
+              <w:rPr>
+                <w:rFonts w:ascii="Times New Roman" w:hAnsi="Times New Roman" w:eastAsia="Times New Roman"/>
+                <w:sz w:val="18"/>
+              </w:rPr>
+              <w:t>10794.88</w:t>
+            </w:r>
+          </w:p>
+        </w:tc>
+      </w:tr>
+      <w:tr>
+        <w:tc>
+          <w:tcPr>
+            <w:tcW w:type="dxa" w:w="2000"/>
+            <w:vAlign w:val="center"/>
+            <w:tcMar>
+              <w:top w:w="45" w:type="dxa"/>
+              <w:bottom w:w="45" w:type="dxa"/>
+              <w:left w:w="90" w:type="dxa"/>
+              <w:right w:w="90" w:type="dxa"/>
+            </w:tcMar>
+          </w:tcPr>
+          <w:p>
+            <w:pPr>
+              <w:pStyle w:val="Caption"/>
+              <w:keepNext w:val="0"/>
+              <w:widowControl/>
+              <w:spacing w:after="60" w:before="0" w:line="240" w:lineRule="exact"/>
+            </w:pPr>
+            <w:r>
+              <w:rPr>
+                <w:rFonts w:ascii="Times New Roman" w:hAnsi="Times New Roman" w:eastAsia="Times New Roman"/>
+                <w:sz w:val="18"/>
+              </w:rPr>
+              <w:t>400</w:t>
+            </w:r>
+          </w:p>
+        </w:tc>
+        <w:tc>
+          <w:tcPr>
+            <w:tcW w:type="dxa" w:w="3800"/>
+            <w:vAlign w:val="center"/>
+            <w:tcMar>
+              <w:top w:w="45" w:type="dxa"/>
+              <w:bottom w:w="45" w:type="dxa"/>
+              <w:left w:w="90" w:type="dxa"/>
+              <w:right w:w="90" w:type="dxa"/>
+            </w:tcMar>
+          </w:tcPr>
+          <w:p>
+            <w:pPr>
+              <w:pStyle w:val="Caption"/>
+              <w:keepNext w:val="0"/>
+              <w:widowControl/>
+              <w:spacing w:after="60" w:before="0" w:line="240" w:lineRule="exact"/>
+            </w:pPr>
+            <w:r>
+              <w:rPr>
+                <w:rFonts w:ascii="Times New Roman" w:hAnsi="Times New Roman" w:eastAsia="Times New Roman"/>
+                <w:sz w:val="18"/>
+              </w:rPr>
+              <w:t>2698.18</w:t>
+            </w:r>
+          </w:p>
+        </w:tc>
+        <w:tc>
+          <w:tcPr>
+            <w:tcW w:type="dxa" w:w="4180"/>
+            <w:vAlign w:val="center"/>
+            <w:tcMar>
+              <w:top w:w="45" w:type="dxa"/>
+              <w:bottom w:w="45" w:type="dxa"/>
+              <w:left w:w="90" w:type="dxa"/>
+              <w:right w:w="90" w:type="dxa"/>
+            </w:tcMar>
+          </w:tcPr>
+          <w:p>
+            <w:pPr>
+              <w:pStyle w:val="Caption"/>
+              <w:keepNext w:val="0"/>
+              <w:widowControl/>
+              <w:spacing w:after="60" w:before="0" w:line="240" w:lineRule="exact"/>
+            </w:pPr>
+            <w:r>
+              <w:rPr>
+                <w:rFonts w:ascii="Times New Roman" w:hAnsi="Times New Roman" w:eastAsia="Times New Roman"/>
+                <w:sz w:val="18"/>
+              </w:rPr>
+              <w:t>2698.72</w:t>
+            </w:r>
+          </w:p>
+        </w:tc>
+      </w:tr>
+    </w:tbl>
+    <w:p>
+      <w:pPr>
+        <w:spacing w:after="60" w:line="240" w:lineRule="auto" w:before="120"/>
+        <w:jc w:val="center"/>
+      </w:pPr>
+      <w:r>
+        <w:drawing>
+          <wp:inline xmlns:a="http://schemas.openxmlformats.org/drawingml/2006/main" xmlns:pic="http://schemas.openxmlformats.org/drawingml/2006/picture">
+            <wp:extent cx="4318000" cy="1631244"/>
+            <wp:docPr id="11" name="Picture 11" descr="column-en"/>
+            <wp:cNvGraphicFramePr>
+              <a:graphicFrameLocks noChangeAspect="1"/>
+            </wp:cNvGraphicFramePr>
+            <a:graphic>
+              <a:graphicData uri="http://schemas.openxmlformats.org/drawingml/2006/picture">
+                <pic:pic>
+                  <pic:nvPicPr>
+                    <pic:cNvPr id="0" name="column-en.png"/>
+                    <pic:cNvPicPr/>
+                  </pic:nvPicPr>
+                  <pic:blipFill>
+                    <a:blip r:embed="rId22"/>
+                    <a:stretch>
+                      <a:fillRect/>
+                    </a:stretch>
+                  </pic:blipFill>
+                  <pic:spPr>
+                    <a:xfrm>
+                      <a:off x="0" y="0"/>
+                      <a:ext cx="4318000" cy="1631244"/>
+                    </a:xfrm>
+                    <a:prstGeom prst="rect"/>
+                  </pic:spPr>
+                </pic:pic>
+              </a:graphicData>
+            </a:graphic>
+          </wp:inline>
+        </w:drawing>
+      </w:r>
+    </w:p>
+    <w:p>
+      <w:pPr>
+        <w:pStyle w:val="Caption"/>
+        <w:keepNext w:val="0"/>
+        <w:widowControl/>
+        <w:spacing w:after="120" w:before="0" w:line="230" w:lineRule="exact"/>
+      </w:pPr>
+      <w:r>
+        <w:rPr>
+          <w:rFonts w:ascii="Times New Roman" w:hAnsi="Times New Roman" w:eastAsia="Times New Roman"/>
+          <w:sz w:val="18"/>
+        </w:rPr>
+        <w:t>Mode amplitude is for display only. Critical load equals reference force times eigenvalue; the long-to-short column load ratio is about 0.25.</w:t>
+      </w:r>
+    </w:p>
+    <w:p>
+      <w:pPr>
+        <w:pStyle w:val="Heading2"/>
+        <w:keepNext/>
+        <w:widowControl/>
+        <w:spacing w:after="120" w:before="100" w:line="320" w:lineRule="exact"/>
+      </w:pPr>
+      <w:r>
+        <w:rPr>
+          <w:rFonts w:ascii="Arial" w:hAnsi="Arial" w:eastAsia="Arial"/>
+          <w:sz w:val="24"/>
+        </w:rPr>
+        <w:t>6 Negative Poisson’s ratio</w:t>
+      </w:r>
+    </w:p>
+    <w:p>
+      <w:pPr>
+        <w:keepNext w:val="0"/>
+        <w:widowControl/>
+        <w:spacing w:after="120" w:before="0" w:line="320" w:lineRule="exact"/>
+      </w:pPr>
+      <w:r>
+        <w:rPr>
+          <w:rFonts w:ascii="Times New Roman" w:hAnsi="Times New Roman" w:eastAsia="Times New Roman"/>
+          <w:sz w:val="22"/>
+        </w:rPr>
+        <w:t>ν</w:t>
+      </w:r>
+      <w:r>
+        <w:rPr>
+          <w:rFonts w:ascii="Times New Roman" w:hAnsi="Times New Roman" w:eastAsia="Times New Roman"/>
+          <w:sz w:val="22"/>
+          <w:vertAlign w:val="subscript"/>
+        </w:rPr>
+        <w:t>app</w:t>
+      </w:r>
+      <w:r>
+        <w:rPr>
+          <w:rFonts w:ascii="Times New Roman" w:hAnsi="Times New Roman" w:eastAsia="Times New Roman"/>
+          <w:sz w:val="22"/>
+        </w:rPr>
+        <w:t xml:space="preserve"> = −ε</w:t>
+      </w:r>
+      <w:r>
+        <w:rPr>
+          <w:rFonts w:ascii="Times New Roman" w:hAnsi="Times New Roman" w:eastAsia="Times New Roman"/>
+          <w:sz w:val="22"/>
+          <w:vertAlign w:val="subscript"/>
+        </w:rPr>
+        <w:t>y</w:t>
+      </w:r>
+      <w:r>
+        <w:rPr>
+          <w:rFonts w:ascii="Times New Roman" w:hAnsi="Times New Roman" w:eastAsia="Times New Roman"/>
+          <w:sz w:val="22"/>
+        </w:rPr>
+        <w:t>/ε</w:t>
+      </w:r>
+      <w:r>
+        <w:rPr>
+          <w:rFonts w:ascii="Times New Roman" w:hAnsi="Times New Roman" w:eastAsia="Times New Roman"/>
+          <w:sz w:val="22"/>
+          <w:vertAlign w:val="subscript"/>
+        </w:rPr>
+        <w:t>x</w:t>
+      </w:r>
+      <w:r>
+        <w:rPr>
+          <w:rFonts w:ascii="Times New Roman" w:hAnsi="Times New Roman" w:eastAsia="Times New Roman"/>
+          <w:sz w:val="22"/>
+        </w:rPr>
+        <w:t>.</w:t>
+      </w:r>
+    </w:p>
+    <w:tbl>
+      <w:tblPr>
+        <w:tblW w:type="auto" w:w="0"/>
+        <w:jc w:val="left"/>
+        <w:tblLayout w:type="fixed"/>
+        <w:tblLook w:firstColumn="1" w:firstRow="1" w:lastColumn="0" w:lastRow="0" w:noHBand="0" w:noVBand="1" w:val="04A0"/>
+        <w:tblBorders>
+          <w:top w:val="single" w:sz="4" w:color="D9D9D9"/>
+          <w:left w:val="single" w:sz="4" w:color="D9D9D9"/>
+          <w:bottom w:val="single" w:sz="4" w:color="D9D9D9"/>
+          <w:right w:val="single" w:sz="4" w:color="D9D9D9"/>
+          <w:insideH w:val="single" w:sz="4" w:color="D9D9D9"/>
+          <w:insideV w:val="single" w:sz="4" w:color="D9D9D9"/>
+        </w:tblBorders>
+      </w:tblPr>
+      <w:tblGrid>
+        <w:gridCol w:w="2200"/>
+        <w:gridCol w:w="2400"/>
+        <w:gridCol w:w="2700"/>
+        <w:gridCol w:w="2680"/>
+      </w:tblGrid>
+      <w:tr>
+        <w:trPr>
+          <w:tblHeader/>
+        </w:trPr>
+        <w:tc>
+          <w:tcPr>
+            <w:tcW w:type="dxa" w:w="2200"/>
+            <w:vAlign w:val="center"/>
+            <w:tcMar>
+              <w:top w:w="45" w:type="dxa"/>
+              <w:bottom w:w="45" w:type="dxa"/>
+              <w:left w:w="90" w:type="dxa"/>
+              <w:right w:w="90" w:type="dxa"/>
+            </w:tcMar>
+            <w:shd w:fill="EEEEEE"/>
+          </w:tcPr>
+          <w:p>
+            <w:pPr>
+              <w:pStyle w:val="Caption"/>
+              <w:keepNext w:val="0"/>
+              <w:widowControl/>
+              <w:spacing w:after="60" w:before="0" w:line="240" w:lineRule="exact"/>
+            </w:pPr>
+            <w:r>
+              <w:rPr>
+                <w:rFonts w:ascii="Times New Roman" w:hAnsi="Times New Roman" w:eastAsia="Times New Roman"/>
+                <w:sz w:val="18"/>
+              </w:rPr>
+              <w:t>Specimen</w:t>
+            </w:r>
+          </w:p>
+        </w:tc>
+        <w:tc>
+          <w:tcPr>
+            <w:tcW w:type="dxa" w:w="2400"/>
+            <w:vAlign w:val="center"/>
+            <w:tcMar>
+              <w:top w:w="45" w:type="dxa"/>
+              <w:bottom w:w="45" w:type="dxa"/>
+              <w:left w:w="90" w:type="dxa"/>
+              <w:right w:w="90" w:type="dxa"/>
+            </w:tcMar>
+            <w:shd w:fill="EEEEEE"/>
+          </w:tcPr>
+          <w:p>
+            <w:pPr>
+              <w:pStyle w:val="Caption"/>
+              <w:keepNext w:val="0"/>
+              <w:widowControl/>
+              <w:spacing w:after="60" w:before="0" w:line="240" w:lineRule="exact"/>
+            </w:pPr>
+            <w:r>
+              <w:rPr>
+                <w:rFonts w:ascii="Times New Roman" w:hAnsi="Times New Roman" w:eastAsia="Times New Roman"/>
+                <w:sz w:val="18"/>
+              </w:rPr>
+              <w:t>Axial strain</w:t>
+            </w:r>
+          </w:p>
+        </w:tc>
+        <w:tc>
+          <w:tcPr>
+            <w:tcW w:type="dxa" w:w="2700"/>
+            <w:vAlign w:val="center"/>
+            <w:tcMar>
+              <w:top w:w="45" w:type="dxa"/>
+              <w:bottom w:w="45" w:type="dxa"/>
+              <w:left w:w="90" w:type="dxa"/>
+              <w:right w:w="90" w:type="dxa"/>
+            </w:tcMar>
+            <w:shd w:fill="EEEEEE"/>
+          </w:tcPr>
+          <w:p>
+            <w:pPr>
+              <w:pStyle w:val="Caption"/>
+              <w:keepNext w:val="0"/>
+              <w:widowControl/>
+              <w:spacing w:after="60" w:before="0" w:line="240" w:lineRule="exact"/>
+            </w:pPr>
+            <w:r>
+              <w:rPr>
+                <w:rFonts w:ascii="Times New Roman" w:hAnsi="Times New Roman" w:eastAsia="Times New Roman"/>
+                <w:sz w:val="18"/>
+              </w:rPr>
+              <w:t>Transverse strain</w:t>
+            </w:r>
+          </w:p>
+        </w:tc>
+        <w:tc>
+          <w:tcPr>
+            <w:tcW w:type="dxa" w:w="2680"/>
+            <w:vAlign w:val="center"/>
+            <w:tcMar>
+              <w:top w:w="45" w:type="dxa"/>
+              <w:bottom w:w="45" w:type="dxa"/>
+              <w:left w:w="90" w:type="dxa"/>
+              <w:right w:w="90" w:type="dxa"/>
+            </w:tcMar>
+            <w:shd w:fill="EEEEEE"/>
+          </w:tcPr>
+          <w:p>
+            <w:pPr>
+              <w:pStyle w:val="Caption"/>
+              <w:keepNext w:val="0"/>
+              <w:widowControl/>
+              <w:spacing w:after="60" w:before="0" w:line="240" w:lineRule="exact"/>
+            </w:pPr>
+            <w:r>
+              <w:rPr>
+                <w:rFonts w:ascii="Times New Roman" w:hAnsi="Times New Roman" w:eastAsia="Times New Roman"/>
+                <w:sz w:val="18"/>
+              </w:rPr>
+              <w:t>Apparent ratio</w:t>
+            </w:r>
+          </w:p>
+        </w:tc>
+      </w:tr>
+      <w:tr>
+        <w:tc>
+          <w:tcPr>
+            <w:tcW w:type="dxa" w:w="2200"/>
+            <w:vAlign w:val="center"/>
+            <w:tcMar>
+              <w:top w:w="45" w:type="dxa"/>
+              <w:bottom w:w="45" w:type="dxa"/>
+              <w:left w:w="90" w:type="dxa"/>
+              <w:right w:w="90" w:type="dxa"/>
+            </w:tcMar>
+          </w:tcPr>
+          <w:p>
+            <w:pPr>
+              <w:pStyle w:val="Caption"/>
+              <w:keepNext w:val="0"/>
+              <w:widowControl/>
+              <w:spacing w:after="60" w:before="0" w:line="240" w:lineRule="exact"/>
+            </w:pPr>
+            <w:r>
+              <w:rPr>
+                <w:rFonts w:ascii="Times New Roman" w:hAnsi="Times New Roman" w:eastAsia="Times New Roman"/>
+                <w:sz w:val="18"/>
+              </w:rPr>
+              <w:t>Honeycomb</w:t>
+            </w:r>
+          </w:p>
+        </w:tc>
+        <w:tc>
+          <w:tcPr>
+            <w:tcW w:type="dxa" w:w="2400"/>
+            <w:vAlign w:val="center"/>
+            <w:tcMar>
+              <w:top w:w="45" w:type="dxa"/>
+              <w:bottom w:w="45" w:type="dxa"/>
+              <w:left w:w="90" w:type="dxa"/>
+              <w:right w:w="90" w:type="dxa"/>
+            </w:tcMar>
+          </w:tcPr>
+          <w:p>
+            <w:pPr>
+              <w:pStyle w:val="Caption"/>
+              <w:keepNext w:val="0"/>
+              <w:widowControl/>
+              <w:spacing w:after="60" w:before="0" w:line="240" w:lineRule="exact"/>
+            </w:pPr>
+            <w:r>
+              <w:rPr>
+                <w:rFonts w:ascii="Times New Roman" w:hAnsi="Times New Roman" w:eastAsia="Times New Roman"/>
+                <w:sz w:val="18"/>
+              </w:rPr>
+              <w:t>0.001000</w:t>
+            </w:r>
+          </w:p>
+        </w:tc>
+        <w:tc>
+          <w:tcPr>
+            <w:tcW w:type="dxa" w:w="2700"/>
+            <w:vAlign w:val="center"/>
+            <w:tcMar>
+              <w:top w:w="45" w:type="dxa"/>
+              <w:bottom w:w="45" w:type="dxa"/>
+              <w:left w:w="90" w:type="dxa"/>
+              <w:right w:w="90" w:type="dxa"/>
+            </w:tcMar>
+          </w:tcPr>
+          <w:p>
+            <w:pPr>
+              <w:pStyle w:val="Caption"/>
+              <w:keepNext w:val="0"/>
+              <w:widowControl/>
+              <w:spacing w:after="60" w:before="0" w:line="240" w:lineRule="exact"/>
+            </w:pPr>
+            <w:r>
+              <w:rPr>
+                <w:rFonts w:ascii="Times New Roman" w:hAnsi="Times New Roman" w:eastAsia="Times New Roman"/>
+                <w:sz w:val="18"/>
+              </w:rPr>
+              <w:t>0.001303</w:t>
+            </w:r>
+          </w:p>
+        </w:tc>
+        <w:tc>
+          <w:tcPr>
+            <w:tcW w:type="dxa" w:w="2680"/>
+            <w:vAlign w:val="center"/>
+            <w:tcMar>
+              <w:top w:w="45" w:type="dxa"/>
+              <w:bottom w:w="45" w:type="dxa"/>
+              <w:left w:w="90" w:type="dxa"/>
+              <w:right w:w="90" w:type="dxa"/>
+            </w:tcMar>
+          </w:tcPr>
+          <w:p>
+            <w:pPr>
+              <w:pStyle w:val="Caption"/>
+              <w:keepNext w:val="0"/>
+              <w:widowControl/>
+              <w:spacing w:after="60" w:before="0" w:line="240" w:lineRule="exact"/>
+            </w:pPr>
+            <w:r>
+              <w:rPr>
+                <w:rFonts w:ascii="Times New Roman" w:hAnsi="Times New Roman" w:eastAsia="Times New Roman"/>
+                <w:sz w:val="18"/>
+              </w:rPr>
+              <w:t>-1.3026</w:t>
+            </w:r>
+          </w:p>
+        </w:tc>
+      </w:tr>
+      <w:tr>
+        <w:tc>
+          <w:tcPr>
+            <w:tcW w:type="dxa" w:w="2200"/>
+            <w:vAlign w:val="center"/>
+            <w:tcMar>
+              <w:top w:w="45" w:type="dxa"/>
+              <w:bottom w:w="45" w:type="dxa"/>
+              <w:left w:w="90" w:type="dxa"/>
+              <w:right w:w="90" w:type="dxa"/>
+            </w:tcMar>
+          </w:tcPr>
+          <w:p>
+            <w:pPr>
+              <w:pStyle w:val="Caption"/>
+              <w:keepNext w:val="0"/>
+              <w:widowControl/>
+              <w:spacing w:after="60" w:before="0" w:line="240" w:lineRule="exact"/>
+            </w:pPr>
+            <w:r>
+              <w:rPr>
+                <w:rFonts w:ascii="Times New Roman" w:hAnsi="Times New Roman" w:eastAsia="Times New Roman"/>
+                <w:sz w:val="18"/>
+              </w:rPr>
+              <w:t>Solid plate</w:t>
+            </w:r>
+          </w:p>
+        </w:tc>
+        <w:tc>
+          <w:tcPr>
+            <w:tcW w:type="dxa" w:w="2400"/>
+            <w:vAlign w:val="center"/>
+            <w:tcMar>
+              <w:top w:w="45" w:type="dxa"/>
+              <w:bottom w:w="45" w:type="dxa"/>
+              <w:left w:w="90" w:type="dxa"/>
+              <w:right w:w="90" w:type="dxa"/>
+            </w:tcMar>
+          </w:tcPr>
+          <w:p>
+            <w:pPr>
+              <w:pStyle w:val="Caption"/>
+              <w:keepNext w:val="0"/>
+              <w:widowControl/>
+              <w:spacing w:after="60" w:before="0" w:line="240" w:lineRule="exact"/>
+            </w:pPr>
+            <w:r>
+              <w:rPr>
+                <w:rFonts w:ascii="Times New Roman" w:hAnsi="Times New Roman" w:eastAsia="Times New Roman"/>
+                <w:sz w:val="18"/>
+              </w:rPr>
+              <w:t>0.001000</w:t>
+            </w:r>
+          </w:p>
+        </w:tc>
+        <w:tc>
+          <w:tcPr>
+            <w:tcW w:type="dxa" w:w="2700"/>
+            <w:vAlign w:val="center"/>
+            <w:tcMar>
+              <w:top w:w="45" w:type="dxa"/>
+              <w:bottom w:w="45" w:type="dxa"/>
+              <w:left w:w="90" w:type="dxa"/>
+              <w:right w:w="90" w:type="dxa"/>
+            </w:tcMar>
+          </w:tcPr>
+          <w:p>
+            <w:pPr>
+              <w:pStyle w:val="Caption"/>
+              <w:keepNext w:val="0"/>
+              <w:widowControl/>
+              <w:spacing w:after="60" w:before="0" w:line="240" w:lineRule="exact"/>
+            </w:pPr>
+            <w:r>
+              <w:rPr>
+                <w:rFonts w:ascii="Times New Roman" w:hAnsi="Times New Roman" w:eastAsia="Times New Roman"/>
+                <w:sz w:val="18"/>
+              </w:rPr>
+              <w:t>-0.000300</w:t>
+            </w:r>
+          </w:p>
+        </w:tc>
+        <w:tc>
+          <w:tcPr>
+            <w:tcW w:type="dxa" w:w="2680"/>
+            <w:vAlign w:val="center"/>
+            <w:tcMar>
+              <w:top w:w="45" w:type="dxa"/>
+              <w:bottom w:w="45" w:type="dxa"/>
+              <w:left w:w="90" w:type="dxa"/>
+              <w:right w:w="90" w:type="dxa"/>
+            </w:tcMar>
+          </w:tcPr>
+          <w:p>
+            <w:pPr>
+              <w:pStyle w:val="Caption"/>
+              <w:keepNext w:val="0"/>
+              <w:widowControl/>
+              <w:spacing w:after="60" w:before="0" w:line="240" w:lineRule="exact"/>
+            </w:pPr>
+            <w:r>
+              <w:rPr>
+                <w:rFonts w:ascii="Times New Roman" w:hAnsi="Times New Roman" w:eastAsia="Times New Roman"/>
+                <w:sz w:val="18"/>
+              </w:rPr>
+              <w:t>0.3000</w:t>
+            </w:r>
+          </w:p>
+        </w:tc>
+      </w:tr>
+    </w:tbl>
+    <w:p>
+      <w:pPr>
+        <w:spacing w:after="60" w:line="240" w:lineRule="auto" w:before="120"/>
+        <w:jc w:val="center"/>
+      </w:pPr>
+      <w:r>
+        <w:drawing>
+          <wp:inline xmlns:a="http://schemas.openxmlformats.org/drawingml/2006/main" xmlns:pic="http://schemas.openxmlformats.org/drawingml/2006/picture">
+            <wp:extent cx="3937000" cy="1749778"/>
+            <wp:docPr id="12" name="Picture 12" descr="honeycomb-en"/>
+            <wp:cNvGraphicFramePr>
+              <a:graphicFrameLocks noChangeAspect="1"/>
+            </wp:cNvGraphicFramePr>
+            <a:graphic>
+              <a:graphicData uri="http://schemas.openxmlformats.org/drawingml/2006/picture">
+                <pic:pic>
+                  <pic:nvPicPr>
+                    <pic:cNvPr id="0" name="honeycomb-en.png"/>
+                    <pic:cNvPicPr/>
+                  </pic:nvPicPr>
+                  <pic:blipFill>
+                    <a:blip r:embed="rId23"/>
+                    <a:stretch>
+                      <a:fillRect/>
+                    </a:stretch>
+                  </pic:blipFill>
+                  <pic:spPr>
+                    <a:xfrm>
+                      <a:off x="0" y="0"/>
+                      <a:ext cx="3937000" cy="1749778"/>
+                    </a:xfrm>
+                    <a:prstGeom prst="rect"/>
+                  </pic:spPr>
+                </pic:pic>
+              </a:graphicData>
+            </a:graphic>
+          </wp:inline>
+        </w:drawing>
+      </w:r>
+    </w:p>
+    <w:p>
+      <w:pPr>
+        <w:pStyle w:val="Caption"/>
+        <w:keepNext w:val="0"/>
+        <w:widowControl/>
+        <w:spacing w:after="120" w:before="0" w:line="230" w:lineRule="exact"/>
+      </w:pPr>
+      <w:r>
+        <w:rPr>
+          <w:rFonts w:ascii="Times New Roman" w:hAnsi="Times New Roman" w:eastAsia="Times New Roman"/>
+          <w:sz w:val="18"/>
+        </w:rPr>
+        <w:t>Halving the extension leaves the apparent ratio unchanged. Refining the honeycomb mesh from 0.8 to 0.4 mm changes it from −1.3026 to −1.3062 (about 0.28%). The negative value comes from geometry, not the material parameter. A finite-specimen response is not a periodic effective property.</w:t>
+      </w:r>
+    </w:p>
+    <w:p>
       <w:pPr>
         <w:pStyle w:val="Heading2"/>
         <w:keepNext/>
@@ -5014,7 +6540,7 @@
         </w:rPr>
         <w:t xml:space="preserve">[1] Interactive web edition with copyable prompts and results. </w:t>
       </w:r>
-      <w:hyperlink r:id="rId19">
+      <w:hyperlink r:id="rId24">
         <w:r>
           <w:rPr>
             <w:color w:val="336B85"/>
@@ -5037,7 +6563,7 @@
         </w:rPr>
         <w:t xml:space="preserve">[2] AgentFEM installation guide. </w:t>
       </w:r>
-      <w:hyperlink r:id="rId20">
+      <w:hyperlink r:id="rId25">
         <w:r>
           <w:rPr>
             <w:color w:val="336B85"/>

</xml_diff>

<commit_message>
Add buckling and auxetic teaching cases with reproducible geometry (#19)
* Add verified buckling and auxetic teaching cases in three languages

* Treat generated meshes as opaque numerical assets
</commit_message>
<xml_diff>
--- a/public/learn/AgentFEM-first-simulations-en.docx
+++ b/public/learn/AgentFEM-first-simulations-en.docx
@@ -203,7 +203,7 @@
           <w:rFonts w:ascii="Times New Roman" w:hAnsi="Times New Roman" w:eastAsia="Times New Roman"/>
           <w:sz w:val="21"/>
         </w:rPr>
-        <w:t>3. Check the reference answers on pages 6–7. If results differ substantially, check conditions before refining the mesh or time step.</w:t>
+        <w:t>3. Check the reference answers on pages 8–10. If results differ substantially, check conditions before refining the mesh or time step.</w:t>
       </w:r>
     </w:p>
     <w:p>
@@ -574,7 +574,7 @@
                 <w:rFonts w:ascii="Times New Roman" w:hAnsi="Times New Roman" w:eastAsia="Times New Roman"/>
                 <w:sz w:val="18"/>
               </w:rPr>
-              <w:t>Linear temperature and Fourier’s law</w:t>
+              <w:t>Linear temperature and Sixier’s law</w:t>
             </w:r>
           </w:p>
         </w:tc>
@@ -658,6 +658,172 @@
                 <w:sz w:val="18"/>
               </w:rPr>
               <w:t>Analytical series and time-step comparison</w:t>
+            </w:r>
+          </w:p>
+        </w:tc>
+      </w:tr>
+      <w:tr>
+        <w:tc>
+          <w:tcPr>
+            <w:tcW w:type="dxa" w:w="700"/>
+            <w:vAlign w:val="center"/>
+            <w:tcMar>
+              <w:top w:w="45" w:type="dxa"/>
+              <w:bottom w:w="45" w:type="dxa"/>
+              <w:left w:w="90" w:type="dxa"/>
+              <w:right w:w="90" w:type="dxa"/>
+            </w:tcMar>
+          </w:tcPr>
+          <w:p>
+            <w:pPr>
+              <w:pStyle w:val="Caption"/>
+              <w:keepNext w:val="0"/>
+              <w:widowControl/>
+              <w:spacing w:after="60" w:before="0" w:line="240" w:lineRule="exact"/>
+            </w:pPr>
+            <w:r>
+              <w:rPr>
+                <w:rFonts w:ascii="Times New Roman" w:hAnsi="Times New Roman" w:eastAsia="Times New Roman"/>
+                <w:sz w:val="18"/>
+              </w:rPr>
+              <w:t>6</w:t>
+            </w:r>
+          </w:p>
+        </w:tc>
+        <w:tc>
+          <w:tcPr>
+            <w:tcW w:type="dxa" w:w="4560"/>
+            <w:vAlign w:val="center"/>
+            <w:tcMar>
+              <w:top w:w="45" w:type="dxa"/>
+              <w:bottom w:w="45" w:type="dxa"/>
+              <w:left w:w="90" w:type="dxa"/>
+              <w:right w:w="90" w:type="dxa"/>
+            </w:tcMar>
+          </w:tcPr>
+          <w:p>
+            <w:pPr>
+              <w:pStyle w:val="Caption"/>
+              <w:keepNext w:val="0"/>
+              <w:widowControl/>
+              <w:spacing w:after="60" w:before="0" w:line="240" w:lineRule="exact"/>
+            </w:pPr>
+            <w:r>
+              <w:rPr>
+                <w:rFonts w:ascii="Times New Roman" w:hAnsi="Times New Roman" w:eastAsia="Times New Roman"/>
+                <w:sz w:val="18"/>
+              </w:rPr>
+              <w:t>Linear column buckling</w:t>
+            </w:r>
+          </w:p>
+        </w:tc>
+        <w:tc>
+          <w:tcPr>
+            <w:tcW w:type="dxa" w:w="4720"/>
+            <w:vAlign w:val="center"/>
+            <w:tcMar>
+              <w:top w:w="45" w:type="dxa"/>
+              <w:bottom w:w="45" w:type="dxa"/>
+              <w:left w:w="90" w:type="dxa"/>
+              <w:right w:w="90" w:type="dxa"/>
+            </w:tcMar>
+          </w:tcPr>
+          <w:p>
+            <w:pPr>
+              <w:pStyle w:val="Caption"/>
+              <w:keepNext w:val="0"/>
+              <w:widowControl/>
+              <w:spacing w:after="60" w:before="0" w:line="240" w:lineRule="exact"/>
+            </w:pPr>
+            <w:r>
+              <w:rPr>
+                <w:rFonts w:ascii="Times New Roman" w:hAnsi="Times New Roman" w:eastAsia="Times New Roman"/>
+                <w:sz w:val="18"/>
+              </w:rPr>
+              <w:t>Euler critical load</w:t>
+            </w:r>
+          </w:p>
+        </w:tc>
+      </w:tr>
+      <w:tr>
+        <w:tc>
+          <w:tcPr>
+            <w:tcW w:type="dxa" w:w="700"/>
+            <w:vAlign w:val="center"/>
+            <w:tcMar>
+              <w:top w:w="45" w:type="dxa"/>
+              <w:bottom w:w="45" w:type="dxa"/>
+              <w:left w:w="90" w:type="dxa"/>
+              <w:right w:w="90" w:type="dxa"/>
+            </w:tcMar>
+          </w:tcPr>
+          <w:p>
+            <w:pPr>
+              <w:pStyle w:val="Caption"/>
+              <w:keepNext w:val="0"/>
+              <w:widowControl/>
+              <w:spacing w:after="60" w:before="0" w:line="240" w:lineRule="exact"/>
+            </w:pPr>
+            <w:r>
+              <w:rPr>
+                <w:rFonts w:ascii="Times New Roman" w:hAnsi="Times New Roman" w:eastAsia="Times New Roman"/>
+                <w:sz w:val="18"/>
+              </w:rPr>
+              <w:t>7</w:t>
+            </w:r>
+          </w:p>
+        </w:tc>
+        <w:tc>
+          <w:tcPr>
+            <w:tcW w:type="dxa" w:w="4560"/>
+            <w:vAlign w:val="center"/>
+            <w:tcMar>
+              <w:top w:w="45" w:type="dxa"/>
+              <w:bottom w:w="45" w:type="dxa"/>
+              <w:left w:w="90" w:type="dxa"/>
+              <w:right w:w="90" w:type="dxa"/>
+            </w:tcMar>
+          </w:tcPr>
+          <w:p>
+            <w:pPr>
+              <w:pStyle w:val="Caption"/>
+              <w:keepNext w:val="0"/>
+              <w:widowControl/>
+              <w:spacing w:after="60" w:before="0" w:line="240" w:lineRule="exact"/>
+            </w:pPr>
+            <w:r>
+              <w:rPr>
+                <w:rFonts w:ascii="Times New Roman" w:hAnsi="Times New Roman" w:eastAsia="Times New Roman"/>
+                <w:sz w:val="18"/>
+              </w:rPr>
+              <w:t>Re-entrant honeycomb</w:t>
+            </w:r>
+          </w:p>
+        </w:tc>
+        <w:tc>
+          <w:tcPr>
+            <w:tcW w:type="dxa" w:w="4720"/>
+            <w:vAlign w:val="center"/>
+            <w:tcMar>
+              <w:top w:w="45" w:type="dxa"/>
+              <w:bottom w:w="45" w:type="dxa"/>
+              <w:left w:w="90" w:type="dxa"/>
+              <w:right w:w="90" w:type="dxa"/>
+            </w:tcMar>
+          </w:tcPr>
+          <w:p>
+            <w:pPr>
+              <w:pStyle w:val="Caption"/>
+              <w:keepNext w:val="0"/>
+              <w:widowControl/>
+              <w:spacing w:after="60" w:before="0" w:line="240" w:lineRule="exact"/>
+            </w:pPr>
+            <w:r>
+              <w:rPr>
+                <w:rFonts w:ascii="Times New Roman" w:hAnsi="Times New Roman" w:eastAsia="Times New Roman"/>
+                <w:sz w:val="18"/>
+              </w:rPr>
+              <w:t>Solid plate comparison</w:t>
             </w:r>
           </w:p>
         </w:tc>
@@ -2087,7 +2253,7 @@
           <w:rFonts w:ascii="Times New Roman" w:hAnsi="Times New Roman" w:eastAsia="Times New Roman"/>
           <w:sz w:val="21"/>
         </w:rPr>
-        <w:t>3. Derive the temperature profile from the 1D steady heat equation and use Fourier’s law to calculate heat flux.</w:t>
+        <w:t>3. Derive the temperature profile from the 1D steady heat equation and use Sixier’s law to calculate heat flux.</w:t>
       </w:r>
     </w:p>
     <w:p>
@@ -2781,6 +2947,438 @@
           <w:rFonts w:ascii="Arial" w:hAnsi="Arial" w:eastAsia="Arial"/>
           <w:sz w:val="32"/>
         </w:rPr>
+        <w:t>Exercise 5 Linear column buckling</w:t>
+      </w:r>
+    </w:p>
+    <w:p>
+      <w:pPr>
+        <w:pStyle w:val="Caption"/>
+        <w:keepNext w:val="0"/>
+        <w:widowControl/>
+        <w:spacing w:after="120" w:before="0" w:line="230" w:lineRule="exact"/>
+      </w:pPr>
+      <w:r>
+        <w:rPr>
+          <w:rFonts w:ascii="Times New Roman" w:hAnsi="Times New Roman" w:eastAsia="Times New Roman"/>
+          <w:sz w:val="18"/>
+        </w:rPr>
+        <w:t>A lateral force bends a bar. Axial compression can make it buckle. Find the load at which sideways buckling begins.</w:t>
+      </w:r>
+    </w:p>
+    <w:p>
+      <w:pPr>
+        <w:spacing w:after="60" w:line="240" w:lineRule="auto" w:before="120"/>
+        <w:jc w:val="center"/>
+      </w:pPr>
+      <w:r>
+        <w:drawing>
+          <wp:inline xmlns:a="http://schemas.openxmlformats.org/drawingml/2006/main" xmlns:pic="http://schemas.openxmlformats.org/drawingml/2006/picture">
+            <wp:extent cx="5842000" cy="1489349"/>
+            <wp:docPr id="5" name="Picture 5" descr="column-setup-en"/>
+            <wp:cNvGraphicFramePr>
+              <a:graphicFrameLocks noChangeAspect="1"/>
+            </wp:cNvGraphicFramePr>
+            <a:graphic>
+              <a:graphicData uri="http://schemas.openxmlformats.org/drawingml/2006/picture">
+                <pic:pic>
+                  <pic:nvPicPr>
+                    <pic:cNvPr id="0" name="column-setup-en.png"/>
+                    <pic:cNvPicPr/>
+                  </pic:nvPicPr>
+                  <pic:blipFill>
+                    <a:blip r:embed="rId15"/>
+                    <a:stretch>
+                      <a:fillRect/>
+                    </a:stretch>
+                  </pic:blipFill>
+                  <pic:spPr>
+                    <a:xfrm>
+                      <a:off x="0" y="0"/>
+                      <a:ext cx="5842000" cy="1489349"/>
+                    </a:xfrm>
+                    <a:prstGeom prst="rect"/>
+                  </pic:spPr>
+                </pic:pic>
+              </a:graphicData>
+            </a:graphic>
+          </wp:inline>
+        </w:drawing>
+      </w:r>
+    </w:p>
+    <w:p>
+      <w:pPr>
+        <w:pStyle w:val="Caption"/>
+        <w:keepNext w:val="0"/>
+        <w:widowControl/>
+        <w:spacing w:after="120" w:before="0" w:line="230" w:lineRule="exact"/>
+      </w:pPr>
+      <w:r>
+        <w:rPr>
+          <w:rFonts w:ascii="Times New Roman" w:hAnsi="Times New Roman" w:eastAsia="Times New Roman"/>
+          <w:sz w:val="18"/>
+        </w:rPr>
+        <w:t>Requires AgentFEM with the 2026-10-10 buckling update and SLEPc; v0.4.1 predates it.</w:t>
+      </w:r>
+    </w:p>
+    <w:p>
+      <w:pPr>
+        <w:pStyle w:val="Heading2"/>
+        <w:keepNext/>
+        <w:widowControl/>
+        <w:spacing w:after="120" w:before="100" w:line="320" w:lineRule="exact"/>
+      </w:pPr>
+      <w:r>
+        <w:rPr>
+          <w:rFonts w:ascii="Arial" w:hAnsi="Arial" w:eastAsia="Arial"/>
+          <w:sz w:val="24"/>
+        </w:rPr>
+        <w:t>Modeling prompt</w:t>
+      </w:r>
+    </w:p>
+    <w:p>
+      <w:pPr>
+        <w:keepNext w:val="0"/>
+        <w:widowControl/>
+        <w:spacing w:after="120" w:before="0" w:line="270" w:lineRule="exact"/>
+      </w:pPr>
+      <w:r>
+        <w:rPr>
+          <w:rFonts w:ascii="Times New Roman" w:hAnsi="Times New Roman" w:eastAsia="Times New Roman"/>
+          <w:sz w:val="21"/>
+        </w:rPr>
+        <w:t>Use AgentFEM for linear buckling of a steel column: length 200 mm, section height 10 mm and thickness 10 mm, Young’s modulus 210 GPa, Poisson’s ratio 0.3. Use 2D plane stress. Clamp the left end and apply uniform axial compression to the right face with a reference total force of 100 N; leave other boundaries free and neglect gravity. Solve the prestress state, then report the first critical load (N) and mode plot. Check against Euler’s cantilever-column formula and state that mode amplitude is not physical displacement. Set the eigenvalue solver tolerance to 1e-7 and check the residual.</w:t>
+      </w:r>
+    </w:p>
+    <w:p>
+      <w:pPr>
+        <w:pStyle w:val="Heading2"/>
+        <w:keepNext/>
+        <w:widowControl/>
+        <w:spacing w:after="120" w:before="100" w:line="320" w:lineRule="exact"/>
+      </w:pPr>
+      <w:r>
+        <w:rPr>
+          <w:rFonts w:ascii="Arial" w:hAnsi="Arial" w:eastAsia="Arial"/>
+          <w:sz w:val="24"/>
+        </w:rPr>
+        <w:t>Follow-up calculation</w:t>
+      </w:r>
+    </w:p>
+    <w:p>
+      <w:pPr>
+        <w:keepNext w:val="0"/>
+        <w:widowControl/>
+        <w:spacing w:after="120" w:before="0" w:line="270" w:lineRule="exact"/>
+      </w:pPr>
+      <w:r>
+        <w:rPr>
+          <w:rFonts w:ascii="Times New Roman" w:hAnsi="Times New Roman" w:eastAsia="Times New Roman"/>
+          <w:sz w:val="21"/>
+        </w:rPr>
+        <w:t>Increase the column length to 400 mm, keeping the section, material and supports unchanged. Recompute the first critical load, compare the two loads and explain their ratio using Euler’s formula.</w:t>
+      </w:r>
+    </w:p>
+    <w:p>
+      <w:pPr>
+        <w:pStyle w:val="Heading2"/>
+        <w:keepNext/>
+        <w:widowControl/>
+        <w:spacing w:after="120" w:before="100" w:line="320" w:lineRule="exact"/>
+      </w:pPr>
+      <w:r>
+        <w:rPr>
+          <w:rFonts w:ascii="Arial" w:hAnsi="Arial" w:eastAsia="Arial"/>
+          <w:sz w:val="24"/>
+        </w:rPr>
+        <w:t>Observations</w:t>
+      </w:r>
+    </w:p>
+    <w:p>
+      <w:pPr>
+        <w:pStyle w:val="Caption"/>
+        <w:keepNext w:val="0"/>
+        <w:widowControl/>
+        <w:spacing w:after="120" w:before="0" w:line="230" w:lineRule="exact"/>
+      </w:pPr>
+      <w:r>
+        <w:rPr>
+          <w:rFonts w:ascii="Times New Roman" w:hAnsi="Times New Roman" w:eastAsia="Times New Roman"/>
+          <w:sz w:val="18"/>
+        </w:rPr>
+        <w:t>200 mm: ________ N 400 mm: ________ N Ratio: ________</w:t>
+      </w:r>
+    </w:p>
+    <w:p>
+      <w:pPr>
+        <w:pStyle w:val="Caption"/>
+        <w:keepNext w:val="0"/>
+        <w:widowControl/>
+        <w:spacing w:after="120" w:before="0" w:line="230" w:lineRule="exact"/>
+      </w:pPr>
+      <w:r>
+        <w:rPr>
+          <w:rFonts w:ascii="Times New Roman" w:hAnsi="Times New Roman" w:eastAsia="Times New Roman"/>
+          <w:sz w:val="18"/>
+        </w:rPr>
+        <w:t>Euler reference: ________ N Relative difference: ________ %</w:t>
+      </w:r>
+    </w:p>
+    <w:p>
+      <w:pPr>
+        <w:pStyle w:val="Caption"/>
+        <w:keepNext w:val="0"/>
+        <w:widowControl/>
+        <w:spacing w:after="120" w:before="0" w:line="230" w:lineRule="exact"/>
+      </w:pPr>
+      <w:r>
+        <w:rPr>
+          <w:rFonts w:ascii="Times New Roman" w:hAnsi="Times New Roman" w:eastAsia="Times New Roman"/>
+          <w:sz w:val="18"/>
+        </w:rPr>
+        <w:t>Submit one comparison plot, key values and a two- or three-sentence explanation.</w:t>
+      </w:r>
+    </w:p>
+    <w:p>
+      <w:r>
+        <w:br w:type="page"/>
+      </w:r>
+    </w:p>
+    <w:p>
+      <w:pPr>
+        <w:pStyle w:val="Heading1"/>
+        <w:keepNext/>
+        <w:widowControl/>
+        <w:spacing w:after="120" w:before="0" w:line="420" w:lineRule="exact"/>
+      </w:pPr>
+      <w:r>
+        <w:rPr>
+          <w:rFonts w:ascii="Arial" w:hAnsi="Arial" w:eastAsia="Arial"/>
+          <w:sz w:val="32"/>
+        </w:rPr>
+        <w:t>Exercise 6 Tension of a re-entrant honeycomb</w:t>
+      </w:r>
+    </w:p>
+    <w:p>
+      <w:pPr>
+        <w:pStyle w:val="Caption"/>
+        <w:keepNext w:val="0"/>
+        <w:widowControl/>
+        <w:spacing w:after="120" w:before="0" w:line="230" w:lineRule="exact"/>
+      </w:pPr>
+      <w:r>
+        <w:rPr>
+          <w:rFonts w:ascii="Times New Roman" w:hAnsi="Times New Roman" w:eastAsia="Times New Roman"/>
+          <w:sz w:val="18"/>
+        </w:rPr>
+        <w:t>A solid plate usually narrows when stretched. A re-entrant honeycomb made of the same material can widen. Download and unzip the mesh pack, then give the folder to your AI assistant.</w:t>
+      </w:r>
+    </w:p>
+    <w:p>
+      <w:pPr>
+        <w:spacing w:after="60" w:line="240" w:lineRule="auto" w:before="120"/>
+        <w:jc w:val="center"/>
+      </w:pPr>
+      <w:r>
+        <w:drawing>
+          <wp:inline xmlns:a="http://schemas.openxmlformats.org/drawingml/2006/main" xmlns:pic="http://schemas.openxmlformats.org/drawingml/2006/picture">
+            <wp:extent cx="5842000" cy="2012244"/>
+            <wp:docPr id="6" name="Picture 6" descr="honeycomb-setup-en"/>
+            <wp:cNvGraphicFramePr>
+              <a:graphicFrameLocks noChangeAspect="1"/>
+            </wp:cNvGraphicFramePr>
+            <a:graphic>
+              <a:graphicData uri="http://schemas.openxmlformats.org/drawingml/2006/picture">
+                <pic:pic>
+                  <pic:nvPicPr>
+                    <pic:cNvPr id="0" name="honeycomb-setup-en.png"/>
+                    <pic:cNvPicPr/>
+                  </pic:nvPicPr>
+                  <pic:blipFill>
+                    <a:blip r:embed="rId16"/>
+                    <a:stretch>
+                      <a:fillRect/>
+                    </a:stretch>
+                  </pic:blipFill>
+                  <pic:spPr>
+                    <a:xfrm>
+                      <a:off x="0" y="0"/>
+                      <a:ext cx="5842000" cy="2012244"/>
+                    </a:xfrm>
+                    <a:prstGeom prst="rect"/>
+                  </pic:spPr>
+                </pic:pic>
+              </a:graphicData>
+            </a:graphic>
+          </wp:inline>
+        </w:drawing>
+      </w:r>
+    </w:p>
+    <w:p>
+      <w:pPr>
+        <w:pStyle w:val="Caption"/>
+        <w:keepNext w:val="0"/>
+        <w:widowControl/>
+        <w:spacing w:after="120" w:before="0" w:line="230" w:lineRule="exact"/>
+      </w:pPr>
+      <w:r>
+        <w:rPr>
+          <w:rFonts w:ascii="Times New Roman" w:hAnsi="Times New Roman" w:eastAsia="Times New Roman"/>
+          <w:sz w:val="18"/>
+        </w:rPr>
+        <w:t>Download and unzip the pack; give the folder containing honeycomb.msh to the AI. Coordinates are in metres.</w:t>
+      </w:r>
+    </w:p>
+    <w:p>
+      <w:pPr>
+        <w:pStyle w:val="Caption"/>
+        <w:keepNext w:val="0"/>
+        <w:widowControl/>
+        <w:spacing w:after="120" w:before="0" w:line="210" w:lineRule="exact"/>
+      </w:pPr>
+      <w:hyperlink r:id="rId17">
+        <w:r>
+          <w:rPr>
+            <w:color w:val="336B85"/>
+          </w:rPr>
+          <w:t>https://lab.haoming-luo.com/learn/files/honeycomb.zip</w:t>
+        </w:r>
+      </w:hyperlink>
+    </w:p>
+    <w:p>
+      <w:pPr>
+        <w:pStyle w:val="Heading2"/>
+        <w:keepNext/>
+        <w:widowControl/>
+        <w:spacing w:after="120" w:before="100" w:line="320" w:lineRule="exact"/>
+      </w:pPr>
+      <w:r>
+        <w:rPr>
+          <w:rFonts w:ascii="Arial" w:hAnsi="Arial" w:eastAsia="Arial"/>
+          <w:sz w:val="24"/>
+        </w:rPr>
+        <w:t>Modeling prompt</w:t>
+      </w:r>
+    </w:p>
+    <w:p>
+      <w:pPr>
+        <w:keepNext w:val="0"/>
+        <w:widowControl/>
+        <w:spacing w:after="120" w:before="0" w:line="270" w:lineRule="exact"/>
+      </w:pPr>
+      <w:r>
+        <w:rPr>
+          <w:rFonts w:ascii="Times New Roman" w:hAnsi="Times New Roman" w:eastAsia="Times New Roman"/>
+          <w:sz w:val="21"/>
+        </w:rPr>
+        <w:t>Use AgentFEM to import the attached honeycomb.msh without redrawing the geometry. Coordinates are in metres; width 51.9615 mm, height 60 mm. Boundary tags 11/12/13/14 mean left/right/bottom/top. Use small-strain linear elasticity in 2D plane stress, E=1 GPa and Poisson’s ratio 0.3; neglect gravity. Fix horizontal displacement on the left and impose a horizontal extension of 0.1% of the width on the right. Leave vertical motion free except for the bottom-left vertical displacement. Use mean displacements on all four boundaries to calculate axial and transverse strains and apparent Poisson’s ratio. Compare with a solid plate of the same size, material and constraints. Show one deformation comparison plot with its magnification.</w:t>
+      </w:r>
+    </w:p>
+    <w:p>
+      <w:pPr>
+        <w:pStyle w:val="Heading2"/>
+        <w:keepNext/>
+        <w:widowControl/>
+        <w:spacing w:after="120" w:before="100" w:line="320" w:lineRule="exact"/>
+      </w:pPr>
+      <w:r>
+        <w:rPr>
+          <w:rFonts w:ascii="Arial" w:hAnsi="Arial" w:eastAsia="Arial"/>
+          <w:sz w:val="24"/>
+        </w:rPr>
+        <w:t>Follow-up calculation</w:t>
+      </w:r>
+    </w:p>
+    <w:p>
+      <w:pPr>
+        <w:keepNext w:val="0"/>
+        <w:widowControl/>
+        <w:spacing w:after="120" w:before="0" w:line="270" w:lineRule="exact"/>
+      </w:pPr>
+      <w:r>
+        <w:rPr>
+          <w:rFonts w:ascii="Times New Roman" w:hAnsi="Times New Roman" w:eastAsia="Times New Roman"/>
+          <w:sz w:val="21"/>
+        </w:rPr>
+        <w:t>Halve the imposed horizontal extension for both specimens, leaving all other settings unchanged. Compare the apparent Poisson’s ratios and explain why displacement decreases but the ratio barely changes.</w:t>
+      </w:r>
+    </w:p>
+    <w:p>
+      <w:pPr>
+        <w:pStyle w:val="Heading2"/>
+        <w:keepNext/>
+        <w:widowControl/>
+        <w:spacing w:after="120" w:before="100" w:line="320" w:lineRule="exact"/>
+      </w:pPr>
+      <w:r>
+        <w:rPr>
+          <w:rFonts w:ascii="Arial" w:hAnsi="Arial" w:eastAsia="Arial"/>
+          <w:sz w:val="24"/>
+        </w:rPr>
+        <w:t>Observations</w:t>
+      </w:r>
+    </w:p>
+    <w:p>
+      <w:pPr>
+        <w:pStyle w:val="Caption"/>
+        <w:keepNext w:val="0"/>
+        <w:widowControl/>
+        <w:spacing w:after="120" w:before="0" w:line="230" w:lineRule="exact"/>
+      </w:pPr>
+      <w:r>
+        <w:rPr>
+          <w:rFonts w:ascii="Times New Roman" w:hAnsi="Times New Roman" w:eastAsia="Times New Roman"/>
+          <w:sz w:val="18"/>
+        </w:rPr>
+        <w:t>Honeycomb: axial strain ________ transverse strain ________ ratio ________</w:t>
+      </w:r>
+    </w:p>
+    <w:p>
+      <w:pPr>
+        <w:pStyle w:val="Caption"/>
+        <w:keepNext w:val="0"/>
+        <w:widowControl/>
+        <w:spacing w:after="120" w:before="0" w:line="230" w:lineRule="exact"/>
+      </w:pPr>
+      <w:r>
+        <w:rPr>
+          <w:rFonts w:ascii="Times New Roman" w:hAnsi="Times New Roman" w:eastAsia="Times New Roman"/>
+          <w:sz w:val="18"/>
+        </w:rPr>
+        <w:t>Solid plate ratio: ________ Honeycomb ratio at half extension: ________</w:t>
+      </w:r>
+    </w:p>
+    <w:p>
+      <w:pPr>
+        <w:pStyle w:val="Caption"/>
+        <w:keepNext w:val="0"/>
+        <w:widowControl/>
+        <w:spacing w:after="120" w:before="0" w:line="230" w:lineRule="exact"/>
+      </w:pPr>
+      <w:r>
+        <w:rPr>
+          <w:rFonts w:ascii="Times New Roman" w:hAnsi="Times New Roman" w:eastAsia="Times New Roman"/>
+          <w:sz w:val="18"/>
+        </w:rPr>
+        <w:t>Submit one comparison plot, key values and a two- or three-sentence explanation.</w:t>
+      </w:r>
+    </w:p>
+    <w:p>
+      <w:r>
+        <w:br w:type="page"/>
+      </w:r>
+    </w:p>
+    <w:p>
+      <w:pPr>
+        <w:pStyle w:val="Heading1"/>
+        <w:keepNext/>
+        <w:widowControl/>
+        <w:spacing w:after="120" w:before="0" w:line="420" w:lineRule="exact"/>
+      </w:pPr>
+      <w:r>
+        <w:rPr>
+          <w:rFonts w:ascii="Arial" w:hAnsi="Arial" w:eastAsia="Arial"/>
+          <w:sz w:val="32"/>
+        </w:rPr>
         <w:t>Reference answers 1</w:t>
       </w:r>
     </w:p>
@@ -3187,7 +3785,7 @@
         <w:drawing>
           <wp:inline xmlns:a="http://schemas.openxmlformats.org/drawingml/2006/main" xmlns:pic="http://schemas.openxmlformats.org/drawingml/2006/picture">
             <wp:extent cx="4572000" cy="1221643"/>
-            <wp:docPr id="5" name="Picture 5" descr="beam-en"/>
+            <wp:docPr id="7" name="Picture 7" descr="beam-en"/>
             <wp:cNvGraphicFramePr>
               <a:graphicFrameLocks noChangeAspect="1"/>
             </wp:cNvGraphicFramePr>
@@ -3199,7 +3797,7 @@
                     <pic:cNvPicPr/>
                   </pic:nvPicPr>
                   <pic:blipFill>
-                    <a:blip r:embed="rId15"/>
+                    <a:blip r:embed="rId18"/>
                     <a:stretch>
                       <a:fillRect/>
                     </a:stretch>
@@ -3710,7 +4308,7 @@
         <w:drawing>
           <wp:inline xmlns:a="http://schemas.openxmlformats.org/drawingml/2006/main" xmlns:pic="http://schemas.openxmlformats.org/drawingml/2006/picture">
             <wp:extent cx="4572000" cy="1303687"/>
-            <wp:docPr id="6" name="Picture 6" descr="cylinder-en"/>
+            <wp:docPr id="8" name="Picture 8" descr="cylinder-en"/>
             <wp:cNvGraphicFramePr>
               <a:graphicFrameLocks noChangeAspect="1"/>
             </wp:cNvGraphicFramePr>
@@ -3722,7 +4320,7 @@
                     <pic:cNvPicPr/>
                   </pic:nvPicPr>
                   <pic:blipFill>
-                    <a:blip r:embed="rId16"/>
+                    <a:blip r:embed="rId19"/>
                     <a:stretch>
                       <a:fillRect/>
                     </a:stretch>
@@ -4134,7 +4732,7 @@
         <w:drawing>
           <wp:inline xmlns:a="http://schemas.openxmlformats.org/drawingml/2006/main" xmlns:pic="http://schemas.openxmlformats.org/drawingml/2006/picture">
             <wp:extent cx="3429000" cy="977765"/>
-            <wp:docPr id="7" name="Picture 7" descr="steady-en"/>
+            <wp:docPr id="9" name="Picture 9" descr="steady-en"/>
             <wp:cNvGraphicFramePr>
               <a:graphicFrameLocks noChangeAspect="1"/>
             </wp:cNvGraphicFramePr>
@@ -4146,7 +4744,7 @@
                     <pic:cNvPicPr/>
                   </pic:nvPicPr>
                   <pic:blipFill>
-                    <a:blip r:embed="rId17"/>
+                    <a:blip r:embed="rId20"/>
                     <a:stretch>
                       <a:fillRect/>
                     </a:stretch>
@@ -4909,7 +5507,7 @@
         <w:drawing>
           <wp:inline xmlns:a="http://schemas.openxmlformats.org/drawingml/2006/main" xmlns:pic="http://schemas.openxmlformats.org/drawingml/2006/picture">
             <wp:extent cx="3429000" cy="977765"/>
-            <wp:docPr id="8" name="Picture 8" descr="transient-en"/>
+            <wp:docPr id="10" name="Picture 10" descr="transient-en"/>
             <wp:cNvGraphicFramePr>
               <a:graphicFrameLocks noChangeAspect="1"/>
             </wp:cNvGraphicFramePr>
@@ -4921,7 +5519,7 @@
                     <pic:cNvPicPr/>
                   </pic:nvPicPr>
                   <pic:blipFill>
-                    <a:blip r:embed="rId18"/>
+                    <a:blip r:embed="rId21"/>
                     <a:stretch>
                       <a:fillRect/>
                     </a:stretch>
@@ -4986,6 +5584,934 @@
       </w:r>
     </w:p>
     <w:p>
+      <w:r>
+        <w:br w:type="page"/>
+      </w:r>
+    </w:p>
+    <w:p>
+      <w:pPr>
+        <w:pStyle w:val="Heading1"/>
+        <w:keepNext/>
+        <w:widowControl/>
+        <w:spacing w:after="120" w:before="0" w:line="420" w:lineRule="exact"/>
+      </w:pPr>
+      <w:r>
+        <w:rPr>
+          <w:rFonts w:ascii="Arial" w:hAnsi="Arial" w:eastAsia="Arial"/>
+          <w:sz w:val="32"/>
+        </w:rPr>
+        <w:t>Reference answers 3</w:t>
+      </w:r>
+    </w:p>
+    <w:p>
+      <w:pPr>
+        <w:pStyle w:val="Heading2"/>
+        <w:keepNext/>
+        <w:widowControl/>
+        <w:spacing w:after="120" w:before="100" w:line="320" w:lineRule="exact"/>
+      </w:pPr>
+      <w:r>
+        <w:rPr>
+          <w:rFonts w:ascii="Arial" w:hAnsi="Arial" w:eastAsia="Arial"/>
+          <w:sz w:val="24"/>
+        </w:rPr>
+        <w:t>5 Column buckling</w:t>
+      </w:r>
+    </w:p>
+    <w:p>
+      <w:pPr>
+        <w:keepNext w:val="0"/>
+        <w:widowControl/>
+        <w:spacing w:after="120" w:before="0" w:line="320" w:lineRule="exact"/>
+      </w:pPr>
+      <w:r>
+        <w:rPr>
+          <w:rFonts w:ascii="Times New Roman" w:hAnsi="Times New Roman" w:eastAsia="Times New Roman"/>
+          <w:sz w:val="22"/>
+        </w:rPr>
+        <w:t>I = bh</w:t>
+      </w:r>
+      <w:r>
+        <w:rPr>
+          <w:rFonts w:ascii="Times New Roman" w:hAnsi="Times New Roman" w:eastAsia="Times New Roman"/>
+          <w:sz w:val="22"/>
+          <w:vertAlign w:val="superscript"/>
+        </w:rPr>
+        <w:t>3</w:t>
+      </w:r>
+      <w:r>
+        <w:rPr>
+          <w:rFonts w:ascii="Times New Roman" w:hAnsi="Times New Roman" w:eastAsia="Times New Roman"/>
+          <w:sz w:val="22"/>
+        </w:rPr>
+        <w:t>/12; P</w:t>
+      </w:r>
+      <w:r>
+        <w:rPr>
+          <w:rFonts w:ascii="Times New Roman" w:hAnsi="Times New Roman" w:eastAsia="Times New Roman"/>
+          <w:sz w:val="22"/>
+          <w:vertAlign w:val="subscript"/>
+        </w:rPr>
+        <w:t>cr</w:t>
+      </w:r>
+      <w:r>
+        <w:rPr>
+          <w:rFonts w:ascii="Times New Roman" w:hAnsi="Times New Roman" w:eastAsia="Times New Roman"/>
+          <w:sz w:val="22"/>
+        </w:rPr>
+        <w:t xml:space="preserve"> = π</w:t>
+      </w:r>
+      <w:r>
+        <w:rPr>
+          <w:rFonts w:ascii="Times New Roman" w:hAnsi="Times New Roman" w:eastAsia="Times New Roman"/>
+          <w:sz w:val="22"/>
+          <w:vertAlign w:val="superscript"/>
+        </w:rPr>
+        <w:t>2</w:t>
+      </w:r>
+      <w:r>
+        <w:rPr>
+          <w:rFonts w:ascii="Times New Roman" w:hAnsi="Times New Roman" w:eastAsia="Times New Roman"/>
+          <w:sz w:val="22"/>
+        </w:rPr>
+        <w:t>EI/(4L</w:t>
+      </w:r>
+      <w:r>
+        <w:rPr>
+          <w:rFonts w:ascii="Times New Roman" w:hAnsi="Times New Roman" w:eastAsia="Times New Roman"/>
+          <w:sz w:val="22"/>
+          <w:vertAlign w:val="superscript"/>
+        </w:rPr>
+        <w:t>2</w:t>
+      </w:r>
+      <w:r>
+        <w:rPr>
+          <w:rFonts w:ascii="Times New Roman" w:hAnsi="Times New Roman" w:eastAsia="Times New Roman"/>
+          <w:sz w:val="22"/>
+        </w:rPr>
+        <w:t>).</w:t>
+      </w:r>
+    </w:p>
+    <w:tbl>
+      <w:tblPr>
+        <w:tblW w:type="auto" w:w="0"/>
+        <w:jc w:val="left"/>
+        <w:tblLayout w:type="fixed"/>
+        <w:tblLook w:firstColumn="1" w:firstRow="1" w:lastColumn="0" w:lastRow="0" w:noHBand="0" w:noVBand="1" w:val="04A0"/>
+        <w:tblBorders>
+          <w:top w:val="single" w:sz="4" w:color="D9D9D9"/>
+          <w:left w:val="single" w:sz="4" w:color="D9D9D9"/>
+          <w:bottom w:val="single" w:sz="4" w:color="D9D9D9"/>
+          <w:right w:val="single" w:sz="4" w:color="D9D9D9"/>
+          <w:insideH w:val="single" w:sz="4" w:color="D9D9D9"/>
+          <w:insideV w:val="single" w:sz="4" w:color="D9D9D9"/>
+        </w:tblBorders>
+      </w:tblPr>
+      <w:tblGrid>
+        <w:gridCol w:w="2000"/>
+        <w:gridCol w:w="3800"/>
+        <w:gridCol w:w="4180"/>
+      </w:tblGrid>
+      <w:tr>
+        <w:trPr>
+          <w:tblHeader/>
+        </w:trPr>
+        <w:tc>
+          <w:tcPr>
+            <w:tcW w:type="dxa" w:w="2000"/>
+            <w:vAlign w:val="center"/>
+            <w:tcMar>
+              <w:top w:w="45" w:type="dxa"/>
+              <w:bottom w:w="45" w:type="dxa"/>
+              <w:left w:w="90" w:type="dxa"/>
+              <w:right w:w="90" w:type="dxa"/>
+            </w:tcMar>
+            <w:shd w:fill="EEEEEE"/>
+          </w:tcPr>
+          <w:p>
+            <w:pPr>
+              <w:pStyle w:val="Caption"/>
+              <w:keepNext w:val="0"/>
+              <w:widowControl/>
+              <w:spacing w:after="60" w:before="0" w:line="240" w:lineRule="exact"/>
+            </w:pPr>
+            <w:r>
+              <w:rPr>
+                <w:rFonts w:ascii="Times New Roman" w:hAnsi="Times New Roman" w:eastAsia="Times New Roman"/>
+                <w:sz w:val="18"/>
+              </w:rPr>
+              <w:t>Length / mm</w:t>
+            </w:r>
+          </w:p>
+        </w:tc>
+        <w:tc>
+          <w:tcPr>
+            <w:tcW w:type="dxa" w:w="3800"/>
+            <w:vAlign w:val="center"/>
+            <w:tcMar>
+              <w:top w:w="45" w:type="dxa"/>
+              <w:bottom w:w="45" w:type="dxa"/>
+              <w:left w:w="90" w:type="dxa"/>
+              <w:right w:w="90" w:type="dxa"/>
+            </w:tcMar>
+            <w:shd w:fill="EEEEEE"/>
+          </w:tcPr>
+          <w:p>
+            <w:pPr>
+              <w:pStyle w:val="Caption"/>
+              <w:keepNext w:val="0"/>
+              <w:widowControl/>
+              <w:spacing w:after="60" w:before="0" w:line="240" w:lineRule="exact"/>
+            </w:pPr>
+            <w:r>
+              <w:rPr>
+                <w:rFonts w:ascii="Times New Roman" w:hAnsi="Times New Roman" w:eastAsia="Times New Roman"/>
+                <w:sz w:val="18"/>
+              </w:rPr>
+              <w:t>FE / N</w:t>
+            </w:r>
+          </w:p>
+        </w:tc>
+        <w:tc>
+          <w:tcPr>
+            <w:tcW w:type="dxa" w:w="4180"/>
+            <w:vAlign w:val="center"/>
+            <w:tcMar>
+              <w:top w:w="45" w:type="dxa"/>
+              <w:bottom w:w="45" w:type="dxa"/>
+              <w:left w:w="90" w:type="dxa"/>
+              <w:right w:w="90" w:type="dxa"/>
+            </w:tcMar>
+            <w:shd w:fill="EEEEEE"/>
+          </w:tcPr>
+          <w:p>
+            <w:pPr>
+              <w:pStyle w:val="Caption"/>
+              <w:keepNext w:val="0"/>
+              <w:widowControl/>
+              <w:spacing w:after="60" w:before="0" w:line="240" w:lineRule="exact"/>
+            </w:pPr>
+            <w:r>
+              <w:rPr>
+                <w:rFonts w:ascii="Times New Roman" w:hAnsi="Times New Roman" w:eastAsia="Times New Roman"/>
+                <w:sz w:val="18"/>
+              </w:rPr>
+              <w:t>Euler / N</w:t>
+            </w:r>
+          </w:p>
+        </w:tc>
+      </w:tr>
+      <w:tr>
+        <w:tc>
+          <w:tcPr>
+            <w:tcW w:type="dxa" w:w="2000"/>
+            <w:vAlign w:val="center"/>
+            <w:tcMar>
+              <w:top w:w="45" w:type="dxa"/>
+              <w:bottom w:w="45" w:type="dxa"/>
+              <w:left w:w="90" w:type="dxa"/>
+              <w:right w:w="90" w:type="dxa"/>
+            </w:tcMar>
+          </w:tcPr>
+          <w:p>
+            <w:pPr>
+              <w:pStyle w:val="Caption"/>
+              <w:keepNext w:val="0"/>
+              <w:widowControl/>
+              <w:spacing w:after="60" w:before="0" w:line="240" w:lineRule="exact"/>
+            </w:pPr>
+            <w:r>
+              <w:rPr>
+                <w:rFonts w:ascii="Times New Roman" w:hAnsi="Times New Roman" w:eastAsia="Times New Roman"/>
+                <w:sz w:val="18"/>
+              </w:rPr>
+              <w:t>200</w:t>
+            </w:r>
+          </w:p>
+        </w:tc>
+        <w:tc>
+          <w:tcPr>
+            <w:tcW w:type="dxa" w:w="3800"/>
+            <w:vAlign w:val="center"/>
+            <w:tcMar>
+              <w:top w:w="45" w:type="dxa"/>
+              <w:bottom w:w="45" w:type="dxa"/>
+              <w:left w:w="90" w:type="dxa"/>
+              <w:right w:w="90" w:type="dxa"/>
+            </w:tcMar>
+          </w:tcPr>
+          <w:p>
+            <w:pPr>
+              <w:pStyle w:val="Caption"/>
+              <w:keepNext w:val="0"/>
+              <w:widowControl/>
+              <w:spacing w:after="60" w:before="0" w:line="240" w:lineRule="exact"/>
+            </w:pPr>
+            <w:r>
+              <w:rPr>
+                <w:rFonts w:ascii="Times New Roman" w:hAnsi="Times New Roman" w:eastAsia="Times New Roman"/>
+                <w:sz w:val="18"/>
+              </w:rPr>
+              <w:t>10779.48</w:t>
+            </w:r>
+          </w:p>
+        </w:tc>
+        <w:tc>
+          <w:tcPr>
+            <w:tcW w:type="dxa" w:w="4180"/>
+            <w:vAlign w:val="center"/>
+            <w:tcMar>
+              <w:top w:w="45" w:type="dxa"/>
+              <w:bottom w:w="45" w:type="dxa"/>
+              <w:left w:w="90" w:type="dxa"/>
+              <w:right w:w="90" w:type="dxa"/>
+            </w:tcMar>
+          </w:tcPr>
+          <w:p>
+            <w:pPr>
+              <w:pStyle w:val="Caption"/>
+              <w:keepNext w:val="0"/>
+              <w:widowControl/>
+              <w:spacing w:after="60" w:before="0" w:line="240" w:lineRule="exact"/>
+            </w:pPr>
+            <w:r>
+              <w:rPr>
+                <w:rFonts w:ascii="Times New Roman" w:hAnsi="Times New Roman" w:eastAsia="Times New Roman"/>
+                <w:sz w:val="18"/>
+              </w:rPr>
+              <w:t>10794.88</w:t>
+            </w:r>
+          </w:p>
+        </w:tc>
+      </w:tr>
+      <w:tr>
+        <w:tc>
+          <w:tcPr>
+            <w:tcW w:type="dxa" w:w="2000"/>
+            <w:vAlign w:val="center"/>
+            <w:tcMar>
+              <w:top w:w="45" w:type="dxa"/>
+              <w:bottom w:w="45" w:type="dxa"/>
+              <w:left w:w="90" w:type="dxa"/>
+              <w:right w:w="90" w:type="dxa"/>
+            </w:tcMar>
+          </w:tcPr>
+          <w:p>
+            <w:pPr>
+              <w:pStyle w:val="Caption"/>
+              <w:keepNext w:val="0"/>
+              <w:widowControl/>
+              <w:spacing w:after="60" w:before="0" w:line="240" w:lineRule="exact"/>
+            </w:pPr>
+            <w:r>
+              <w:rPr>
+                <w:rFonts w:ascii="Times New Roman" w:hAnsi="Times New Roman" w:eastAsia="Times New Roman"/>
+                <w:sz w:val="18"/>
+              </w:rPr>
+              <w:t>400</w:t>
+            </w:r>
+          </w:p>
+        </w:tc>
+        <w:tc>
+          <w:tcPr>
+            <w:tcW w:type="dxa" w:w="3800"/>
+            <w:vAlign w:val="center"/>
+            <w:tcMar>
+              <w:top w:w="45" w:type="dxa"/>
+              <w:bottom w:w="45" w:type="dxa"/>
+              <w:left w:w="90" w:type="dxa"/>
+              <w:right w:w="90" w:type="dxa"/>
+            </w:tcMar>
+          </w:tcPr>
+          <w:p>
+            <w:pPr>
+              <w:pStyle w:val="Caption"/>
+              <w:keepNext w:val="0"/>
+              <w:widowControl/>
+              <w:spacing w:after="60" w:before="0" w:line="240" w:lineRule="exact"/>
+            </w:pPr>
+            <w:r>
+              <w:rPr>
+                <w:rFonts w:ascii="Times New Roman" w:hAnsi="Times New Roman" w:eastAsia="Times New Roman"/>
+                <w:sz w:val="18"/>
+              </w:rPr>
+              <w:t>2698.18</w:t>
+            </w:r>
+          </w:p>
+        </w:tc>
+        <w:tc>
+          <w:tcPr>
+            <w:tcW w:type="dxa" w:w="4180"/>
+            <w:vAlign w:val="center"/>
+            <w:tcMar>
+              <w:top w:w="45" w:type="dxa"/>
+              <w:bottom w:w="45" w:type="dxa"/>
+              <w:left w:w="90" w:type="dxa"/>
+              <w:right w:w="90" w:type="dxa"/>
+            </w:tcMar>
+          </w:tcPr>
+          <w:p>
+            <w:pPr>
+              <w:pStyle w:val="Caption"/>
+              <w:keepNext w:val="0"/>
+              <w:widowControl/>
+              <w:spacing w:after="60" w:before="0" w:line="240" w:lineRule="exact"/>
+            </w:pPr>
+            <w:r>
+              <w:rPr>
+                <w:rFonts w:ascii="Times New Roman" w:hAnsi="Times New Roman" w:eastAsia="Times New Roman"/>
+                <w:sz w:val="18"/>
+              </w:rPr>
+              <w:t>2698.72</w:t>
+            </w:r>
+          </w:p>
+        </w:tc>
+      </w:tr>
+    </w:tbl>
+    <w:p>
+      <w:pPr>
+        <w:spacing w:after="60" w:line="240" w:lineRule="auto" w:before="120"/>
+        <w:jc w:val="center"/>
+      </w:pPr>
+      <w:r>
+        <w:drawing>
+          <wp:inline xmlns:a="http://schemas.openxmlformats.org/drawingml/2006/main" xmlns:pic="http://schemas.openxmlformats.org/drawingml/2006/picture">
+            <wp:extent cx="4318000" cy="1631244"/>
+            <wp:docPr id="11" name="Picture 11" descr="column-en"/>
+            <wp:cNvGraphicFramePr>
+              <a:graphicFrameLocks noChangeAspect="1"/>
+            </wp:cNvGraphicFramePr>
+            <a:graphic>
+              <a:graphicData uri="http://schemas.openxmlformats.org/drawingml/2006/picture">
+                <pic:pic>
+                  <pic:nvPicPr>
+                    <pic:cNvPr id="0" name="column-en.png"/>
+                    <pic:cNvPicPr/>
+                  </pic:nvPicPr>
+                  <pic:blipFill>
+                    <a:blip r:embed="rId22"/>
+                    <a:stretch>
+                      <a:fillRect/>
+                    </a:stretch>
+                  </pic:blipFill>
+                  <pic:spPr>
+                    <a:xfrm>
+                      <a:off x="0" y="0"/>
+                      <a:ext cx="4318000" cy="1631244"/>
+                    </a:xfrm>
+                    <a:prstGeom prst="rect"/>
+                  </pic:spPr>
+                </pic:pic>
+              </a:graphicData>
+            </a:graphic>
+          </wp:inline>
+        </w:drawing>
+      </w:r>
+    </w:p>
+    <w:p>
+      <w:pPr>
+        <w:pStyle w:val="Caption"/>
+        <w:keepNext w:val="0"/>
+        <w:widowControl/>
+        <w:spacing w:after="120" w:before="0" w:line="230" w:lineRule="exact"/>
+      </w:pPr>
+      <w:r>
+        <w:rPr>
+          <w:rFonts w:ascii="Times New Roman" w:hAnsi="Times New Roman" w:eastAsia="Times New Roman"/>
+          <w:sz w:val="18"/>
+        </w:rPr>
+        <w:t>Mode amplitude is for display only. Critical load equals reference force times eigenvalue; the long-to-short column load ratio is about 0.25.</w:t>
+      </w:r>
+    </w:p>
+    <w:p>
+      <w:pPr>
+        <w:pStyle w:val="Heading2"/>
+        <w:keepNext/>
+        <w:widowControl/>
+        <w:spacing w:after="120" w:before="100" w:line="320" w:lineRule="exact"/>
+      </w:pPr>
+      <w:r>
+        <w:rPr>
+          <w:rFonts w:ascii="Arial" w:hAnsi="Arial" w:eastAsia="Arial"/>
+          <w:sz w:val="24"/>
+        </w:rPr>
+        <w:t>6 Negative Poisson’s ratio</w:t>
+      </w:r>
+    </w:p>
+    <w:p>
+      <w:pPr>
+        <w:keepNext w:val="0"/>
+        <w:widowControl/>
+        <w:spacing w:after="120" w:before="0" w:line="320" w:lineRule="exact"/>
+      </w:pPr>
+      <w:r>
+        <w:rPr>
+          <w:rFonts w:ascii="Times New Roman" w:hAnsi="Times New Roman" w:eastAsia="Times New Roman"/>
+          <w:sz w:val="22"/>
+        </w:rPr>
+        <w:t>ν</w:t>
+      </w:r>
+      <w:r>
+        <w:rPr>
+          <w:rFonts w:ascii="Times New Roman" w:hAnsi="Times New Roman" w:eastAsia="Times New Roman"/>
+          <w:sz w:val="22"/>
+          <w:vertAlign w:val="subscript"/>
+        </w:rPr>
+        <w:t>app</w:t>
+      </w:r>
+      <w:r>
+        <w:rPr>
+          <w:rFonts w:ascii="Times New Roman" w:hAnsi="Times New Roman" w:eastAsia="Times New Roman"/>
+          <w:sz w:val="22"/>
+        </w:rPr>
+        <w:t xml:space="preserve"> = −ε</w:t>
+      </w:r>
+      <w:r>
+        <w:rPr>
+          <w:rFonts w:ascii="Times New Roman" w:hAnsi="Times New Roman" w:eastAsia="Times New Roman"/>
+          <w:sz w:val="22"/>
+          <w:vertAlign w:val="subscript"/>
+        </w:rPr>
+        <w:t>y</w:t>
+      </w:r>
+      <w:r>
+        <w:rPr>
+          <w:rFonts w:ascii="Times New Roman" w:hAnsi="Times New Roman" w:eastAsia="Times New Roman"/>
+          <w:sz w:val="22"/>
+        </w:rPr>
+        <w:t>/ε</w:t>
+      </w:r>
+      <w:r>
+        <w:rPr>
+          <w:rFonts w:ascii="Times New Roman" w:hAnsi="Times New Roman" w:eastAsia="Times New Roman"/>
+          <w:sz w:val="22"/>
+          <w:vertAlign w:val="subscript"/>
+        </w:rPr>
+        <w:t>x</w:t>
+      </w:r>
+      <w:r>
+        <w:rPr>
+          <w:rFonts w:ascii="Times New Roman" w:hAnsi="Times New Roman" w:eastAsia="Times New Roman"/>
+          <w:sz w:val="22"/>
+        </w:rPr>
+        <w:t>.</w:t>
+      </w:r>
+    </w:p>
+    <w:tbl>
+      <w:tblPr>
+        <w:tblW w:type="auto" w:w="0"/>
+        <w:jc w:val="left"/>
+        <w:tblLayout w:type="fixed"/>
+        <w:tblLook w:firstColumn="1" w:firstRow="1" w:lastColumn="0" w:lastRow="0" w:noHBand="0" w:noVBand="1" w:val="04A0"/>
+        <w:tblBorders>
+          <w:top w:val="single" w:sz="4" w:color="D9D9D9"/>
+          <w:left w:val="single" w:sz="4" w:color="D9D9D9"/>
+          <w:bottom w:val="single" w:sz="4" w:color="D9D9D9"/>
+          <w:right w:val="single" w:sz="4" w:color="D9D9D9"/>
+          <w:insideH w:val="single" w:sz="4" w:color="D9D9D9"/>
+          <w:insideV w:val="single" w:sz="4" w:color="D9D9D9"/>
+        </w:tblBorders>
+      </w:tblPr>
+      <w:tblGrid>
+        <w:gridCol w:w="2200"/>
+        <w:gridCol w:w="2400"/>
+        <w:gridCol w:w="2700"/>
+        <w:gridCol w:w="2680"/>
+      </w:tblGrid>
+      <w:tr>
+        <w:trPr>
+          <w:tblHeader/>
+        </w:trPr>
+        <w:tc>
+          <w:tcPr>
+            <w:tcW w:type="dxa" w:w="2200"/>
+            <w:vAlign w:val="center"/>
+            <w:tcMar>
+              <w:top w:w="45" w:type="dxa"/>
+              <w:bottom w:w="45" w:type="dxa"/>
+              <w:left w:w="90" w:type="dxa"/>
+              <w:right w:w="90" w:type="dxa"/>
+            </w:tcMar>
+            <w:shd w:fill="EEEEEE"/>
+          </w:tcPr>
+          <w:p>
+            <w:pPr>
+              <w:pStyle w:val="Caption"/>
+              <w:keepNext w:val="0"/>
+              <w:widowControl/>
+              <w:spacing w:after="60" w:before="0" w:line="240" w:lineRule="exact"/>
+            </w:pPr>
+            <w:r>
+              <w:rPr>
+                <w:rFonts w:ascii="Times New Roman" w:hAnsi="Times New Roman" w:eastAsia="Times New Roman"/>
+                <w:sz w:val="18"/>
+              </w:rPr>
+              <w:t>Specimen</w:t>
+            </w:r>
+          </w:p>
+        </w:tc>
+        <w:tc>
+          <w:tcPr>
+            <w:tcW w:type="dxa" w:w="2400"/>
+            <w:vAlign w:val="center"/>
+            <w:tcMar>
+              <w:top w:w="45" w:type="dxa"/>
+              <w:bottom w:w="45" w:type="dxa"/>
+              <w:left w:w="90" w:type="dxa"/>
+              <w:right w:w="90" w:type="dxa"/>
+            </w:tcMar>
+            <w:shd w:fill="EEEEEE"/>
+          </w:tcPr>
+          <w:p>
+            <w:pPr>
+              <w:pStyle w:val="Caption"/>
+              <w:keepNext w:val="0"/>
+              <w:widowControl/>
+              <w:spacing w:after="60" w:before="0" w:line="240" w:lineRule="exact"/>
+            </w:pPr>
+            <w:r>
+              <w:rPr>
+                <w:rFonts w:ascii="Times New Roman" w:hAnsi="Times New Roman" w:eastAsia="Times New Roman"/>
+                <w:sz w:val="18"/>
+              </w:rPr>
+              <w:t>Axial strain</w:t>
+            </w:r>
+          </w:p>
+        </w:tc>
+        <w:tc>
+          <w:tcPr>
+            <w:tcW w:type="dxa" w:w="2700"/>
+            <w:vAlign w:val="center"/>
+            <w:tcMar>
+              <w:top w:w="45" w:type="dxa"/>
+              <w:bottom w:w="45" w:type="dxa"/>
+              <w:left w:w="90" w:type="dxa"/>
+              <w:right w:w="90" w:type="dxa"/>
+            </w:tcMar>
+            <w:shd w:fill="EEEEEE"/>
+          </w:tcPr>
+          <w:p>
+            <w:pPr>
+              <w:pStyle w:val="Caption"/>
+              <w:keepNext w:val="0"/>
+              <w:widowControl/>
+              <w:spacing w:after="60" w:before="0" w:line="240" w:lineRule="exact"/>
+            </w:pPr>
+            <w:r>
+              <w:rPr>
+                <w:rFonts w:ascii="Times New Roman" w:hAnsi="Times New Roman" w:eastAsia="Times New Roman"/>
+                <w:sz w:val="18"/>
+              </w:rPr>
+              <w:t>Transverse strain</w:t>
+            </w:r>
+          </w:p>
+        </w:tc>
+        <w:tc>
+          <w:tcPr>
+            <w:tcW w:type="dxa" w:w="2680"/>
+            <w:vAlign w:val="center"/>
+            <w:tcMar>
+              <w:top w:w="45" w:type="dxa"/>
+              <w:bottom w:w="45" w:type="dxa"/>
+              <w:left w:w="90" w:type="dxa"/>
+              <w:right w:w="90" w:type="dxa"/>
+            </w:tcMar>
+            <w:shd w:fill="EEEEEE"/>
+          </w:tcPr>
+          <w:p>
+            <w:pPr>
+              <w:pStyle w:val="Caption"/>
+              <w:keepNext w:val="0"/>
+              <w:widowControl/>
+              <w:spacing w:after="60" w:before="0" w:line="240" w:lineRule="exact"/>
+            </w:pPr>
+            <w:r>
+              <w:rPr>
+                <w:rFonts w:ascii="Times New Roman" w:hAnsi="Times New Roman" w:eastAsia="Times New Roman"/>
+                <w:sz w:val="18"/>
+              </w:rPr>
+              <w:t>Apparent ratio</w:t>
+            </w:r>
+          </w:p>
+        </w:tc>
+      </w:tr>
+      <w:tr>
+        <w:tc>
+          <w:tcPr>
+            <w:tcW w:type="dxa" w:w="2200"/>
+            <w:vAlign w:val="center"/>
+            <w:tcMar>
+              <w:top w:w="45" w:type="dxa"/>
+              <w:bottom w:w="45" w:type="dxa"/>
+              <w:left w:w="90" w:type="dxa"/>
+              <w:right w:w="90" w:type="dxa"/>
+            </w:tcMar>
+          </w:tcPr>
+          <w:p>
+            <w:pPr>
+              <w:pStyle w:val="Caption"/>
+              <w:keepNext w:val="0"/>
+              <w:widowControl/>
+              <w:spacing w:after="60" w:before="0" w:line="240" w:lineRule="exact"/>
+            </w:pPr>
+            <w:r>
+              <w:rPr>
+                <w:rFonts w:ascii="Times New Roman" w:hAnsi="Times New Roman" w:eastAsia="Times New Roman"/>
+                <w:sz w:val="18"/>
+              </w:rPr>
+              <w:t>Honeycomb</w:t>
+            </w:r>
+          </w:p>
+        </w:tc>
+        <w:tc>
+          <w:tcPr>
+            <w:tcW w:type="dxa" w:w="2400"/>
+            <w:vAlign w:val="center"/>
+            <w:tcMar>
+              <w:top w:w="45" w:type="dxa"/>
+              <w:bottom w:w="45" w:type="dxa"/>
+              <w:left w:w="90" w:type="dxa"/>
+              <w:right w:w="90" w:type="dxa"/>
+            </w:tcMar>
+          </w:tcPr>
+          <w:p>
+            <w:pPr>
+              <w:pStyle w:val="Caption"/>
+              <w:keepNext w:val="0"/>
+              <w:widowControl/>
+              <w:spacing w:after="60" w:before="0" w:line="240" w:lineRule="exact"/>
+            </w:pPr>
+            <w:r>
+              <w:rPr>
+                <w:rFonts w:ascii="Times New Roman" w:hAnsi="Times New Roman" w:eastAsia="Times New Roman"/>
+                <w:sz w:val="18"/>
+              </w:rPr>
+              <w:t>0.001000</w:t>
+            </w:r>
+          </w:p>
+        </w:tc>
+        <w:tc>
+          <w:tcPr>
+            <w:tcW w:type="dxa" w:w="2700"/>
+            <w:vAlign w:val="center"/>
+            <w:tcMar>
+              <w:top w:w="45" w:type="dxa"/>
+              <w:bottom w:w="45" w:type="dxa"/>
+              <w:left w:w="90" w:type="dxa"/>
+              <w:right w:w="90" w:type="dxa"/>
+            </w:tcMar>
+          </w:tcPr>
+          <w:p>
+            <w:pPr>
+              <w:pStyle w:val="Caption"/>
+              <w:keepNext w:val="0"/>
+              <w:widowControl/>
+              <w:spacing w:after="60" w:before="0" w:line="240" w:lineRule="exact"/>
+            </w:pPr>
+            <w:r>
+              <w:rPr>
+                <w:rFonts w:ascii="Times New Roman" w:hAnsi="Times New Roman" w:eastAsia="Times New Roman"/>
+                <w:sz w:val="18"/>
+              </w:rPr>
+              <w:t>0.001303</w:t>
+            </w:r>
+          </w:p>
+        </w:tc>
+        <w:tc>
+          <w:tcPr>
+            <w:tcW w:type="dxa" w:w="2680"/>
+            <w:vAlign w:val="center"/>
+            <w:tcMar>
+              <w:top w:w="45" w:type="dxa"/>
+              <w:bottom w:w="45" w:type="dxa"/>
+              <w:left w:w="90" w:type="dxa"/>
+              <w:right w:w="90" w:type="dxa"/>
+            </w:tcMar>
+          </w:tcPr>
+          <w:p>
+            <w:pPr>
+              <w:pStyle w:val="Caption"/>
+              <w:keepNext w:val="0"/>
+              <w:widowControl/>
+              <w:spacing w:after="60" w:before="0" w:line="240" w:lineRule="exact"/>
+            </w:pPr>
+            <w:r>
+              <w:rPr>
+                <w:rFonts w:ascii="Times New Roman" w:hAnsi="Times New Roman" w:eastAsia="Times New Roman"/>
+                <w:sz w:val="18"/>
+              </w:rPr>
+              <w:t>-1.3026</w:t>
+            </w:r>
+          </w:p>
+        </w:tc>
+      </w:tr>
+      <w:tr>
+        <w:tc>
+          <w:tcPr>
+            <w:tcW w:type="dxa" w:w="2200"/>
+            <w:vAlign w:val="center"/>
+            <w:tcMar>
+              <w:top w:w="45" w:type="dxa"/>
+              <w:bottom w:w="45" w:type="dxa"/>
+              <w:left w:w="90" w:type="dxa"/>
+              <w:right w:w="90" w:type="dxa"/>
+            </w:tcMar>
+          </w:tcPr>
+          <w:p>
+            <w:pPr>
+              <w:pStyle w:val="Caption"/>
+              <w:keepNext w:val="0"/>
+              <w:widowControl/>
+              <w:spacing w:after="60" w:before="0" w:line="240" w:lineRule="exact"/>
+            </w:pPr>
+            <w:r>
+              <w:rPr>
+                <w:rFonts w:ascii="Times New Roman" w:hAnsi="Times New Roman" w:eastAsia="Times New Roman"/>
+                <w:sz w:val="18"/>
+              </w:rPr>
+              <w:t>Solid plate</w:t>
+            </w:r>
+          </w:p>
+        </w:tc>
+        <w:tc>
+          <w:tcPr>
+            <w:tcW w:type="dxa" w:w="2400"/>
+            <w:vAlign w:val="center"/>
+            <w:tcMar>
+              <w:top w:w="45" w:type="dxa"/>
+              <w:bottom w:w="45" w:type="dxa"/>
+              <w:left w:w="90" w:type="dxa"/>
+              <w:right w:w="90" w:type="dxa"/>
+            </w:tcMar>
+          </w:tcPr>
+          <w:p>
+            <w:pPr>
+              <w:pStyle w:val="Caption"/>
+              <w:keepNext w:val="0"/>
+              <w:widowControl/>
+              <w:spacing w:after="60" w:before="0" w:line="240" w:lineRule="exact"/>
+            </w:pPr>
+            <w:r>
+              <w:rPr>
+                <w:rFonts w:ascii="Times New Roman" w:hAnsi="Times New Roman" w:eastAsia="Times New Roman"/>
+                <w:sz w:val="18"/>
+              </w:rPr>
+              <w:t>0.001000</w:t>
+            </w:r>
+          </w:p>
+        </w:tc>
+        <w:tc>
+          <w:tcPr>
+            <w:tcW w:type="dxa" w:w="2700"/>
+            <w:vAlign w:val="center"/>
+            <w:tcMar>
+              <w:top w:w="45" w:type="dxa"/>
+              <w:bottom w:w="45" w:type="dxa"/>
+              <w:left w:w="90" w:type="dxa"/>
+              <w:right w:w="90" w:type="dxa"/>
+            </w:tcMar>
+          </w:tcPr>
+          <w:p>
+            <w:pPr>
+              <w:pStyle w:val="Caption"/>
+              <w:keepNext w:val="0"/>
+              <w:widowControl/>
+              <w:spacing w:after="60" w:before="0" w:line="240" w:lineRule="exact"/>
+            </w:pPr>
+            <w:r>
+              <w:rPr>
+                <w:rFonts w:ascii="Times New Roman" w:hAnsi="Times New Roman" w:eastAsia="Times New Roman"/>
+                <w:sz w:val="18"/>
+              </w:rPr>
+              <w:t>-0.000300</w:t>
+            </w:r>
+          </w:p>
+        </w:tc>
+        <w:tc>
+          <w:tcPr>
+            <w:tcW w:type="dxa" w:w="2680"/>
+            <w:vAlign w:val="center"/>
+            <w:tcMar>
+              <w:top w:w="45" w:type="dxa"/>
+              <w:bottom w:w="45" w:type="dxa"/>
+              <w:left w:w="90" w:type="dxa"/>
+              <w:right w:w="90" w:type="dxa"/>
+            </w:tcMar>
+          </w:tcPr>
+          <w:p>
+            <w:pPr>
+              <w:pStyle w:val="Caption"/>
+              <w:keepNext w:val="0"/>
+              <w:widowControl/>
+              <w:spacing w:after="60" w:before="0" w:line="240" w:lineRule="exact"/>
+            </w:pPr>
+            <w:r>
+              <w:rPr>
+                <w:rFonts w:ascii="Times New Roman" w:hAnsi="Times New Roman" w:eastAsia="Times New Roman"/>
+                <w:sz w:val="18"/>
+              </w:rPr>
+              <w:t>0.3000</w:t>
+            </w:r>
+          </w:p>
+        </w:tc>
+      </w:tr>
+    </w:tbl>
+    <w:p>
+      <w:pPr>
+        <w:spacing w:after="60" w:line="240" w:lineRule="auto" w:before="120"/>
+        <w:jc w:val="center"/>
+      </w:pPr>
+      <w:r>
+        <w:drawing>
+          <wp:inline xmlns:a="http://schemas.openxmlformats.org/drawingml/2006/main" xmlns:pic="http://schemas.openxmlformats.org/drawingml/2006/picture">
+            <wp:extent cx="3937000" cy="1749778"/>
+            <wp:docPr id="12" name="Picture 12" descr="honeycomb-en"/>
+            <wp:cNvGraphicFramePr>
+              <a:graphicFrameLocks noChangeAspect="1"/>
+            </wp:cNvGraphicFramePr>
+            <a:graphic>
+              <a:graphicData uri="http://schemas.openxmlformats.org/drawingml/2006/picture">
+                <pic:pic>
+                  <pic:nvPicPr>
+                    <pic:cNvPr id="0" name="honeycomb-en.png"/>
+                    <pic:cNvPicPr/>
+                  </pic:nvPicPr>
+                  <pic:blipFill>
+                    <a:blip r:embed="rId23"/>
+                    <a:stretch>
+                      <a:fillRect/>
+                    </a:stretch>
+                  </pic:blipFill>
+                  <pic:spPr>
+                    <a:xfrm>
+                      <a:off x="0" y="0"/>
+                      <a:ext cx="3937000" cy="1749778"/>
+                    </a:xfrm>
+                    <a:prstGeom prst="rect"/>
+                  </pic:spPr>
+                </pic:pic>
+              </a:graphicData>
+            </a:graphic>
+          </wp:inline>
+        </w:drawing>
+      </w:r>
+    </w:p>
+    <w:p>
+      <w:pPr>
+        <w:pStyle w:val="Caption"/>
+        <w:keepNext w:val="0"/>
+        <w:widowControl/>
+        <w:spacing w:after="120" w:before="0" w:line="230" w:lineRule="exact"/>
+      </w:pPr>
+      <w:r>
+        <w:rPr>
+          <w:rFonts w:ascii="Times New Roman" w:hAnsi="Times New Roman" w:eastAsia="Times New Roman"/>
+          <w:sz w:val="18"/>
+        </w:rPr>
+        <w:t>Halving the extension leaves the apparent ratio unchanged. Refining the honeycomb mesh from 0.8 to 0.4 mm changes it from −1.3026 to −1.3062 (about 0.28%). The negative value comes from geometry, not the material parameter. A finite-specimen response is not a periodic effective property.</w:t>
+      </w:r>
+    </w:p>
+    <w:p>
       <w:pPr>
         <w:pStyle w:val="Heading2"/>
         <w:keepNext/>
@@ -5014,7 +6540,7 @@
         </w:rPr>
         <w:t xml:space="preserve">[1] Interactive web edition with copyable prompts and results. </w:t>
       </w:r>
-      <w:hyperlink r:id="rId19">
+      <w:hyperlink r:id="rId24">
         <w:r>
           <w:rPr>
             <w:color w:val="336B85"/>
@@ -5037,7 +6563,7 @@
         </w:rPr>
         <w:t xml:space="preserve">[2] AgentFEM installation guide. </w:t>
       </w:r>
-      <w:hyperlink r:id="rId20">
+      <w:hyperlink r:id="rId25">
         <w:r>
           <w:rPr>
             <w:color w:val="336B85"/>

</xml_diff>

<commit_message>
Refine lessons 5 and 6 with verified load response and consistent visuals
</commit_message>
<xml_diff>
--- a/public/learn/AgentFEM-first-simulations-en.docx
+++ b/public/learn/AgentFEM-first-simulations-en.docx
@@ -713,7 +713,7 @@
                 <w:rFonts w:ascii="Times New Roman" w:hAnsi="Times New Roman" w:eastAsia="Times New Roman"/>
                 <w:sz w:val="18"/>
               </w:rPr>
-              <w:t>Linear column buckling</w:t>
+              <w:t>Column response under compression</w:t>
             </w:r>
           </w:p>
         </w:tc>
@@ -740,7 +740,7 @@
                 <w:rFonts w:ascii="Times New Roman" w:hAnsi="Times New Roman" w:eastAsia="Times New Roman"/>
                 <w:sz w:val="18"/>
               </w:rPr>
-              <w:t>Euler critical load</w:t>
+              <w:t>Load curve and Euler load</w:t>
             </w:r>
           </w:p>
         </w:tc>
@@ -841,7 +841,7 @@
           <w:rFonts w:ascii="Times New Roman" w:hAnsi="Times New Roman" w:eastAsia="Times New Roman"/>
           <w:sz w:val="18"/>
         </w:rPr>
-        <w:t>Keep the model, a table of key values and a result figure for each exercise. Calculate in SI units and convert displayed values to mm, μm or °C as requested.</w:t>
+        <w:t>Keep the model, a table of key values and a result figure for each exercise. Use consistent units and report results in the requested units.</w:t>
       </w:r>
     </w:p>
     <w:p>
@@ -2947,7 +2947,7 @@
           <w:rFonts w:ascii="Arial" w:hAnsi="Arial" w:eastAsia="Arial"/>
           <w:sz w:val="32"/>
         </w:rPr>
-        <w:t>Exercise 5 Linear column buckling</w:t>
+        <w:t>Exercise 5 Column response under compression</w:t>
       </w:r>
     </w:p>
     <w:p>
@@ -2962,7 +2962,7 @@
           <w:rFonts w:ascii="Times New Roman" w:hAnsi="Times New Roman" w:eastAsia="Times New Roman"/>
           <w:sz w:val="18"/>
         </w:rPr>
-        <w:t>A lateral force bends a bar. Axial compression can make it buckle. Find the load at which sideways buckling begins.</w:t>
+        <w:t>As compression increases, does sideways displacement remain proportional to the load? Plot the response and see what happens near Euler’s critical load.</w:t>
       </w:r>
     </w:p>
     <w:p>
@@ -2973,7 +2973,7 @@
       <w:r>
         <w:drawing>
           <wp:inline xmlns:a="http://schemas.openxmlformats.org/drawingml/2006/main" xmlns:pic="http://schemas.openxmlformats.org/drawingml/2006/picture">
-            <wp:extent cx="5842000" cy="1489349"/>
+            <wp:extent cx="5842000" cy="1525411"/>
             <wp:docPr id="5" name="Picture 5" descr="column-setup-en"/>
             <wp:cNvGraphicFramePr>
               <a:graphicFrameLocks noChangeAspect="1"/>
@@ -2994,7 +2994,7 @@
                   <pic:spPr>
                     <a:xfrm>
                       <a:off x="0" y="0"/>
-                      <a:ext cx="5842000" cy="1489349"/>
+                      <a:ext cx="5842000" cy="1525411"/>
                     </a:xfrm>
                     <a:prstGeom prst="rect"/>
                   </pic:spPr>
@@ -3017,7 +3017,7 @@
           <w:rFonts w:ascii="Times New Roman" w:hAnsi="Times New Roman" w:eastAsia="Times New Roman"/>
           <w:sz w:val="18"/>
         </w:rPr>
-        <w:t>Requires AgentFEM with the 2026-10-10 buckling update and SLEPc; v0.4.1 predates it.</w:t>
+        <w:t>Requires AgentFEM with geometric nonlinearity and plane-stress Neo-Hookean elasticity.</w:t>
       </w:r>
     </w:p>
     <w:p>
@@ -3046,7 +3046,7 @@
           <w:rFonts w:ascii="Times New Roman" w:hAnsi="Times New Roman" w:eastAsia="Times New Roman"/>
           <w:sz w:val="21"/>
         </w:rPr>
-        <w:t>Use AgentFEM for linear buckling of a steel column: length 200 mm, section height 10 mm and thickness 10 mm, Young’s modulus 210 GPa, Poisson’s ratio 0.3. Use 2D plane stress. Clamp the left end and apply uniform axial compression to the right face with a reference total force of 100 N; leave other boundaries free and neglect gravity. Solve the prestress state, then report the first critical load (N) and mode plot. Check against Euler’s cantilever-column formula and state that mode amplitude is not physical displacement. Set the eigenvalue solver tolerance to 1e-7 and check the residual.</w:t>
+        <w:t>Use AgentFEM to load a column gradually: length L=200 mm, section 10×10 mm, E=210 GPa, Poisson’s ratio 0.3. Clamp the left end; apply uniform horizontal compression to the right face and leave its rotation free. Other boundaries are free; neglect gravity. Use geometrically nonlinear 2D plane stress with a plane-stress Neo-Hookean elastic material having the same E and ν. Add a stress-free initial bow y₀(x)=0.1[1−cos(πx/2L)] mm. Increase total force from 0 to 10.7 kN in increments, using smaller steps near buckling. Plot total force versus mean right-end lateral displacement relative to the initial shape. Mark Euler’s value π²EI/(4L²) and show deformed shapes at several loads. Numerical settings: N, mm, MPa; Newton absolute residual tolerance 1e-6; allow up to 1500 adaptive increments.</w:t>
       </w:r>
     </w:p>
     <w:p>
@@ -3061,7 +3061,7 @@
           <w:rFonts w:ascii="Arial" w:hAnsi="Arial" w:eastAsia="Arial"/>
           <w:sz w:val="24"/>
         </w:rPr>
-        <w:t>Follow-up calculation</w:t>
+        <w:t>Follow-up prompt</w:t>
       </w:r>
     </w:p>
     <w:p>
@@ -3075,7 +3075,7 @@
           <w:rFonts w:ascii="Times New Roman" w:hAnsi="Times New Roman" w:eastAsia="Times New Roman"/>
           <w:sz w:val="21"/>
         </w:rPr>
-        <w:t>Increase the column length to 400 mm, keeping the section, material and supports unchanged. Recompute the first critical load, compare the two loads and explain their ratio using Euler’s formula.</w:t>
+        <w:t>Increase the initial bow from 0.1 to 0.2 mm, keeping other settings unchanged. Overlay the two load–lateral displacement curves and compare their deflections at the same load.</w:t>
       </w:r>
     </w:p>
     <w:p>
@@ -3105,7 +3105,7 @@
           <w:rFonts w:ascii="Times New Roman" w:hAnsi="Times New Roman" w:eastAsia="Times New Roman"/>
           <w:sz w:val="18"/>
         </w:rPr>
-        <w:t>200 mm: ________ N 400 mm: ________ N Ratio: ________</w:t>
+        <w:t>Euler critical load: ________ kN Lateral displacement at 9 kN: ________ mm</w:t>
       </w:r>
     </w:p>
     <w:p>
@@ -3120,7 +3120,7 @@
           <w:rFonts w:ascii="Times New Roman" w:hAnsi="Times New Roman" w:eastAsia="Times New Roman"/>
           <w:sz w:val="18"/>
         </w:rPr>
-        <w:t>Euler reference: ________ N Relative difference: ________ %</w:t>
+        <w:t>How does the curve change near the critical load? ________________</w:t>
       </w:r>
     </w:p>
     <w:p>
@@ -3181,7 +3181,7 @@
       <w:r>
         <w:drawing>
           <wp:inline xmlns:a="http://schemas.openxmlformats.org/drawingml/2006/main" xmlns:pic="http://schemas.openxmlformats.org/drawingml/2006/picture">
-            <wp:extent cx="5842000" cy="2012244"/>
+            <wp:extent cx="5842000" cy="2155976"/>
             <wp:docPr id="6" name="Picture 6" descr="honeycomb-setup-en"/>
             <wp:cNvGraphicFramePr>
               <a:graphicFrameLocks noChangeAspect="1"/>
@@ -3202,7 +3202,7 @@
                   <pic:spPr>
                     <a:xfrm>
                       <a:off x="0" y="0"/>
-                      <a:ext cx="5842000" cy="2012244"/>
+                      <a:ext cx="5842000" cy="2155976"/>
                     </a:xfrm>
                     <a:prstGeom prst="rect"/>
                   </pic:spPr>
@@ -3270,7 +3270,7 @@
           <w:rFonts w:ascii="Times New Roman" w:hAnsi="Times New Roman" w:eastAsia="Times New Roman"/>
           <w:sz w:val="21"/>
         </w:rPr>
-        <w:t>Use AgentFEM to import the attached honeycomb.msh without redrawing the geometry. Coordinates are in metres; width 51.9615 mm, height 60 mm. Boundary tags 11/12/13/14 mean left/right/bottom/top. Use small-strain linear elasticity in 2D plane stress, E=1 GPa and Poisson’s ratio 0.3; neglect gravity. Fix horizontal displacement on the left and impose a horizontal extension of 0.1% of the width on the right. Leave vertical motion free except for the bottom-left vertical displacement. Use mean displacements on all four boundaries to calculate axial and transverse strains and apparent Poisson’s ratio. Compare with a solid plate of the same size, material and constraints. Show one deformation comparison plot with its magnification.</w:t>
+        <w:t>Use AgentFEM to import the attached honeycomb.msh without redrawing the geometry. Coordinates are in metres; width 51.9615 mm, height 60 mm. Boundary tags 11/12/13/14 mean left/right/bottom/top. Use small-strain linear elasticity in 2D plane stress, E=1 GPa and Poisson’s ratio 0.3; neglect gravity. Fix horizontal displacement on the left and impose a horizontal extension of 0.1% of the width on the right. Leave vertical motion free except for the bottom-left vertical displacement. Use mean displacements on all four boundaries to calculate axial and transverse strains and apparent Poisson’s ratio. Compare with a solid plate of the same size, material and constraints. Show both deformed shapes side by side with their original outlines; magnify displacement 100 times and label the factor.</w:t>
       </w:r>
     </w:p>
     <w:p>
@@ -3285,7 +3285,7 @@
           <w:rFonts w:ascii="Arial" w:hAnsi="Arial" w:eastAsia="Arial"/>
           <w:sz w:val="24"/>
         </w:rPr>
-        <w:t>Follow-up calculation</w:t>
+        <w:t>Follow-up prompt</w:t>
       </w:r>
     </w:p>
     <w:p>
@@ -3299,7 +3299,7 @@
           <w:rFonts w:ascii="Times New Roman" w:hAnsi="Times New Roman" w:eastAsia="Times New Roman"/>
           <w:sz w:val="21"/>
         </w:rPr>
-        <w:t>Halve the imposed horizontal extension for both specimens, leaving all other settings unchanged. Compare the apparent Poisson’s ratios and explain why displacement decreases but the ratio barely changes.</w:t>
+        <w:t>Use these results to make a looping GIF showing the honeycomb and solid plate stretching together and returning to their original shapes. Keep the view and axis limits fixed, show the original outlines, and label displacement magnification ×100.</w:t>
       </w:r>
     </w:p>
     <w:p>
@@ -3344,7 +3344,7 @@
           <w:rFonts w:ascii="Times New Roman" w:hAnsi="Times New Roman" w:eastAsia="Times New Roman"/>
           <w:sz w:val="18"/>
         </w:rPr>
-        <w:t>Solid plate ratio: ________ Honeycomb ratio at half extension: ________</w:t>
+        <w:t>Solid plate ratio: ________ GIF file: ________________</w:t>
       </w:r>
     </w:p>
     <w:p>
@@ -5708,42 +5708,13 @@
         </w:tblBorders>
       </w:tblPr>
       <w:tblGrid>
-        <w:gridCol w:w="2000"/>
         <w:gridCol w:w="3800"/>
-        <w:gridCol w:w="4180"/>
+        <w:gridCol w:w="6180"/>
       </w:tblGrid>
       <w:tr>
         <w:trPr>
           <w:tblHeader/>
         </w:trPr>
-        <w:tc>
-          <w:tcPr>
-            <w:tcW w:type="dxa" w:w="2000"/>
-            <w:vAlign w:val="center"/>
-            <w:tcMar>
-              <w:top w:w="45" w:type="dxa"/>
-              <w:bottom w:w="45" w:type="dxa"/>
-              <w:left w:w="90" w:type="dxa"/>
-              <w:right w:w="90" w:type="dxa"/>
-            </w:tcMar>
-            <w:shd w:fill="EEEEEE"/>
-          </w:tcPr>
-          <w:p>
-            <w:pPr>
-              <w:pStyle w:val="Caption"/>
-              <w:keepNext w:val="0"/>
-              <w:widowControl/>
-              <w:spacing w:after="60" w:before="0" w:line="240" w:lineRule="exact"/>
-            </w:pPr>
-            <w:r>
-              <w:rPr>
-                <w:rFonts w:ascii="Times New Roman" w:hAnsi="Times New Roman" w:eastAsia="Times New Roman"/>
-                <w:sz w:val="18"/>
-              </w:rPr>
-              <w:t>Length / mm</w:t>
-            </w:r>
-          </w:p>
-        </w:tc>
         <w:tc>
           <w:tcPr>
             <w:tcW w:type="dxa" w:w="3800"/>
@@ -5768,13 +5739,13 @@
                 <w:rFonts w:ascii="Times New Roman" w:hAnsi="Times New Roman" w:eastAsia="Times New Roman"/>
                 <w:sz w:val="18"/>
               </w:rPr>
-              <w:t>FE / N</w:t>
+              <w:t>Total force / kN</w:t>
             </w:r>
           </w:p>
         </w:tc>
         <w:tc>
           <w:tcPr>
-            <w:tcW w:type="dxa" w:w="4180"/>
+            <w:tcW w:type="dxa" w:w="6180"/>
             <w:vAlign w:val="center"/>
             <w:tcMar>
               <w:top w:w="45" w:type="dxa"/>
@@ -5796,39 +5767,12 @@
                 <w:rFonts w:ascii="Times New Roman" w:hAnsi="Times New Roman" w:eastAsia="Times New Roman"/>
                 <w:sz w:val="18"/>
               </w:rPr>
-              <w:t>Euler / N</w:t>
+              <w:t>Mean tip lateral displacement / mm</w:t>
             </w:r>
           </w:p>
         </w:tc>
       </w:tr>
       <w:tr>
-        <w:tc>
-          <w:tcPr>
-            <w:tcW w:type="dxa" w:w="2000"/>
-            <w:vAlign w:val="center"/>
-            <w:tcMar>
-              <w:top w:w="45" w:type="dxa"/>
-              <w:bottom w:w="45" w:type="dxa"/>
-              <w:left w:w="90" w:type="dxa"/>
-              <w:right w:w="90" w:type="dxa"/>
-            </w:tcMar>
-          </w:tcPr>
-          <w:p>
-            <w:pPr>
-              <w:pStyle w:val="Caption"/>
-              <w:keepNext w:val="0"/>
-              <w:widowControl/>
-              <w:spacing w:after="60" w:before="0" w:line="240" w:lineRule="exact"/>
-            </w:pPr>
-            <w:r>
-              <w:rPr>
-                <w:rFonts w:ascii="Times New Roman" w:hAnsi="Times New Roman" w:eastAsia="Times New Roman"/>
-                <w:sz w:val="18"/>
-              </w:rPr>
-              <w:t>200</w:t>
-            </w:r>
-          </w:p>
-        </w:tc>
         <w:tc>
           <w:tcPr>
             <w:tcW w:type="dxa" w:w="3800"/>
@@ -5852,13 +5796,13 @@
                 <w:rFonts w:ascii="Times New Roman" w:hAnsi="Times New Roman" w:eastAsia="Times New Roman"/>
                 <w:sz w:val="18"/>
               </w:rPr>
-              <w:t>10779.48</w:t>
+              <w:t>6.0</w:t>
             </w:r>
           </w:p>
         </w:tc>
         <w:tc>
           <w:tcPr>
-            <w:tcW w:type="dxa" w:w="4180"/>
+            <w:tcW w:type="dxa" w:w="6180"/>
             <w:vAlign w:val="center"/>
             <w:tcMar>
               <w:top w:w="45" w:type="dxa"/>
@@ -5879,39 +5823,12 @@
                 <w:rFonts w:ascii="Times New Roman" w:hAnsi="Times New Roman" w:eastAsia="Times New Roman"/>
                 <w:sz w:val="18"/>
               </w:rPr>
-              <w:t>10794.88</w:t>
+              <w:t>0.125</w:t>
             </w:r>
           </w:p>
         </w:tc>
       </w:tr>
       <w:tr>
-        <w:tc>
-          <w:tcPr>
-            <w:tcW w:type="dxa" w:w="2000"/>
-            <w:vAlign w:val="center"/>
-            <w:tcMar>
-              <w:top w:w="45" w:type="dxa"/>
-              <w:bottom w:w="45" w:type="dxa"/>
-              <w:left w:w="90" w:type="dxa"/>
-              <w:right w:w="90" w:type="dxa"/>
-            </w:tcMar>
-          </w:tcPr>
-          <w:p>
-            <w:pPr>
-              <w:pStyle w:val="Caption"/>
-              <w:keepNext w:val="0"/>
-              <w:widowControl/>
-              <w:spacing w:after="60" w:before="0" w:line="240" w:lineRule="exact"/>
-            </w:pPr>
-            <w:r>
-              <w:rPr>
-                <w:rFonts w:ascii="Times New Roman" w:hAnsi="Times New Roman" w:eastAsia="Times New Roman"/>
-                <w:sz w:val="18"/>
-              </w:rPr>
-              <w:t>400</w:t>
-            </w:r>
-          </w:p>
-        </w:tc>
         <w:tc>
           <w:tcPr>
             <w:tcW w:type="dxa" w:w="3800"/>
@@ -5935,13 +5852,13 @@
                 <w:rFonts w:ascii="Times New Roman" w:hAnsi="Times New Roman" w:eastAsia="Times New Roman"/>
                 <w:sz w:val="18"/>
               </w:rPr>
-              <w:t>2698.18</w:t>
+              <w:t>9.0</w:t>
             </w:r>
           </w:p>
         </w:tc>
         <w:tc>
           <w:tcPr>
-            <w:tcW w:type="dxa" w:w="4180"/>
+            <w:tcW w:type="dxa" w:w="6180"/>
             <w:vAlign w:val="center"/>
             <w:tcMar>
               <w:top w:w="45" w:type="dxa"/>
@@ -5962,7 +5879,63 @@
                 <w:rFonts w:ascii="Times New Roman" w:hAnsi="Times New Roman" w:eastAsia="Times New Roman"/>
                 <w:sz w:val="18"/>
               </w:rPr>
-              <w:t>2698.72</w:t>
+              <w:t>0.499</w:t>
+            </w:r>
+          </w:p>
+        </w:tc>
+      </w:tr>
+      <w:tr>
+        <w:tc>
+          <w:tcPr>
+            <w:tcW w:type="dxa" w:w="3800"/>
+            <w:vAlign w:val="center"/>
+            <w:tcMar>
+              <w:top w:w="45" w:type="dxa"/>
+              <w:bottom w:w="45" w:type="dxa"/>
+              <w:left w:w="90" w:type="dxa"/>
+              <w:right w:w="90" w:type="dxa"/>
+            </w:tcMar>
+          </w:tcPr>
+          <w:p>
+            <w:pPr>
+              <w:pStyle w:val="Caption"/>
+              <w:keepNext w:val="0"/>
+              <w:widowControl/>
+              <w:spacing w:after="60" w:before="0" w:line="240" w:lineRule="exact"/>
+            </w:pPr>
+            <w:r>
+              <w:rPr>
+                <w:rFonts w:ascii="Times New Roman" w:hAnsi="Times New Roman" w:eastAsia="Times New Roman"/>
+                <w:sz w:val="18"/>
+              </w:rPr>
+              <w:t>10.7</w:t>
+            </w:r>
+          </w:p>
+        </w:tc>
+        <w:tc>
+          <w:tcPr>
+            <w:tcW w:type="dxa" w:w="6180"/>
+            <w:vAlign w:val="center"/>
+            <w:tcMar>
+              <w:top w:w="45" w:type="dxa"/>
+              <w:bottom w:w="45" w:type="dxa"/>
+              <w:left w:w="90" w:type="dxa"/>
+              <w:right w:w="90" w:type="dxa"/>
+            </w:tcMar>
+          </w:tcPr>
+          <w:p>
+            <w:pPr>
+              <w:pStyle w:val="Caption"/>
+              <w:keepNext w:val="0"/>
+              <w:widowControl/>
+              <w:spacing w:after="60" w:before="0" w:line="240" w:lineRule="exact"/>
+            </w:pPr>
+            <w:r>
+              <w:rPr>
+                <w:rFonts w:ascii="Times New Roman" w:hAnsi="Times New Roman" w:eastAsia="Times New Roman"/>
+                <w:sz w:val="18"/>
+              </w:rPr>
+              <w:t>9.648</w:t>
             </w:r>
           </w:p>
         </w:tc>
@@ -5976,7 +5949,7 @@
       <w:r>
         <w:drawing>
           <wp:inline xmlns:a="http://schemas.openxmlformats.org/drawingml/2006/main" xmlns:pic="http://schemas.openxmlformats.org/drawingml/2006/picture">
-            <wp:extent cx="4318000" cy="1631244"/>
+            <wp:extent cx="3556000" cy="1955800"/>
             <wp:docPr id="11" name="Picture 11" descr="column-en"/>
             <wp:cNvGraphicFramePr>
               <a:graphicFrameLocks noChangeAspect="1"/>
@@ -5997,7 +5970,7 @@
                   <pic:spPr>
                     <a:xfrm>
                       <a:off x="0" y="0"/>
-                      <a:ext cx="4318000" cy="1631244"/>
+                      <a:ext cx="3556000" cy="1955800"/>
                     </a:xfrm>
                     <a:prstGeom prst="rect"/>
                   </pic:spPr>
@@ -6020,7 +5993,7 @@
           <w:rFonts w:ascii="Times New Roman" w:hAnsi="Times New Roman" w:eastAsia="Times New Roman"/>
           <w:sz w:val="18"/>
         </w:rPr>
-        <w:t>Mode amplitude is for display only. Critical load equals reference force times eigenvalue; the long-to-short column load ratio is about 0.25.</w:t>
+        <w:t>Euler gives 10.795 kN. Deflection is measured from the initial bowed shape and grows rapidly near this load. The imperfect response is not an ideal bifurcation; yielding is excluded.</w:t>
       </w:r>
     </w:p>
     <w:p>
@@ -6464,7 +6437,7 @@
       <w:r>
         <w:drawing>
           <wp:inline xmlns:a="http://schemas.openxmlformats.org/drawingml/2006/main" xmlns:pic="http://schemas.openxmlformats.org/drawingml/2006/picture">
-            <wp:extent cx="3937000" cy="1749778"/>
+            <wp:extent cx="2921000" cy="1689253"/>
             <wp:docPr id="12" name="Picture 12" descr="honeycomb-en"/>
             <wp:cNvGraphicFramePr>
               <a:graphicFrameLocks noChangeAspect="1"/>
@@ -6485,7 +6458,7 @@
                   <pic:spPr>
                     <a:xfrm>
                       <a:off x="0" y="0"/>
-                      <a:ext cx="3937000" cy="1749778"/>
+                      <a:ext cx="2921000" cy="1689253"/>
                     </a:xfrm>
                     <a:prstGeom prst="rect"/>
                   </pic:spPr>
@@ -6508,7 +6481,7 @@
           <w:rFonts w:ascii="Times New Roman" w:hAnsi="Times New Roman" w:eastAsia="Times New Roman"/>
           <w:sz w:val="18"/>
         </w:rPr>
-        <w:t>Halving the extension leaves the apparent ratio unchanged. Refining the honeycomb mesh from 0.8 to 0.4 mm changes it from −1.3026 to −1.3062 (about 0.28%). The negative value comes from geometry, not the material parameter. A finite-specimen response is not a periodic effective property.</w:t>
+        <w:t>Figures and GIF: display ×100, actual extension 0.1%. The GIF interpolates linear results; it is not dynamics. Refinement gives −1.3062, a 0.28% change.</w:t>
       </w:r>
     </w:p>
     <w:p>

</xml_diff>

<commit_message>
Refine lessons 5 and 6 with verified load response and consistent visuals (#20)
</commit_message>
<xml_diff>
--- a/public/learn/AgentFEM-first-simulations-en.docx
+++ b/public/learn/AgentFEM-first-simulations-en.docx
@@ -713,7 +713,7 @@
                 <w:rFonts w:ascii="Times New Roman" w:hAnsi="Times New Roman" w:eastAsia="Times New Roman"/>
                 <w:sz w:val="18"/>
               </w:rPr>
-              <w:t>Linear column buckling</w:t>
+              <w:t>Column response under compression</w:t>
             </w:r>
           </w:p>
         </w:tc>
@@ -740,7 +740,7 @@
                 <w:rFonts w:ascii="Times New Roman" w:hAnsi="Times New Roman" w:eastAsia="Times New Roman"/>
                 <w:sz w:val="18"/>
               </w:rPr>
-              <w:t>Euler critical load</w:t>
+              <w:t>Load curve and Euler load</w:t>
             </w:r>
           </w:p>
         </w:tc>
@@ -841,7 +841,7 @@
           <w:rFonts w:ascii="Times New Roman" w:hAnsi="Times New Roman" w:eastAsia="Times New Roman"/>
           <w:sz w:val="18"/>
         </w:rPr>
-        <w:t>Keep the model, a table of key values and a result figure for each exercise. Calculate in SI units and convert displayed values to mm, μm or °C as requested.</w:t>
+        <w:t>Keep the model, a table of key values and a result figure for each exercise. Use consistent units and report results in the requested units.</w:t>
       </w:r>
     </w:p>
     <w:p>
@@ -2947,7 +2947,7 @@
           <w:rFonts w:ascii="Arial" w:hAnsi="Arial" w:eastAsia="Arial"/>
           <w:sz w:val="32"/>
         </w:rPr>
-        <w:t>Exercise 5 Linear column buckling</w:t>
+        <w:t>Exercise 5 Column response under compression</w:t>
       </w:r>
     </w:p>
     <w:p>
@@ -2962,7 +2962,7 @@
           <w:rFonts w:ascii="Times New Roman" w:hAnsi="Times New Roman" w:eastAsia="Times New Roman"/>
           <w:sz w:val="18"/>
         </w:rPr>
-        <w:t>A lateral force bends a bar. Axial compression can make it buckle. Find the load at which sideways buckling begins.</w:t>
+        <w:t>As compression increases, does sideways displacement remain proportional to the load? Plot the response and see what happens near Euler’s critical load.</w:t>
       </w:r>
     </w:p>
     <w:p>
@@ -2973,7 +2973,7 @@
       <w:r>
         <w:drawing>
           <wp:inline xmlns:a="http://schemas.openxmlformats.org/drawingml/2006/main" xmlns:pic="http://schemas.openxmlformats.org/drawingml/2006/picture">
-            <wp:extent cx="5842000" cy="1489349"/>
+            <wp:extent cx="5842000" cy="1525411"/>
             <wp:docPr id="5" name="Picture 5" descr="column-setup-en"/>
             <wp:cNvGraphicFramePr>
               <a:graphicFrameLocks noChangeAspect="1"/>
@@ -2994,7 +2994,7 @@
                   <pic:spPr>
                     <a:xfrm>
                       <a:off x="0" y="0"/>
-                      <a:ext cx="5842000" cy="1489349"/>
+                      <a:ext cx="5842000" cy="1525411"/>
                     </a:xfrm>
                     <a:prstGeom prst="rect"/>
                   </pic:spPr>
@@ -3017,7 +3017,7 @@
           <w:rFonts w:ascii="Times New Roman" w:hAnsi="Times New Roman" w:eastAsia="Times New Roman"/>
           <w:sz w:val="18"/>
         </w:rPr>
-        <w:t>Requires AgentFEM with the 2026-10-10 buckling update and SLEPc; v0.4.1 predates it.</w:t>
+        <w:t>Requires AgentFEM with geometric nonlinearity and plane-stress Neo-Hookean elasticity.</w:t>
       </w:r>
     </w:p>
     <w:p>
@@ -3046,7 +3046,7 @@
           <w:rFonts w:ascii="Times New Roman" w:hAnsi="Times New Roman" w:eastAsia="Times New Roman"/>
           <w:sz w:val="21"/>
         </w:rPr>
-        <w:t>Use AgentFEM for linear buckling of a steel column: length 200 mm, section height 10 mm and thickness 10 mm, Young’s modulus 210 GPa, Poisson’s ratio 0.3. Use 2D plane stress. Clamp the left end and apply uniform axial compression to the right face with a reference total force of 100 N; leave other boundaries free and neglect gravity. Solve the prestress state, then report the first critical load (N) and mode plot. Check against Euler’s cantilever-column formula and state that mode amplitude is not physical displacement. Set the eigenvalue solver tolerance to 1e-7 and check the residual.</w:t>
+        <w:t>Use AgentFEM to load a column gradually: length L=200 mm, section 10×10 mm, E=210 GPa, Poisson’s ratio 0.3. Clamp the left end; apply uniform horizontal compression to the right face and leave its rotation free. Other boundaries are free; neglect gravity. Use geometrically nonlinear 2D plane stress with a plane-stress Neo-Hookean elastic material having the same E and ν. Add a stress-free initial bow y₀(x)=0.1[1−cos(πx/2L)] mm. Increase total force from 0 to 10.7 kN in increments, using smaller steps near buckling. Plot total force versus mean right-end lateral displacement relative to the initial shape. Mark Euler’s value π²EI/(4L²) and show deformed shapes at several loads. Numerical settings: N, mm, MPa; Newton absolute residual tolerance 1e-6; allow up to 1500 adaptive increments.</w:t>
       </w:r>
     </w:p>
     <w:p>
@@ -3061,7 +3061,7 @@
           <w:rFonts w:ascii="Arial" w:hAnsi="Arial" w:eastAsia="Arial"/>
           <w:sz w:val="24"/>
         </w:rPr>
-        <w:t>Follow-up calculation</w:t>
+        <w:t>Follow-up prompt</w:t>
       </w:r>
     </w:p>
     <w:p>
@@ -3075,7 +3075,7 @@
           <w:rFonts w:ascii="Times New Roman" w:hAnsi="Times New Roman" w:eastAsia="Times New Roman"/>
           <w:sz w:val="21"/>
         </w:rPr>
-        <w:t>Increase the column length to 400 mm, keeping the section, material and supports unchanged. Recompute the first critical load, compare the two loads and explain their ratio using Euler’s formula.</w:t>
+        <w:t>Increase the initial bow from 0.1 to 0.2 mm, keeping other settings unchanged. Overlay the two load–lateral displacement curves and compare their deflections at the same load.</w:t>
       </w:r>
     </w:p>
     <w:p>
@@ -3105,7 +3105,7 @@
           <w:rFonts w:ascii="Times New Roman" w:hAnsi="Times New Roman" w:eastAsia="Times New Roman"/>
           <w:sz w:val="18"/>
         </w:rPr>
-        <w:t>200 mm: ________ N 400 mm: ________ N Ratio: ________</w:t>
+        <w:t>Euler critical load: ________ kN Lateral displacement at 9 kN: ________ mm</w:t>
       </w:r>
     </w:p>
     <w:p>
@@ -3120,7 +3120,7 @@
           <w:rFonts w:ascii="Times New Roman" w:hAnsi="Times New Roman" w:eastAsia="Times New Roman"/>
           <w:sz w:val="18"/>
         </w:rPr>
-        <w:t>Euler reference: ________ N Relative difference: ________ %</w:t>
+        <w:t>How does the curve change near the critical load? ________________</w:t>
       </w:r>
     </w:p>
     <w:p>
@@ -3181,7 +3181,7 @@
       <w:r>
         <w:drawing>
           <wp:inline xmlns:a="http://schemas.openxmlformats.org/drawingml/2006/main" xmlns:pic="http://schemas.openxmlformats.org/drawingml/2006/picture">
-            <wp:extent cx="5842000" cy="2012244"/>
+            <wp:extent cx="5842000" cy="2155976"/>
             <wp:docPr id="6" name="Picture 6" descr="honeycomb-setup-en"/>
             <wp:cNvGraphicFramePr>
               <a:graphicFrameLocks noChangeAspect="1"/>
@@ -3202,7 +3202,7 @@
                   <pic:spPr>
                     <a:xfrm>
                       <a:off x="0" y="0"/>
-                      <a:ext cx="5842000" cy="2012244"/>
+                      <a:ext cx="5842000" cy="2155976"/>
                     </a:xfrm>
                     <a:prstGeom prst="rect"/>
                   </pic:spPr>
@@ -3270,7 +3270,7 @@
           <w:rFonts w:ascii="Times New Roman" w:hAnsi="Times New Roman" w:eastAsia="Times New Roman"/>
           <w:sz w:val="21"/>
         </w:rPr>
-        <w:t>Use AgentFEM to import the attached honeycomb.msh without redrawing the geometry. Coordinates are in metres; width 51.9615 mm, height 60 mm. Boundary tags 11/12/13/14 mean left/right/bottom/top. Use small-strain linear elasticity in 2D plane stress, E=1 GPa and Poisson’s ratio 0.3; neglect gravity. Fix horizontal displacement on the left and impose a horizontal extension of 0.1% of the width on the right. Leave vertical motion free except for the bottom-left vertical displacement. Use mean displacements on all four boundaries to calculate axial and transverse strains and apparent Poisson’s ratio. Compare with a solid plate of the same size, material and constraints. Show one deformation comparison plot with its magnification.</w:t>
+        <w:t>Use AgentFEM to import the attached honeycomb.msh without redrawing the geometry. Coordinates are in metres; width 51.9615 mm, height 60 mm. Boundary tags 11/12/13/14 mean left/right/bottom/top. Use small-strain linear elasticity in 2D plane stress, E=1 GPa and Poisson’s ratio 0.3; neglect gravity. Fix horizontal displacement on the left and impose a horizontal extension of 0.1% of the width on the right. Leave vertical motion free except for the bottom-left vertical displacement. Use mean displacements on all four boundaries to calculate axial and transverse strains and apparent Poisson’s ratio. Compare with a solid plate of the same size, material and constraints. Show both deformed shapes side by side with their original outlines; magnify displacement 100 times and label the factor.</w:t>
       </w:r>
     </w:p>
     <w:p>
@@ -3285,7 +3285,7 @@
           <w:rFonts w:ascii="Arial" w:hAnsi="Arial" w:eastAsia="Arial"/>
           <w:sz w:val="24"/>
         </w:rPr>
-        <w:t>Follow-up calculation</w:t>
+        <w:t>Follow-up prompt</w:t>
       </w:r>
     </w:p>
     <w:p>
@@ -3299,7 +3299,7 @@
           <w:rFonts w:ascii="Times New Roman" w:hAnsi="Times New Roman" w:eastAsia="Times New Roman"/>
           <w:sz w:val="21"/>
         </w:rPr>
-        <w:t>Halve the imposed horizontal extension for both specimens, leaving all other settings unchanged. Compare the apparent Poisson’s ratios and explain why displacement decreases but the ratio barely changes.</w:t>
+        <w:t>Use these results to make a looping GIF showing the honeycomb and solid plate stretching together and returning to their original shapes. Keep the view and axis limits fixed, show the original outlines, and label displacement magnification ×100.</w:t>
       </w:r>
     </w:p>
     <w:p>
@@ -3344,7 +3344,7 @@
           <w:rFonts w:ascii="Times New Roman" w:hAnsi="Times New Roman" w:eastAsia="Times New Roman"/>
           <w:sz w:val="18"/>
         </w:rPr>
-        <w:t>Solid plate ratio: ________ Honeycomb ratio at half extension: ________</w:t>
+        <w:t>Solid plate ratio: ________ GIF file: ________________</w:t>
       </w:r>
     </w:p>
     <w:p>
@@ -5708,42 +5708,13 @@
         </w:tblBorders>
       </w:tblPr>
       <w:tblGrid>
-        <w:gridCol w:w="2000"/>
         <w:gridCol w:w="3800"/>
-        <w:gridCol w:w="4180"/>
+        <w:gridCol w:w="6180"/>
       </w:tblGrid>
       <w:tr>
         <w:trPr>
           <w:tblHeader/>
         </w:trPr>
-        <w:tc>
-          <w:tcPr>
-            <w:tcW w:type="dxa" w:w="2000"/>
-            <w:vAlign w:val="center"/>
-            <w:tcMar>
-              <w:top w:w="45" w:type="dxa"/>
-              <w:bottom w:w="45" w:type="dxa"/>
-              <w:left w:w="90" w:type="dxa"/>
-              <w:right w:w="90" w:type="dxa"/>
-            </w:tcMar>
-            <w:shd w:fill="EEEEEE"/>
-          </w:tcPr>
-          <w:p>
-            <w:pPr>
-              <w:pStyle w:val="Caption"/>
-              <w:keepNext w:val="0"/>
-              <w:widowControl/>
-              <w:spacing w:after="60" w:before="0" w:line="240" w:lineRule="exact"/>
-            </w:pPr>
-            <w:r>
-              <w:rPr>
-                <w:rFonts w:ascii="Times New Roman" w:hAnsi="Times New Roman" w:eastAsia="Times New Roman"/>
-                <w:sz w:val="18"/>
-              </w:rPr>
-              <w:t>Length / mm</w:t>
-            </w:r>
-          </w:p>
-        </w:tc>
         <w:tc>
           <w:tcPr>
             <w:tcW w:type="dxa" w:w="3800"/>
@@ -5768,13 +5739,13 @@
                 <w:rFonts w:ascii="Times New Roman" w:hAnsi="Times New Roman" w:eastAsia="Times New Roman"/>
                 <w:sz w:val="18"/>
               </w:rPr>
-              <w:t>FE / N</w:t>
+              <w:t>Total force / kN</w:t>
             </w:r>
           </w:p>
         </w:tc>
         <w:tc>
           <w:tcPr>
-            <w:tcW w:type="dxa" w:w="4180"/>
+            <w:tcW w:type="dxa" w:w="6180"/>
             <w:vAlign w:val="center"/>
             <w:tcMar>
               <w:top w:w="45" w:type="dxa"/>
@@ -5796,39 +5767,12 @@
                 <w:rFonts w:ascii="Times New Roman" w:hAnsi="Times New Roman" w:eastAsia="Times New Roman"/>
                 <w:sz w:val="18"/>
               </w:rPr>
-              <w:t>Euler / N</w:t>
+              <w:t>Mean tip lateral displacement / mm</w:t>
             </w:r>
           </w:p>
         </w:tc>
       </w:tr>
       <w:tr>
-        <w:tc>
-          <w:tcPr>
-            <w:tcW w:type="dxa" w:w="2000"/>
-            <w:vAlign w:val="center"/>
-            <w:tcMar>
-              <w:top w:w="45" w:type="dxa"/>
-              <w:bottom w:w="45" w:type="dxa"/>
-              <w:left w:w="90" w:type="dxa"/>
-              <w:right w:w="90" w:type="dxa"/>
-            </w:tcMar>
-          </w:tcPr>
-          <w:p>
-            <w:pPr>
-              <w:pStyle w:val="Caption"/>
-              <w:keepNext w:val="0"/>
-              <w:widowControl/>
-              <w:spacing w:after="60" w:before="0" w:line="240" w:lineRule="exact"/>
-            </w:pPr>
-            <w:r>
-              <w:rPr>
-                <w:rFonts w:ascii="Times New Roman" w:hAnsi="Times New Roman" w:eastAsia="Times New Roman"/>
-                <w:sz w:val="18"/>
-              </w:rPr>
-              <w:t>200</w:t>
-            </w:r>
-          </w:p>
-        </w:tc>
         <w:tc>
           <w:tcPr>
             <w:tcW w:type="dxa" w:w="3800"/>
@@ -5852,13 +5796,13 @@
                 <w:rFonts w:ascii="Times New Roman" w:hAnsi="Times New Roman" w:eastAsia="Times New Roman"/>
                 <w:sz w:val="18"/>
               </w:rPr>
-              <w:t>10779.48</w:t>
+              <w:t>6.0</w:t>
             </w:r>
           </w:p>
         </w:tc>
         <w:tc>
           <w:tcPr>
-            <w:tcW w:type="dxa" w:w="4180"/>
+            <w:tcW w:type="dxa" w:w="6180"/>
             <w:vAlign w:val="center"/>
             <w:tcMar>
               <w:top w:w="45" w:type="dxa"/>
@@ -5879,39 +5823,12 @@
                 <w:rFonts w:ascii="Times New Roman" w:hAnsi="Times New Roman" w:eastAsia="Times New Roman"/>
                 <w:sz w:val="18"/>
               </w:rPr>
-              <w:t>10794.88</w:t>
+              <w:t>0.125</w:t>
             </w:r>
           </w:p>
         </w:tc>
       </w:tr>
       <w:tr>
-        <w:tc>
-          <w:tcPr>
-            <w:tcW w:type="dxa" w:w="2000"/>
-            <w:vAlign w:val="center"/>
-            <w:tcMar>
-              <w:top w:w="45" w:type="dxa"/>
-              <w:bottom w:w="45" w:type="dxa"/>
-              <w:left w:w="90" w:type="dxa"/>
-              <w:right w:w="90" w:type="dxa"/>
-            </w:tcMar>
-          </w:tcPr>
-          <w:p>
-            <w:pPr>
-              <w:pStyle w:val="Caption"/>
-              <w:keepNext w:val="0"/>
-              <w:widowControl/>
-              <w:spacing w:after="60" w:before="0" w:line="240" w:lineRule="exact"/>
-            </w:pPr>
-            <w:r>
-              <w:rPr>
-                <w:rFonts w:ascii="Times New Roman" w:hAnsi="Times New Roman" w:eastAsia="Times New Roman"/>
-                <w:sz w:val="18"/>
-              </w:rPr>
-              <w:t>400</w:t>
-            </w:r>
-          </w:p>
-        </w:tc>
         <w:tc>
           <w:tcPr>
             <w:tcW w:type="dxa" w:w="3800"/>
@@ -5935,13 +5852,13 @@
                 <w:rFonts w:ascii="Times New Roman" w:hAnsi="Times New Roman" w:eastAsia="Times New Roman"/>
                 <w:sz w:val="18"/>
               </w:rPr>
-              <w:t>2698.18</w:t>
+              <w:t>9.0</w:t>
             </w:r>
           </w:p>
         </w:tc>
         <w:tc>
           <w:tcPr>
-            <w:tcW w:type="dxa" w:w="4180"/>
+            <w:tcW w:type="dxa" w:w="6180"/>
             <w:vAlign w:val="center"/>
             <w:tcMar>
               <w:top w:w="45" w:type="dxa"/>
@@ -5962,7 +5879,63 @@
                 <w:rFonts w:ascii="Times New Roman" w:hAnsi="Times New Roman" w:eastAsia="Times New Roman"/>
                 <w:sz w:val="18"/>
               </w:rPr>
-              <w:t>2698.72</w:t>
+              <w:t>0.499</w:t>
+            </w:r>
+          </w:p>
+        </w:tc>
+      </w:tr>
+      <w:tr>
+        <w:tc>
+          <w:tcPr>
+            <w:tcW w:type="dxa" w:w="3800"/>
+            <w:vAlign w:val="center"/>
+            <w:tcMar>
+              <w:top w:w="45" w:type="dxa"/>
+              <w:bottom w:w="45" w:type="dxa"/>
+              <w:left w:w="90" w:type="dxa"/>
+              <w:right w:w="90" w:type="dxa"/>
+            </w:tcMar>
+          </w:tcPr>
+          <w:p>
+            <w:pPr>
+              <w:pStyle w:val="Caption"/>
+              <w:keepNext w:val="0"/>
+              <w:widowControl/>
+              <w:spacing w:after="60" w:before="0" w:line="240" w:lineRule="exact"/>
+            </w:pPr>
+            <w:r>
+              <w:rPr>
+                <w:rFonts w:ascii="Times New Roman" w:hAnsi="Times New Roman" w:eastAsia="Times New Roman"/>
+                <w:sz w:val="18"/>
+              </w:rPr>
+              <w:t>10.7</w:t>
+            </w:r>
+          </w:p>
+        </w:tc>
+        <w:tc>
+          <w:tcPr>
+            <w:tcW w:type="dxa" w:w="6180"/>
+            <w:vAlign w:val="center"/>
+            <w:tcMar>
+              <w:top w:w="45" w:type="dxa"/>
+              <w:bottom w:w="45" w:type="dxa"/>
+              <w:left w:w="90" w:type="dxa"/>
+              <w:right w:w="90" w:type="dxa"/>
+            </w:tcMar>
+          </w:tcPr>
+          <w:p>
+            <w:pPr>
+              <w:pStyle w:val="Caption"/>
+              <w:keepNext w:val="0"/>
+              <w:widowControl/>
+              <w:spacing w:after="60" w:before="0" w:line="240" w:lineRule="exact"/>
+            </w:pPr>
+            <w:r>
+              <w:rPr>
+                <w:rFonts w:ascii="Times New Roman" w:hAnsi="Times New Roman" w:eastAsia="Times New Roman"/>
+                <w:sz w:val="18"/>
+              </w:rPr>
+              <w:t>9.648</w:t>
             </w:r>
           </w:p>
         </w:tc>
@@ -5976,7 +5949,7 @@
       <w:r>
         <w:drawing>
           <wp:inline xmlns:a="http://schemas.openxmlformats.org/drawingml/2006/main" xmlns:pic="http://schemas.openxmlformats.org/drawingml/2006/picture">
-            <wp:extent cx="4318000" cy="1631244"/>
+            <wp:extent cx="3556000" cy="1955800"/>
             <wp:docPr id="11" name="Picture 11" descr="column-en"/>
             <wp:cNvGraphicFramePr>
               <a:graphicFrameLocks noChangeAspect="1"/>
@@ -5997,7 +5970,7 @@
                   <pic:spPr>
                     <a:xfrm>
                       <a:off x="0" y="0"/>
-                      <a:ext cx="4318000" cy="1631244"/>
+                      <a:ext cx="3556000" cy="1955800"/>
                     </a:xfrm>
                     <a:prstGeom prst="rect"/>
                   </pic:spPr>
@@ -6020,7 +5993,7 @@
           <w:rFonts w:ascii="Times New Roman" w:hAnsi="Times New Roman" w:eastAsia="Times New Roman"/>
           <w:sz w:val="18"/>
         </w:rPr>
-        <w:t>Mode amplitude is for display only. Critical load equals reference force times eigenvalue; the long-to-short column load ratio is about 0.25.</w:t>
+        <w:t>Euler gives 10.795 kN. Deflection is measured from the initial bowed shape and grows rapidly near this load. The imperfect response is not an ideal bifurcation; yielding is excluded.</w:t>
       </w:r>
     </w:p>
     <w:p>
@@ -6464,7 +6437,7 @@
       <w:r>
         <w:drawing>
           <wp:inline xmlns:a="http://schemas.openxmlformats.org/drawingml/2006/main" xmlns:pic="http://schemas.openxmlformats.org/drawingml/2006/picture">
-            <wp:extent cx="3937000" cy="1749778"/>
+            <wp:extent cx="2921000" cy="1689253"/>
             <wp:docPr id="12" name="Picture 12" descr="honeycomb-en"/>
             <wp:cNvGraphicFramePr>
               <a:graphicFrameLocks noChangeAspect="1"/>
@@ -6485,7 +6458,7 @@
                   <pic:spPr>
                     <a:xfrm>
                       <a:off x="0" y="0"/>
-                      <a:ext cx="3937000" cy="1749778"/>
+                      <a:ext cx="2921000" cy="1689253"/>
                     </a:xfrm>
                     <a:prstGeom prst="rect"/>
                   </pic:spPr>
@@ -6508,7 +6481,7 @@
           <w:rFonts w:ascii="Times New Roman" w:hAnsi="Times New Roman" w:eastAsia="Times New Roman"/>
           <w:sz w:val="18"/>
         </w:rPr>
-        <w:t>Halving the extension leaves the apparent ratio unchanged. Refining the honeycomb mesh from 0.8 to 0.4 mm changes it from −1.3026 to −1.3062 (about 0.28%). The negative value comes from geometry, not the material parameter. A finite-specimen response is not a periodic effective property.</w:t>
+        <w:t>Figures and GIF: display ×100, actual extension 0.1%. The GIF interpolates linear results; it is not dynamics. Refinement gives −1.3062, a 0.28% change.</w:t>
       </w:r>
     </w:p>
     <w:p>

</xml_diff>

<commit_message>
Update teaching column to verified StVK and correct honeycomb support
</commit_message>
<xml_diff>
--- a/public/learn/AgentFEM-first-simulations-en.docx
+++ b/public/learn/AgentFEM-first-simulations-en.docx
@@ -3017,7 +3017,7 @@
           <w:rFonts w:ascii="Times New Roman" w:hAnsi="Times New Roman" w:eastAsia="Times New Roman"/>
           <w:sz w:val="18"/>
         </w:rPr>
-        <w:t>Requires AgentFEM with geometric nonlinearity and plane-stress Neo-Hookean elasticity.</w:t>
+        <w:t>Requires AgentFEM with geometric nonlinearity and plane-stress StVK elasticity.</w:t>
       </w:r>
     </w:p>
     <w:p>
@@ -3046,7 +3046,7 @@
           <w:rFonts w:ascii="Times New Roman" w:hAnsi="Times New Roman" w:eastAsia="Times New Roman"/>
           <w:sz w:val="21"/>
         </w:rPr>
-        <w:t>Use AgentFEM to load a column gradually: length L=200 mm, section 10×10 mm, E=210 GPa, Poisson’s ratio 0.3. Clamp the left end; apply uniform horizontal compression to the right face and leave its rotation free. Other boundaries are free; neglect gravity. Use geometrically nonlinear 2D plane stress with a plane-stress Neo-Hookean elastic material having the same E and ν. Add a stress-free initial bow y₀(x)=0.1[1−cos(πx/2L)] mm. Increase total force from 0 to 10.7 kN in increments, using smaller steps near buckling. Plot total force versus mean right-end lateral displacement relative to the initial shape. Mark Euler’s value π²EI/(4L²) and show deformed shapes at several loads. Numerical settings: N, mm, MPa; Newton absolute residual tolerance 1e-6; allow up to 1500 adaptive increments.</w:t>
+        <w:t>Use AgentFEM to compress a slender column gradually: length 200 mm, section 10×10 mm, E=210 GPa, Poisson’s ratio 0.3. Clamp the left end and apply uniform compression along the original axis at the right end; leave other boundaries free. Use a linear elastic material with geometric nonlinearity. Add the first buckling shape as an initial bow of amplitude 0.1 mm. Increase total force from 0 to 10.7 kN. Plot force against lateral tip displacement and compare with Euler’s critical load. Show several deformed shapes, explain in two or three sentences.</w:t>
       </w:r>
     </w:p>
     <w:p>
@@ -3270,7 +3270,7 @@
           <w:rFonts w:ascii="Times New Roman" w:hAnsi="Times New Roman" w:eastAsia="Times New Roman"/>
           <w:sz w:val="21"/>
         </w:rPr>
-        <w:t>Use AgentFEM to import the attached honeycomb.msh without redrawing the geometry. Coordinates are in metres; width 51.9615 mm, height 60 mm. Boundary tags 11/12/13/14 mean left/right/bottom/top. Use small-strain linear elasticity in 2D plane stress, E=1 GPa and Poisson’s ratio 0.3; neglect gravity. Fix horizontal displacement on the left and impose a horizontal extension of 0.1% of the width on the right. Leave vertical motion free except for the bottom-left vertical displacement. Use mean displacements on all four boundaries to calculate axial and transverse strains and apparent Poisson’s ratio. Compare with a solid plate of the same size, material and constraints. Show both deformed shapes side by side with their original outlines; magnify displacement 100 times and label the factor.</w:t>
+        <w:t>Use AgentFEM to import the attached honeycomb.msh without redrawing the geometry. Coordinates are in metres; width 51.9615 mm, height 60 mm. Boundary tags 11/12/13/14 mean left/right/bottom/top. Use small-strain linear elasticity in 2D plane stress, E=1 GPa and Poisson’s ratio 0.3; neglect gravity. Fix horizontal displacement on the left and impose a horizontal extension of 0.1% of the width on the right. Leave vertical motion free except at the lowest node on the left boundary (honeycomb: x=0, y=5 mm; solid plate: bottom-left corner). Use mean displacements on all four boundaries to calculate axial and transverse strains and apparent Poisson’s ratio. Compare with a solid plate of the same size, material and constraints. Show both deformed shapes side by side with their original outlines; magnify displacement 100 times and label the factor.</w:t>
       </w:r>
     </w:p>
     <w:p>
@@ -5879,7 +5879,7 @@
                 <w:rFonts w:ascii="Times New Roman" w:hAnsi="Times New Roman" w:eastAsia="Times New Roman"/>
                 <w:sz w:val="18"/>
               </w:rPr>
-              <w:t>0.499</w:t>
+              <w:t>0.505</w:t>
             </w:r>
           </w:p>
         </w:tc>
@@ -5935,7 +5935,7 @@
                 <w:rFonts w:ascii="Times New Roman" w:hAnsi="Times New Roman" w:eastAsia="Times New Roman"/>
                 <w:sz w:val="18"/>
               </w:rPr>
-              <w:t>9.648</w:t>
+              <w:t>11.953</w:t>
             </w:r>
           </w:p>
         </w:tc>

</xml_diff>

<commit_message>
Update teaching column to verified StVK and correct honeycomb support (#21)
</commit_message>
<xml_diff>
--- a/public/learn/AgentFEM-first-simulations-en.docx
+++ b/public/learn/AgentFEM-first-simulations-en.docx
@@ -3017,7 +3017,7 @@
           <w:rFonts w:ascii="Times New Roman" w:hAnsi="Times New Roman" w:eastAsia="Times New Roman"/>
           <w:sz w:val="18"/>
         </w:rPr>
-        <w:t>Requires AgentFEM with geometric nonlinearity and plane-stress Neo-Hookean elasticity.</w:t>
+        <w:t>Requires AgentFEM with geometric nonlinearity and plane-stress StVK elasticity.</w:t>
       </w:r>
     </w:p>
     <w:p>
@@ -3046,7 +3046,7 @@
           <w:rFonts w:ascii="Times New Roman" w:hAnsi="Times New Roman" w:eastAsia="Times New Roman"/>
           <w:sz w:val="21"/>
         </w:rPr>
-        <w:t>Use AgentFEM to load a column gradually: length L=200 mm, section 10×10 mm, E=210 GPa, Poisson’s ratio 0.3. Clamp the left end; apply uniform horizontal compression to the right face and leave its rotation free. Other boundaries are free; neglect gravity. Use geometrically nonlinear 2D plane stress with a plane-stress Neo-Hookean elastic material having the same E and ν. Add a stress-free initial bow y₀(x)=0.1[1−cos(πx/2L)] mm. Increase total force from 0 to 10.7 kN in increments, using smaller steps near buckling. Plot total force versus mean right-end lateral displacement relative to the initial shape. Mark Euler’s value π²EI/(4L²) and show deformed shapes at several loads. Numerical settings: N, mm, MPa; Newton absolute residual tolerance 1e-6; allow up to 1500 adaptive increments.</w:t>
+        <w:t>Use AgentFEM to compress a slender column gradually: length 200 mm, section 10×10 mm, E=210 GPa, Poisson’s ratio 0.3. Clamp the left end and apply uniform compression along the original axis at the right end; leave other boundaries free. Use a linear elastic material with geometric nonlinearity. Add the first buckling shape as an initial bow of amplitude 0.1 mm. Increase total force from 0 to 10.7 kN. Plot force against lateral tip displacement and compare with Euler’s critical load. Show several deformed shapes, explain in two or three sentences.</w:t>
       </w:r>
     </w:p>
     <w:p>
@@ -3270,7 +3270,7 @@
           <w:rFonts w:ascii="Times New Roman" w:hAnsi="Times New Roman" w:eastAsia="Times New Roman"/>
           <w:sz w:val="21"/>
         </w:rPr>
-        <w:t>Use AgentFEM to import the attached honeycomb.msh without redrawing the geometry. Coordinates are in metres; width 51.9615 mm, height 60 mm. Boundary tags 11/12/13/14 mean left/right/bottom/top. Use small-strain linear elasticity in 2D plane stress, E=1 GPa and Poisson’s ratio 0.3; neglect gravity. Fix horizontal displacement on the left and impose a horizontal extension of 0.1% of the width on the right. Leave vertical motion free except for the bottom-left vertical displacement. Use mean displacements on all four boundaries to calculate axial and transverse strains and apparent Poisson’s ratio. Compare with a solid plate of the same size, material and constraints. Show both deformed shapes side by side with their original outlines; magnify displacement 100 times and label the factor.</w:t>
+        <w:t>Use AgentFEM to import the attached honeycomb.msh without redrawing the geometry. Coordinates are in metres; width 51.9615 mm, height 60 mm. Boundary tags 11/12/13/14 mean left/right/bottom/top. Use small-strain linear elasticity in 2D plane stress, E=1 GPa and Poisson’s ratio 0.3; neglect gravity. Fix horizontal displacement on the left and impose a horizontal extension of 0.1% of the width on the right. Leave vertical motion free except at the lowest node on the left boundary (honeycomb: x=0, y=5 mm; solid plate: bottom-left corner). Use mean displacements on all four boundaries to calculate axial and transverse strains and apparent Poisson’s ratio. Compare with a solid plate of the same size, material and constraints. Show both deformed shapes side by side with their original outlines; magnify displacement 100 times and label the factor.</w:t>
       </w:r>
     </w:p>
     <w:p>
@@ -5879,7 +5879,7 @@
                 <w:rFonts w:ascii="Times New Roman" w:hAnsi="Times New Roman" w:eastAsia="Times New Roman"/>
                 <w:sz w:val="18"/>
               </w:rPr>
-              <w:t>0.499</w:t>
+              <w:t>0.505</w:t>
             </w:r>
           </w:p>
         </w:tc>
@@ -5935,7 +5935,7 @@
                 <w:rFonts w:ascii="Times New Roman" w:hAnsi="Times New Roman" w:eastAsia="Times New Roman"/>
                 <w:sz w:val="18"/>
               </w:rPr>
-              <w:t>9.648</w:t>
+              <w:t>11.953</w:t>
             </w:r>
           </w:p>
         </w:tc>

</xml_diff>

<commit_message>
Separate answer figures from tables in all handout editions
</commit_message>
<xml_diff>
--- a/public/learn/AgentFEM-first-simulations-en.docx
+++ b/public/learn/AgentFEM-first-simulations-en.docx
@@ -5943,13 +5943,13 @@
     </w:tbl>
     <w:p>
       <w:pPr>
-        <w:spacing w:after="60" w:line="240" w:lineRule="auto" w:before="120"/>
+        <w:spacing w:after="60" w:line="240" w:lineRule="auto" w:before="160"/>
         <w:jc w:val="center"/>
       </w:pPr>
       <w:r>
         <w:drawing>
           <wp:inline xmlns:a="http://schemas.openxmlformats.org/drawingml/2006/main" xmlns:pic="http://schemas.openxmlformats.org/drawingml/2006/picture">
-            <wp:extent cx="3556000" cy="1955800"/>
+            <wp:extent cx="3302000" cy="1816100"/>
             <wp:docPr id="11" name="Picture 11" descr="column-en"/>
             <wp:cNvGraphicFramePr>
               <a:graphicFrameLocks noChangeAspect="1"/>
@@ -5970,7 +5970,7 @@
                   <pic:spPr>
                     <a:xfrm>
                       <a:off x="0" y="0"/>
-                      <a:ext cx="3556000" cy="1955800"/>
+                      <a:ext cx="3302000" cy="1816100"/>
                     </a:xfrm>
                     <a:prstGeom prst="rect"/>
                   </pic:spPr>
@@ -6431,13 +6431,13 @@
     </w:tbl>
     <w:p>
       <w:pPr>
-        <w:spacing w:after="60" w:line="240" w:lineRule="auto" w:before="120"/>
+        <w:spacing w:after="60" w:line="240" w:lineRule="auto" w:before="160"/>
         <w:jc w:val="center"/>
       </w:pPr>
       <w:r>
         <w:drawing>
           <wp:inline xmlns:a="http://schemas.openxmlformats.org/drawingml/2006/main" xmlns:pic="http://schemas.openxmlformats.org/drawingml/2006/picture">
-            <wp:extent cx="2921000" cy="1689253"/>
+            <wp:extent cx="2794000" cy="1615807"/>
             <wp:docPr id="12" name="Picture 12" descr="honeycomb-en"/>
             <wp:cNvGraphicFramePr>
               <a:graphicFrameLocks noChangeAspect="1"/>
@@ -6458,7 +6458,7 @@
                   <pic:spPr>
                     <a:xfrm>
                       <a:off x="0" y="0"/>
-                      <a:ext cx="2921000" cy="1689253"/>
+                      <a:ext cx="2794000" cy="1615807"/>
                     </a:xfrm>
                     <a:prstGeom prst="rect"/>
                   </pic:spPr>

</xml_diff>

<commit_message>
Separate answer figures from tables in all handout editions (#22)
</commit_message>
<xml_diff>
--- a/public/learn/AgentFEM-first-simulations-en.docx
+++ b/public/learn/AgentFEM-first-simulations-en.docx
@@ -5943,13 +5943,13 @@
     </w:tbl>
     <w:p>
       <w:pPr>
-        <w:spacing w:after="60" w:line="240" w:lineRule="auto" w:before="120"/>
+        <w:spacing w:after="60" w:line="240" w:lineRule="auto" w:before="160"/>
         <w:jc w:val="center"/>
       </w:pPr>
       <w:r>
         <w:drawing>
           <wp:inline xmlns:a="http://schemas.openxmlformats.org/drawingml/2006/main" xmlns:pic="http://schemas.openxmlformats.org/drawingml/2006/picture">
-            <wp:extent cx="3556000" cy="1955800"/>
+            <wp:extent cx="3302000" cy="1816100"/>
             <wp:docPr id="11" name="Picture 11" descr="column-en"/>
             <wp:cNvGraphicFramePr>
               <a:graphicFrameLocks noChangeAspect="1"/>
@@ -5970,7 +5970,7 @@
                   <pic:spPr>
                     <a:xfrm>
                       <a:off x="0" y="0"/>
-                      <a:ext cx="3556000" cy="1955800"/>
+                      <a:ext cx="3302000" cy="1816100"/>
                     </a:xfrm>
                     <a:prstGeom prst="rect"/>
                   </pic:spPr>
@@ -6431,13 +6431,13 @@
     </w:tbl>
     <w:p>
       <w:pPr>
-        <w:spacing w:after="60" w:line="240" w:lineRule="auto" w:before="120"/>
+        <w:spacing w:after="60" w:line="240" w:lineRule="auto" w:before="160"/>
         <w:jc w:val="center"/>
       </w:pPr>
       <w:r>
         <w:drawing>
           <wp:inline xmlns:a="http://schemas.openxmlformats.org/drawingml/2006/main" xmlns:pic="http://schemas.openxmlformats.org/drawingml/2006/picture">
-            <wp:extent cx="2921000" cy="1689253"/>
+            <wp:extent cx="2794000" cy="1615807"/>
             <wp:docPr id="12" name="Picture 12" descr="honeycomb-en"/>
             <wp:cNvGraphicFramePr>
               <a:graphicFrameLocks noChangeAspect="1"/>
@@ -6458,7 +6458,7 @@
                   <pic:spPr>
                     <a:xfrm>
                       <a:off x="0" y="0"/>
-                      <a:ext cx="2921000" cy="1689253"/>
+                      <a:ext cx="2794000" cy="1615807"/>
                     </a:xfrm>
                     <a:prstGeom prst="rect"/>
                   </pic:spPr>

</xml_diff>

<commit_message>
Use exercise numbers instead of page references in handout guide
</commit_message>
<xml_diff>
--- a/public/learn/AgentFEM-first-simulations-en.docx
+++ b/public/learn/AgentFEM-first-simulations-en.docx
@@ -269,7 +269,7 @@
                 <w:rFonts w:ascii="Times New Roman" w:hAnsi="Times New Roman" w:eastAsia="Times New Roman"/>
                 <w:sz w:val="18"/>
               </w:rPr>
-              <w:t>Page</w:t>
+              <w:t>No.</w:t>
             </w:r>
           </w:p>
         </w:tc>
@@ -354,7 +354,7 @@
                 <w:rFonts w:ascii="Times New Roman" w:hAnsi="Times New Roman" w:eastAsia="Times New Roman"/>
                 <w:sz w:val="18"/>
               </w:rPr>
-              <w:t>2</w:t>
+              <w:t>1</w:t>
             </w:r>
           </w:p>
         </w:tc>
@@ -437,7 +437,7 @@
                 <w:rFonts w:ascii="Times New Roman" w:hAnsi="Times New Roman" w:eastAsia="Times New Roman"/>
                 <w:sz w:val="18"/>
               </w:rPr>
-              <w:t>3</w:t>
+              <w:t>2</w:t>
             </w:r>
           </w:p>
         </w:tc>
@@ -520,7 +520,7 @@
                 <w:rFonts w:ascii="Times New Roman" w:hAnsi="Times New Roman" w:eastAsia="Times New Roman"/>
                 <w:sz w:val="18"/>
               </w:rPr>
-              <w:t>4</w:t>
+              <w:t>3</w:t>
             </w:r>
           </w:p>
         </w:tc>
@@ -603,7 +603,7 @@
                 <w:rFonts w:ascii="Times New Roman" w:hAnsi="Times New Roman" w:eastAsia="Times New Roman"/>
                 <w:sz w:val="18"/>
               </w:rPr>
-              <w:t>5</w:t>
+              <w:t>4</w:t>
             </w:r>
           </w:p>
         </w:tc>
@@ -686,7 +686,7 @@
                 <w:rFonts w:ascii="Times New Roman" w:hAnsi="Times New Roman" w:eastAsia="Times New Roman"/>
                 <w:sz w:val="18"/>
               </w:rPr>
-              <w:t>6</w:t>
+              <w:t>5</w:t>
             </w:r>
           </w:p>
         </w:tc>
@@ -769,7 +769,7 @@
                 <w:rFonts w:ascii="Times New Roman" w:hAnsi="Times New Roman" w:eastAsia="Times New Roman"/>
                 <w:sz w:val="18"/>
               </w:rPr>
-              <w:t>7</w:t>
+              <w:t>6</w:t>
             </w:r>
           </w:p>
         </w:tc>

</xml_diff>

<commit_message>
Use exercise numbers instead of page references in handout guide (#24)
</commit_message>
<xml_diff>
--- a/public/learn/AgentFEM-first-simulations-en.docx
+++ b/public/learn/AgentFEM-first-simulations-en.docx
@@ -269,7 +269,7 @@
                 <w:rFonts w:ascii="Times New Roman" w:hAnsi="Times New Roman" w:eastAsia="Times New Roman"/>
                 <w:sz w:val="18"/>
               </w:rPr>
-              <w:t>Page</w:t>
+              <w:t>No.</w:t>
             </w:r>
           </w:p>
         </w:tc>
@@ -354,7 +354,7 @@
                 <w:rFonts w:ascii="Times New Roman" w:hAnsi="Times New Roman" w:eastAsia="Times New Roman"/>
                 <w:sz w:val="18"/>
               </w:rPr>
-              <w:t>2</w:t>
+              <w:t>1</w:t>
             </w:r>
           </w:p>
         </w:tc>
@@ -437,7 +437,7 @@
                 <w:rFonts w:ascii="Times New Roman" w:hAnsi="Times New Roman" w:eastAsia="Times New Roman"/>
                 <w:sz w:val="18"/>
               </w:rPr>
-              <w:t>3</w:t>
+              <w:t>2</w:t>
             </w:r>
           </w:p>
         </w:tc>
@@ -520,7 +520,7 @@
                 <w:rFonts w:ascii="Times New Roman" w:hAnsi="Times New Roman" w:eastAsia="Times New Roman"/>
                 <w:sz w:val="18"/>
               </w:rPr>
-              <w:t>4</w:t>
+              <w:t>3</w:t>
             </w:r>
           </w:p>
         </w:tc>
@@ -603,7 +603,7 @@
                 <w:rFonts w:ascii="Times New Roman" w:hAnsi="Times New Roman" w:eastAsia="Times New Roman"/>
                 <w:sz w:val="18"/>
               </w:rPr>
-              <w:t>5</w:t>
+              <w:t>4</w:t>
             </w:r>
           </w:p>
         </w:tc>
@@ -686,7 +686,7 @@
                 <w:rFonts w:ascii="Times New Roman" w:hAnsi="Times New Roman" w:eastAsia="Times New Roman"/>
                 <w:sz w:val="18"/>
               </w:rPr>
-              <w:t>6</w:t>
+              <w:t>5</w:t>
             </w:r>
           </w:p>
         </w:tc>
@@ -769,7 +769,7 @@
                 <w:rFonts w:ascii="Times New Roman" w:hAnsi="Times New Roman" w:eastAsia="Times New Roman"/>
                 <w:sz w:val="18"/>
               </w:rPr>
-              <w:t>7</w:t>
+              <w:t>6</w:t>
             </w:r>
           </w:p>
         </w:tc>

</xml_diff>